<commit_message>
feat(juliaPDEs): add CoupledHeatEquation for multi-field linear systems
Generalizes the single-field HeatEquation/PoissonEquation pattern to two
linearly-coupled fields solved as one sparse block linear system per step
(backward Euler, reusing nd_laplacian + lu), instead of two independent
per-field solves. Verified against the existing HeatEquation.solve_implicit
at kappa=0 (exact match at matching theta).

Adds a matching "Generalizing to Coupled Multi-Field Systems" section to
both the docx guide (Step 8.6) and the website (polish.html 8.9), explaining
the why/benefit and connecting it to LidCavityFlow's psi/omega splitting.

Also fixes a pre-existing string-escaping bug in the docx generator's 6.5
example code (unescaped $(...) triggered eager interpolation and crashed
build_docx()).

Co-Authored-By: Claude Sonnet 5 <noreply@anthropic.com>
</commit_message>
<xml_diff>
--- a/output/julia_hpc_setup_guide.docx
+++ b/output/julia_hpc_setup_guide.docx
@@ -79,7 +79,34 @@
           <w:color w:val="888888"/>
           <w:sz w:val="20"/>
         </w:rPr>
-        <w:t>Generated: 2026-05-05</w:t>
+        <w:t>Generated: 2026-07-06</w:t>
+      </w:r>
+    </w:p>
+    <w:p>
+      <w:r>
+        <w:br w:type="page"/>
+      </w:r>
+    </w:p>
+    <w:p>
+      <w:pPr>
+        <w:jc w:val="center"/>
+      </w:pPr>
+      <w:r>
+        <w:rPr>
+          <w:rFonts w:ascii="Arial" w:hAnsi="Arial"/>
+          <w:b/>
+          <w:color w:val="1F4E79"/>
+          <w:sz w:val="44"/>
+        </w:rPr>
+        <w:t>Table of Contents</w:t>
+      </w:r>
+    </w:p>
+    <w:p>
+      <w:r>
+        <w:fldChar w:fldCharType="begin"/>
+        <w:instrText xml:space="preserve"> TOC \o "1-3" \h \z \u </w:instrText>
+        <w:fldChar w:fldCharType="separate"/>
+        <w:fldChar w:fldCharType="end"/>
       </w:r>
     </w:p>
     <w:p>
@@ -112,421 +139,6 @@
         <w:t>This guide walks you through setting up a complete Julia environment for scientific computing and HPC on Windows. Steps 1–3 install Julia. Step 4 introduces PDE packages. Step 4.5 builds the juliaPDEs package — the same one shipped in the juliaPDEs/ folder of this repo — so you have a real module with Revise live-reload and a test suite before tackling the worked examples. Step 5 walks the full PDE-solving workflow with worked examples for the heat, wave, Poisson, and Navier-Stokes equations and a section on unstructured meshing with Gmsh. Steps 6–8 connect to the HPC cluster.</w:t>
       </w:r>
     </w:p>
-    <w:p>
-      <w:pPr>
-        <w:pStyle w:val="Heading2"/>
-      </w:pPr>
-      <w:r>
-        <w:rPr>
-          <w:rFonts w:ascii="Arial" w:hAnsi="Arial"/>
-          <w:b/>
-          <w:color w:val="2E75B6"/>
-          <w:sz w:val="28"/>
-        </w:rPr>
-        <w:t>Time Estimate</w:t>
-      </w:r>
-    </w:p>
-    <w:tbl>
-      <w:tblPr>
-        <w:tblStyle w:val="LightGrid-Accent1"/>
-        <w:tblW w:type="auto" w:w="0"/>
-        <w:tblLook w:firstColumn="1" w:firstRow="1" w:lastColumn="0" w:lastRow="0" w:noHBand="0" w:noVBand="1" w:val="04A0"/>
-      </w:tblPr>
-      <w:tblGrid>
-        <w:gridCol w:w="4680"/>
-        <w:gridCol w:w="4680"/>
-      </w:tblGrid>
-      <w:tr>
-        <w:tc>
-          <w:tcPr>
-            <w:tcW w:type="dxa" w:w="4680"/>
-            <w:shd w:fill="1F4E79"/>
-          </w:tcPr>
-          <w:p>
-            <w:r/>
-            <w:r>
-              <w:rPr>
-                <w:rFonts w:ascii="Arial" w:hAnsi="Arial"/>
-                <w:b/>
-                <w:color w:val="FFFFFF"/>
-                <w:sz w:val="20"/>
-              </w:rPr>
-              <w:t>Step</w:t>
-            </w:r>
-          </w:p>
-        </w:tc>
-        <w:tc>
-          <w:tcPr>
-            <w:tcW w:type="dxa" w:w="4680"/>
-            <w:shd w:fill="1F4E79"/>
-          </w:tcPr>
-          <w:p>
-            <w:r/>
-            <w:r>
-              <w:rPr>
-                <w:rFonts w:ascii="Arial" w:hAnsi="Arial"/>
-                <w:b/>
-                <w:color w:val="FFFFFF"/>
-                <w:sz w:val="20"/>
-              </w:rPr>
-              <w:t>Estimated Time</w:t>
-            </w:r>
-          </w:p>
-        </w:tc>
-      </w:tr>
-      <w:tr>
-        <w:tc>
-          <w:tcPr>
-            <w:tcW w:type="dxa" w:w="4680"/>
-          </w:tcPr>
-          <w:p>
-            <w:r/>
-            <w:r>
-              <w:rPr>
-                <w:rFonts w:ascii="Arial" w:hAnsi="Arial"/>
-                <w:sz w:val="20"/>
-              </w:rPr>
-              <w:t>1 — Install WSL2</w:t>
-            </w:r>
-          </w:p>
-        </w:tc>
-        <w:tc>
-          <w:tcPr>
-            <w:tcW w:type="dxa" w:w="4680"/>
-          </w:tcPr>
-          <w:p>
-            <w:r/>
-            <w:r>
-              <w:rPr>
-                <w:rFonts w:ascii="Arial" w:hAnsi="Arial"/>
-                <w:sz w:val="20"/>
-              </w:rPr>
-              <w:t>10–15 min</w:t>
-            </w:r>
-          </w:p>
-        </w:tc>
-      </w:tr>
-      <w:tr>
-        <w:tc>
-          <w:tcPr>
-            <w:tcW w:type="dxa" w:w="4680"/>
-          </w:tcPr>
-          <w:p>
-            <w:r/>
-            <w:r>
-              <w:rPr>
-                <w:rFonts w:ascii="Arial" w:hAnsi="Arial"/>
-                <w:sz w:val="20"/>
-              </w:rPr>
-              <w:t>2 — juliaup + Julia</w:t>
-            </w:r>
-          </w:p>
-        </w:tc>
-        <w:tc>
-          <w:tcPr>
-            <w:tcW w:type="dxa" w:w="4680"/>
-          </w:tcPr>
-          <w:p>
-            <w:r/>
-            <w:r>
-              <w:rPr>
-                <w:rFonts w:ascii="Arial" w:hAnsi="Arial"/>
-                <w:sz w:val="20"/>
-              </w:rPr>
-              <w:t>5–10 min</w:t>
-            </w:r>
-          </w:p>
-        </w:tc>
-      </w:tr>
-      <w:tr>
-        <w:tc>
-          <w:tcPr>
-            <w:tcW w:type="dxa" w:w="4680"/>
-          </w:tcPr>
-          <w:p>
-            <w:r/>
-            <w:r>
-              <w:rPr>
-                <w:rFonts w:ascii="Arial" w:hAnsi="Arial"/>
-                <w:sz w:val="20"/>
-              </w:rPr>
-              <w:t>3 — Install Julia Packages</w:t>
-            </w:r>
-          </w:p>
-        </w:tc>
-        <w:tc>
-          <w:tcPr>
-            <w:tcW w:type="dxa" w:w="4680"/>
-          </w:tcPr>
-          <w:p>
-            <w:r/>
-            <w:r>
-              <w:rPr>
-                <w:rFonts w:ascii="Arial" w:hAnsi="Arial"/>
-                <w:sz w:val="20"/>
-              </w:rPr>
-              <w:t>10–15 min</w:t>
-            </w:r>
-          </w:p>
-        </w:tc>
-      </w:tr>
-      <w:tr>
-        <w:tc>
-          <w:tcPr>
-            <w:tcW w:type="dxa" w:w="4680"/>
-          </w:tcPr>
-          <w:p>
-            <w:r/>
-            <w:r>
-              <w:rPr>
-                <w:rFonts w:ascii="Arial" w:hAnsi="Arial"/>
-                <w:sz w:val="20"/>
-              </w:rPr>
-              <w:t>4 — Learn PDE Packages</w:t>
-            </w:r>
-          </w:p>
-        </w:tc>
-        <w:tc>
-          <w:tcPr>
-            <w:tcW w:type="dxa" w:w="4680"/>
-          </w:tcPr>
-          <w:p>
-            <w:r/>
-            <w:r>
-              <w:rPr>
-                <w:rFonts w:ascii="Arial" w:hAnsi="Arial"/>
-                <w:sz w:val="20"/>
-              </w:rPr>
-              <w:t>15–20 min</w:t>
-            </w:r>
-          </w:p>
-        </w:tc>
-      </w:tr>
-      <w:tr>
-        <w:tc>
-          <w:tcPr>
-            <w:tcW w:type="dxa" w:w="4680"/>
-          </w:tcPr>
-          <w:p>
-            <w:r/>
-            <w:r>
-              <w:rPr>
-                <w:rFonts w:ascii="Arial" w:hAnsi="Arial"/>
-                <w:sz w:val="20"/>
-              </w:rPr>
-              <w:t>4.5 — Build juliaPDEs Package</w:t>
-            </w:r>
-          </w:p>
-        </w:tc>
-        <w:tc>
-          <w:tcPr>
-            <w:tcW w:type="dxa" w:w="4680"/>
-          </w:tcPr>
-          <w:p>
-            <w:r/>
-            <w:r>
-              <w:rPr>
-                <w:rFonts w:ascii="Arial" w:hAnsi="Arial"/>
-                <w:sz w:val="20"/>
-              </w:rPr>
-              <w:t>20–30 min</w:t>
-            </w:r>
-          </w:p>
-        </w:tc>
-      </w:tr>
-      <w:tr>
-        <w:tc>
-          <w:tcPr>
-            <w:tcW w:type="dxa" w:w="4680"/>
-          </w:tcPr>
-          <w:p>
-            <w:r/>
-            <w:r>
-              <w:rPr>
-                <w:rFonts w:ascii="Arial" w:hAnsi="Arial"/>
-                <w:sz w:val="20"/>
-              </w:rPr>
-              <w:t>5 — PDE Workflow + Examples</w:t>
-            </w:r>
-          </w:p>
-        </w:tc>
-        <w:tc>
-          <w:tcPr>
-            <w:tcW w:type="dxa" w:w="4680"/>
-          </w:tcPr>
-          <w:p>
-            <w:r/>
-            <w:r>
-              <w:rPr>
-                <w:rFonts w:ascii="Arial" w:hAnsi="Arial"/>
-                <w:sz w:val="20"/>
-              </w:rPr>
-              <w:t>30–60 min</w:t>
-            </w:r>
-          </w:p>
-        </w:tc>
-      </w:tr>
-      <w:tr>
-        <w:tc>
-          <w:tcPr>
-            <w:tcW w:type="dxa" w:w="4680"/>
-          </w:tcPr>
-          <w:p>
-            <w:r/>
-            <w:r>
-              <w:rPr>
-                <w:rFonts w:ascii="Arial" w:hAnsi="Arial"/>
-                <w:sz w:val="20"/>
-              </w:rPr>
-              <w:t>5.6 — Gmsh: mesh → matrix</w:t>
-            </w:r>
-          </w:p>
-        </w:tc>
-        <w:tc>
-          <w:tcPr>
-            <w:tcW w:type="dxa" w:w="4680"/>
-          </w:tcPr>
-          <w:p>
-            <w:r/>
-            <w:r>
-              <w:rPr>
-                <w:rFonts w:ascii="Arial" w:hAnsi="Arial"/>
-                <w:sz w:val="20"/>
-              </w:rPr>
-              <w:t>15–20 min</w:t>
-            </w:r>
-          </w:p>
-        </w:tc>
-      </w:tr>
-      <w:tr>
-        <w:tc>
-          <w:tcPr>
-            <w:tcW w:type="dxa" w:w="4680"/>
-          </w:tcPr>
-          <w:p>
-            <w:r/>
-            <w:r>
-              <w:rPr>
-                <w:rFonts w:ascii="Arial" w:hAnsi="Arial"/>
-                <w:sz w:val="20"/>
-              </w:rPr>
-              <w:t>6 — Configure VS Code</w:t>
-            </w:r>
-          </w:p>
-        </w:tc>
-        <w:tc>
-          <w:tcPr>
-            <w:tcW w:type="dxa" w:w="4680"/>
-          </w:tcPr>
-          <w:p>
-            <w:r/>
-            <w:r>
-              <w:rPr>
-                <w:rFonts w:ascii="Arial" w:hAnsi="Arial"/>
-                <w:sz w:val="20"/>
-              </w:rPr>
-              <w:t>5–10 min</w:t>
-            </w:r>
-          </w:p>
-        </w:tc>
-      </w:tr>
-      <w:tr>
-        <w:tc>
-          <w:tcPr>
-            <w:tcW w:type="dxa" w:w="4680"/>
-          </w:tcPr>
-          <w:p>
-            <w:r/>
-            <w:r>
-              <w:rPr>
-                <w:rFonts w:ascii="Arial" w:hAnsi="Arial"/>
-                <w:sz w:val="20"/>
-              </w:rPr>
-              <w:t>7 — HPC SSH Setup</w:t>
-            </w:r>
-          </w:p>
-        </w:tc>
-        <w:tc>
-          <w:tcPr>
-            <w:tcW w:type="dxa" w:w="4680"/>
-          </w:tcPr>
-          <w:p>
-            <w:r/>
-            <w:r>
-              <w:rPr>
-                <w:rFonts w:ascii="Arial" w:hAnsi="Arial"/>
-                <w:sz w:val="20"/>
-              </w:rPr>
-              <w:t>10 min</w:t>
-            </w:r>
-          </w:p>
-        </w:tc>
-      </w:tr>
-      <w:tr>
-        <w:tc>
-          <w:tcPr>
-            <w:tcW w:type="dxa" w:w="4680"/>
-          </w:tcPr>
-          <w:p>
-            <w:r/>
-            <w:r>
-              <w:rPr>
-                <w:rFonts w:ascii="Arial" w:hAnsi="Arial"/>
-                <w:sz w:val="20"/>
-              </w:rPr>
-              <w:t>8 — Submit Slurm Jobs</w:t>
-            </w:r>
-          </w:p>
-        </w:tc>
-        <w:tc>
-          <w:tcPr>
-            <w:tcW w:type="dxa" w:w="4680"/>
-          </w:tcPr>
-          <w:p>
-            <w:r/>
-            <w:r>
-              <w:rPr>
-                <w:rFonts w:ascii="Arial" w:hAnsi="Arial"/>
-                <w:sz w:val="20"/>
-              </w:rPr>
-              <w:t>10–15 min</w:t>
-            </w:r>
-          </w:p>
-        </w:tc>
-      </w:tr>
-      <w:tr>
-        <w:tc>
-          <w:tcPr>
-            <w:tcW w:type="dxa" w:w="4680"/>
-          </w:tcPr>
-          <w:p>
-            <w:r/>
-            <w:r>
-              <w:rPr>
-                <w:rFonts w:ascii="Arial" w:hAnsi="Arial"/>
-                <w:sz w:val="20"/>
-              </w:rPr>
-              <w:t>Total</w:t>
-            </w:r>
-          </w:p>
-        </w:tc>
-        <w:tc>
-          <w:tcPr>
-            <w:tcW w:type="dxa" w:w="4680"/>
-          </w:tcPr>
-          <w:p>
-            <w:r/>
-            <w:r>
-              <w:rPr>
-                <w:rFonts w:ascii="Arial" w:hAnsi="Arial"/>
-                <w:sz w:val="20"/>
-              </w:rPr>
-              <w:t>~130–205 min</w:t>
-            </w:r>
-          </w:p>
-        </w:tc>
-      </w:tr>
-    </w:tbl>
     <w:p>
       <w:r>
         <w:br w:type="page"/>
@@ -991,7 +603,7 @@
           <w:color w:val="1F4E79"/>
           <w:sz w:val="36"/>
         </w:rPr>
-        <w:t>Step 3 — Installing Julia Packages</w:t>
+        <w:t>Step 3 — Configure VS Code for Julia + WSL</w:t>
       </w:r>
     </w:p>
     <w:p>
@@ -1002,6 +614,213 @@
           <w:i w:val="0"/>
           <w:sz w:val="22"/>
         </w:rPr>
+        <w:t>Install these VS Code extensions:</w:t>
+      </w:r>
+    </w:p>
+    <w:tbl>
+      <w:tblPr>
+        <w:tblStyle w:val="LightGrid-Accent1"/>
+        <w:tblW w:type="auto" w:w="0"/>
+        <w:tblLook w:firstColumn="1" w:firstRow="1" w:lastColumn="0" w:lastRow="0" w:noHBand="0" w:noVBand="1" w:val="04A0"/>
+      </w:tblPr>
+      <w:tblGrid>
+        <w:gridCol w:w="4680"/>
+        <w:gridCol w:w="4680"/>
+      </w:tblGrid>
+      <w:tr>
+        <w:tc>
+          <w:tcPr>
+            <w:tcW w:type="dxa" w:w="4680"/>
+            <w:shd w:fill="1F4E79"/>
+          </w:tcPr>
+          <w:p>
+            <w:r/>
+            <w:r>
+              <w:rPr>
+                <w:rFonts w:ascii="Arial" w:hAnsi="Arial"/>
+                <w:b/>
+                <w:color w:val="FFFFFF"/>
+                <w:sz w:val="20"/>
+              </w:rPr>
+              <w:t>Extension</w:t>
+            </w:r>
+          </w:p>
+        </w:tc>
+        <w:tc>
+          <w:tcPr>
+            <w:tcW w:type="dxa" w:w="4680"/>
+            <w:shd w:fill="1F4E79"/>
+          </w:tcPr>
+          <w:p>
+            <w:r/>
+            <w:r>
+              <w:rPr>
+                <w:rFonts w:ascii="Arial" w:hAnsi="Arial"/>
+                <w:b/>
+                <w:color w:val="FFFFFF"/>
+                <w:sz w:val="20"/>
+              </w:rPr>
+              <w:t>Purpose</w:t>
+            </w:r>
+          </w:p>
+        </w:tc>
+      </w:tr>
+      <w:tr>
+        <w:tc>
+          <w:tcPr>
+            <w:tcW w:type="dxa" w:w="4680"/>
+          </w:tcPr>
+          <w:p>
+            <w:r/>
+            <w:r>
+              <w:rPr>
+                <w:rFonts w:ascii="Arial" w:hAnsi="Arial"/>
+                <w:sz w:val="20"/>
+              </w:rPr>
+              <w:t>WSL</w:t>
+            </w:r>
+          </w:p>
+        </w:tc>
+        <w:tc>
+          <w:tcPr>
+            <w:tcW w:type="dxa" w:w="4680"/>
+          </w:tcPr>
+          <w:p>
+            <w:r/>
+            <w:r>
+              <w:rPr>
+                <w:rFonts w:ascii="Arial" w:hAnsi="Arial"/>
+                <w:sz w:val="20"/>
+              </w:rPr>
+              <w:t>Connect VS Code to WSL</w:t>
+            </w:r>
+          </w:p>
+        </w:tc>
+      </w:tr>
+      <w:tr>
+        <w:tc>
+          <w:tcPr>
+            <w:tcW w:type="dxa" w:w="4680"/>
+          </w:tcPr>
+          <w:p>
+            <w:r/>
+            <w:r>
+              <w:rPr>
+                <w:rFonts w:ascii="Arial" w:hAnsi="Arial"/>
+                <w:sz w:val="20"/>
+              </w:rPr>
+              <w:t>Julia</w:t>
+            </w:r>
+          </w:p>
+        </w:tc>
+        <w:tc>
+          <w:tcPr>
+            <w:tcW w:type="dxa" w:w="4680"/>
+          </w:tcPr>
+          <w:p>
+            <w:r/>
+            <w:r>
+              <w:rPr>
+                <w:rFonts w:ascii="Arial" w:hAnsi="Arial"/>
+                <w:sz w:val="20"/>
+              </w:rPr>
+              <w:t>Syntax, IntelliSense, REPL</w:t>
+            </w:r>
+          </w:p>
+        </w:tc>
+      </w:tr>
+      <w:tr>
+        <w:tc>
+          <w:tcPr>
+            <w:tcW w:type="dxa" w:w="4680"/>
+          </w:tcPr>
+          <w:p>
+            <w:r/>
+            <w:r>
+              <w:rPr>
+                <w:rFonts w:ascii="Arial" w:hAnsi="Arial"/>
+                <w:sz w:val="20"/>
+              </w:rPr>
+              <w:t>Jupyter</w:t>
+            </w:r>
+          </w:p>
+        </w:tc>
+        <w:tc>
+          <w:tcPr>
+            <w:tcW w:type="dxa" w:w="4680"/>
+          </w:tcPr>
+          <w:p>
+            <w:r/>
+            <w:r>
+              <w:rPr>
+                <w:rFonts w:ascii="Arial" w:hAnsi="Arial"/>
+                <w:sz w:val="20"/>
+              </w:rPr>
+              <w:t>Run notebooks with Julia kernel</w:t>
+            </w:r>
+          </w:p>
+        </w:tc>
+      </w:tr>
+      <w:tr>
+        <w:tc>
+          <w:tcPr>
+            <w:tcW w:type="dxa" w:w="4680"/>
+          </w:tcPr>
+          <w:p>
+            <w:r/>
+            <w:r>
+              <w:rPr>
+                <w:rFonts w:ascii="Arial" w:hAnsi="Arial"/>
+                <w:sz w:val="20"/>
+              </w:rPr>
+              <w:t>Remote — SSH</w:t>
+            </w:r>
+          </w:p>
+        </w:tc>
+        <w:tc>
+          <w:tcPr>
+            <w:tcW w:type="dxa" w:w="4680"/>
+          </w:tcPr>
+          <w:p>
+            <w:r/>
+            <w:r>
+              <w:rPr>
+                <w:rFonts w:ascii="Arial" w:hAnsi="Arial"/>
+                <w:sz w:val="20"/>
+              </w:rPr>
+              <w:t>Connect to HPC cluster</w:t>
+            </w:r>
+          </w:p>
+        </w:tc>
+      </w:tr>
+    </w:tbl>
+    <w:p>
+      <w:r>
+        <w:br w:type="page"/>
+      </w:r>
+    </w:p>
+    <w:p>
+      <w:pPr>
+        <w:pStyle w:val="Heading1"/>
+      </w:pPr>
+      <w:r>
+        <w:rPr>
+          <w:rFonts w:ascii="Arial" w:hAnsi="Arial"/>
+          <w:b/>
+          <w:color w:val="1F4E79"/>
+          <w:sz w:val="36"/>
+        </w:rPr>
+        <w:t>Step 4 — Installing Julia Packages</w:t>
+      </w:r>
+    </w:p>
+    <w:p>
+      <w:r>
+        <w:rPr>
+          <w:rFonts w:ascii="Arial" w:hAnsi="Arial"/>
+          <w:b w:val="0"/>
+          <w:i w:val="0"/>
+          <w:sz w:val="22"/>
+        </w:rPr>
         <w:t>Julia's package manager (Pkg) is built into the language. Press ] in the REPL to enter package mode.</w:t>
       </w:r>
     </w:p>
@@ -1102,7 +921,7 @@
           <w:color w:val="1F4E79"/>
           <w:sz w:val="36"/>
         </w:rPr>
-        <w:t>Step 4 — Key Julia Packages for PDE Solving</w:t>
+        <w:t>Step 5 — Key Julia Packages for PDE Solving</w:t>
       </w:r>
     </w:p>
     <w:tbl>
@@ -1522,7 +1341,7 @@
           <w:color w:val="1F4E79"/>
           <w:sz w:val="36"/>
         </w:rPr>
-        <w:t>Step 4.5 — Build the juliaPDEs Package</w:t>
+        <w:t>Step 6 — Build the juliaPDEs Package (was Step 4.5)</w:t>
       </w:r>
     </w:p>
     <w:p>
@@ -2145,6 +1964,372 @@
     </w:p>
     <w:p>
       <w:pPr>
+        <w:pStyle w:val="Heading3"/>
+      </w:pPr>
+      <w:r>
+        <w:rPr>
+          <w:rFonts w:ascii="Arial" w:hAnsi="Arial"/>
+          <w:b/>
+          <w:color w:val="444444"/>
+          <w:sz w:val="24"/>
+        </w:rPr>
+        <w:t>Beginner Concept Check: Structs, Instances, and Functions</w:t>
+      </w:r>
+    </w:p>
+    <w:p>
+      <w:r>
+        <w:rPr>
+          <w:rFonts w:ascii="Arial" w:hAnsi="Arial"/>
+          <w:b w:val="0"/>
+          <w:i w:val="0"/>
+          <w:sz w:val="22"/>
+        </w:rPr>
+        <w:t>Notice how the Heat solver above uses plain keyword arguments. As simulations grow more complex, passing individual variables becomes unmanageable. Before moving to the Wave solver, let's clarify how custom data types solve this:</w:t>
+      </w:r>
+    </w:p>
+    <w:p>
+      <w:r>
+        <w:rPr>
+          <w:rFonts w:ascii="Arial" w:hAnsi="Arial"/>
+          <w:b w:val="0"/>
+          <w:i w:val="0"/>
+          <w:sz w:val="22"/>
+        </w:rPr>
+        <w:t>1. What is a Struct? A struct is a custom composite data type that bundles multiple pieces of related data (called fields) together under a single name. Instead of passing separate variables into every function, we pack them into one structured container blueprint.</w:t>
+      </w:r>
+    </w:p>
+    <w:p>
+      <w:r>
+        <w:rPr>
+          <w:rFonts w:ascii="Arial" w:hAnsi="Arial"/>
+          <w:b w:val="0"/>
+          <w:i w:val="0"/>
+          <w:sz w:val="22"/>
+        </w:rPr>
+        <w:t>2. How to create a Struct? We write the struct keyword followed by the container name, list its internal fields with their types, and end with end. Using the Base.@kwdef macro above it automatically writes a keyword constructor with convenient default values:</w:t>
+      </w:r>
+    </w:p>
+    <w:p>
+      <w:pPr>
+        <w:ind w:left="360"/>
+        <w:shd w:fill="F0F0F0"/>
+      </w:pPr>
+      <w:r>
+        <w:rPr>
+          <w:rFonts w:ascii="Courier New" w:hAnsi="Courier New"/>
+          <w:color w:val="1A1A1A"/>
+          <w:sz w:val="19"/>
+        </w:rPr>
+        <w:t>Base.@kwdef struct SimpleHeatConfig</w:t>
+      </w:r>
+    </w:p>
+    <w:p>
+      <w:pPr>
+        <w:ind w:left="360"/>
+        <w:shd w:fill="F0F0F0"/>
+      </w:pPr>
+      <w:r>
+        <w:rPr>
+          <w:rFonts w:ascii="Courier New" w:hAnsi="Courier New"/>
+          <w:color w:val="1A1A1A"/>
+          <w:sz w:val="19"/>
+        </w:rPr>
+        <w:t xml:space="preserve">    L::Float64 = 1.0       # Domain length</w:t>
+      </w:r>
+    </w:p>
+    <w:p>
+      <w:pPr>
+        <w:ind w:left="360"/>
+        <w:shd w:fill="F0F0F0"/>
+      </w:pPr>
+      <w:r>
+        <w:rPr>
+          <w:rFonts w:ascii="Courier New" w:hAnsi="Courier New"/>
+          <w:color w:val="1A1A1A"/>
+          <w:sz w:val="19"/>
+        </w:rPr>
+        <w:t xml:space="preserve">    α::Float64 = 0.01      # Thermal diffusivity</w:t>
+      </w:r>
+    </w:p>
+    <w:p>
+      <w:pPr>
+        <w:ind w:left="360"/>
+        <w:shd w:fill="F0F0F0"/>
+      </w:pPr>
+      <w:r>
+        <w:rPr>
+          <w:rFonts w:ascii="Courier New" w:hAnsi="Courier New"/>
+          <w:color w:val="1A1A1A"/>
+          <w:sz w:val="19"/>
+        </w:rPr>
+        <w:t xml:space="preserve">    N::Int     = 100       # Grid resolution</w:t>
+      </w:r>
+    </w:p>
+    <w:p>
+      <w:pPr>
+        <w:ind w:left="360"/>
+        <w:shd w:fill="F0F0F0"/>
+      </w:pPr>
+      <w:r>
+        <w:rPr>
+          <w:rFonts w:ascii="Courier New" w:hAnsi="Courier New"/>
+          <w:color w:val="1A1A1A"/>
+          <w:sz w:val="19"/>
+        </w:rPr>
+        <w:t>end</w:t>
+      </w:r>
+    </w:p>
+    <w:p>
+      <w:r>
+        <w:rPr>
+          <w:rFonts w:ascii="Arial" w:hAnsi="Arial"/>
+          <w:b w:val="0"/>
+          <w:i w:val="0"/>
+          <w:sz w:val="22"/>
+        </w:rPr>
+        <w:t>3. What is the variable that is the Struct (an Instance)? The code above is just a blueprint. To use it, we call the struct's name like a function to create a concrete object in computer memory, called an instance, and assign it to a variable. We can then read its internal fields using dot notation:</w:t>
+      </w:r>
+    </w:p>
+    <w:p>
+      <w:pPr>
+        <w:ind w:left="360"/>
+        <w:shd w:fill="F0F0F0"/>
+      </w:pPr>
+      <w:r>
+        <w:rPr>
+          <w:rFonts w:ascii="Courier New" w:hAnsi="Courier New"/>
+          <w:color w:val="1A1A1A"/>
+          <w:sz w:val="19"/>
+        </w:rPr>
+        <w:t># Create an instance; omitted fields automatically use defaults</w:t>
+      </w:r>
+    </w:p>
+    <w:p>
+      <w:pPr>
+        <w:ind w:left="360"/>
+        <w:shd w:fill="F0F0F0"/>
+      </w:pPr>
+      <w:r>
+        <w:rPr>
+          <w:rFonts w:ascii="Courier New" w:hAnsi="Courier New"/>
+          <w:color w:val="1A1A1A"/>
+          <w:sz w:val="19"/>
+        </w:rPr>
+        <w:t>my_config = SimpleHeatConfig(α=0.05, N=200)</w:t>
+      </w:r>
+    </w:p>
+    <w:p>
+      <w:pPr>
+        <w:ind w:left="360"/>
+        <w:shd w:fill="F0F0F0"/>
+      </w:pPr>
+      <w:r>
+        <w:rPr>
+          <w:rFonts w:ascii="Courier New" w:hAnsi="Courier New"/>
+          <w:color w:val="1A1A1A"/>
+          <w:sz w:val="19"/>
+        </w:rPr>
+      </w:r>
+    </w:p>
+    <w:p>
+      <w:pPr>
+        <w:ind w:left="360"/>
+        <w:shd w:fill="F0F0F0"/>
+      </w:pPr>
+      <w:r>
+        <w:rPr>
+          <w:rFonts w:ascii="Courier New" w:hAnsi="Courier New"/>
+          <w:color w:val="1A1A1A"/>
+          <w:sz w:val="19"/>
+        </w:rPr>
+        <w:t># Access individual bundled fields using a dot (.):</w:t>
+      </w:r>
+    </w:p>
+    <w:p>
+      <w:pPr>
+        <w:ind w:left="360"/>
+        <w:shd w:fill="F0F0F0"/>
+      </w:pPr>
+      <w:r>
+        <w:rPr>
+          <w:rFonts w:ascii="Courier New" w:hAnsi="Courier New"/>
+          <w:color w:val="1A1A1A"/>
+          <w:sz w:val="19"/>
+        </w:rPr>
+        <w:t>println("Configured diffusivity: ", my_config.α)</w:t>
+      </w:r>
+    </w:p>
+    <w:p>
+      <w:pPr>
+        <w:ind w:left="360"/>
+        <w:shd w:fill="F0F0F0"/>
+      </w:pPr>
+      <w:r>
+        <w:rPr>
+          <w:rFonts w:ascii="Courier New" w:hAnsi="Courier New"/>
+          <w:color w:val="1A1A1A"/>
+          <w:sz w:val="19"/>
+        </w:rPr>
+        <w:t>println("Configured grid points: ", my_config.N)</w:t>
+      </w:r>
+    </w:p>
+    <w:p>
+      <w:r>
+        <w:rPr>
+          <w:rFonts w:ascii="Arial" w:hAnsi="Arial"/>
+          <w:b w:val="0"/>
+          <w:i w:val="0"/>
+          <w:sz w:val="22"/>
+        </w:rPr>
+        <w:t>4. How to create a Function to receive the Struct? To write a function that operates on our configuration, we define a function that accepts a single argument annotated with our custom struct type. Inside the function body, we use dot notation to unpack the exact fields we need:</w:t>
+      </w:r>
+    </w:p>
+    <w:p>
+      <w:pPr>
+        <w:ind w:left="360"/>
+        <w:shd w:fill="F0F0F0"/>
+      </w:pPr>
+      <w:r>
+        <w:rPr>
+          <w:rFonts w:ascii="Courier New" w:hAnsi="Courier New"/>
+          <w:color w:val="1A1A1A"/>
+          <w:sz w:val="19"/>
+        </w:rPr>
+        <w:t>function print_stability_limit(config::SimpleHeatConfig)</w:t>
+      </w:r>
+    </w:p>
+    <w:p>
+      <w:pPr>
+        <w:ind w:left="360"/>
+        <w:shd w:fill="F0F0F0"/>
+      </w:pPr>
+      <w:r>
+        <w:rPr>
+          <w:rFonts w:ascii="Courier New" w:hAnsi="Courier New"/>
+          <w:color w:val="1A1A1A"/>
+          <w:sz w:val="19"/>
+        </w:rPr>
+        <w:t xml:space="preserve">    dx = config.L / (config.N + 1)</w:t>
+      </w:r>
+    </w:p>
+    <w:p>
+      <w:pPr>
+        <w:ind w:left="360"/>
+        <w:shd w:fill="F0F0F0"/>
+      </w:pPr>
+      <w:r>
+        <w:rPr>
+          <w:rFonts w:ascii="Courier New" w:hAnsi="Courier New"/>
+          <w:color w:val="1A1A1A"/>
+          <w:sz w:val="19"/>
+        </w:rPr>
+        <w:t xml:space="preserve">    max_dt = 0.5 * dx^2 / config.α</w:t>
+      </w:r>
+    </w:p>
+    <w:p>
+      <w:pPr>
+        <w:ind w:left="360"/>
+        <w:shd w:fill="F0F0F0"/>
+      </w:pPr>
+      <w:r>
+        <w:rPr>
+          <w:rFonts w:ascii="Courier New" w:hAnsi="Courier New"/>
+          <w:color w:val="1A1A1A"/>
+          <w:sz w:val="19"/>
+        </w:rPr>
+        <w:t xml:space="preserve">    println("Maximum stable time step dt: ", max_dt)</w:t>
+      </w:r>
+    </w:p>
+    <w:p>
+      <w:pPr>
+        <w:ind w:left="360"/>
+        <w:shd w:fill="F0F0F0"/>
+      </w:pPr>
+      <w:r>
+        <w:rPr>
+          <w:rFonts w:ascii="Courier New" w:hAnsi="Courier New"/>
+          <w:color w:val="1A1A1A"/>
+          <w:sz w:val="19"/>
+        </w:rPr>
+        <w:t>end</w:t>
+      </w:r>
+    </w:p>
+    <w:p>
+      <w:pPr>
+        <w:ind w:left="360"/>
+        <w:shd w:fill="F0F0F0"/>
+      </w:pPr>
+      <w:r>
+        <w:rPr>
+          <w:rFonts w:ascii="Courier New" w:hAnsi="Courier New"/>
+          <w:color w:val="1A1A1A"/>
+          <w:sz w:val="19"/>
+        </w:rPr>
+      </w:r>
+    </w:p>
+    <w:p>
+      <w:pPr>
+        <w:ind w:left="360"/>
+        <w:shd w:fill="F0F0F0"/>
+      </w:pPr>
+      <w:r>
+        <w:rPr>
+          <w:rFonts w:ascii="Courier New" w:hAnsi="Courier New"/>
+          <w:color w:val="1A1A1A"/>
+          <w:sz w:val="19"/>
+        </w:rPr>
+        <w:t># Pass our struct variable into the function</w:t>
+      </w:r>
+    </w:p>
+    <w:p>
+      <w:pPr>
+        <w:ind w:left="360"/>
+        <w:shd w:fill="F0F0F0"/>
+      </w:pPr>
+      <w:r>
+        <w:rPr>
+          <w:rFonts w:ascii="Courier New" w:hAnsi="Courier New"/>
+          <w:color w:val="1A1A1A"/>
+          <w:sz w:val="19"/>
+        </w:rPr>
+        <w:t>print_stability_limit(my_config)</w:t>
+      </w:r>
+    </w:p>
+    <w:p>
+      <w:r>
+        <w:rPr>
+          <w:rFonts w:ascii="Arial" w:hAnsi="Arial"/>
+          <w:b w:val="0"/>
+          <w:i w:val="0"/>
+          <w:sz w:val="22"/>
+        </w:rPr>
+        <w:t>5. Structs vs. Functions: Nouns vs. Verbs. A struct holds passive state and data (e.g., domain dimensions, arrays, physical constants). A function defines active behavior and logic (e.g., loops, time-stepping, mathematical updates). Structs are the materials; functions are the machines that transform them.</w:t>
+      </w:r>
+    </w:p>
+    <w:p>
+      <w:r>
+        <w:rPr>
+          <w:rFonts w:ascii="Arial" w:hAnsi="Arial"/>
+          <w:b w:val="0"/>
+          <w:i w:val="0"/>
+          <w:sz w:val="22"/>
+        </w:rPr>
+        <w:t>6. Global Scope vs. Local Scope (Crucial for Performance). Variables defined directly in the main script body live in the global scope. Because global variables can change their data type at any time, the Julia compiler cannot optimize them, making loops in global scope very slow. Variables defined inside a function body live in a local scope. The compiler knows their exact types, compiling local operations to extremely fast machine code. Best Practice: Always wrap your solver loops and computations inside functions!</w:t>
+      </w:r>
+    </w:p>
+    <w:p>
+      <w:r>
+        <w:rPr>
+          <w:rFonts w:ascii="Arial" w:hAnsi="Arial"/>
+          <w:b w:val="0"/>
+          <w:i w:val="0"/>
+          <w:sz w:val="22"/>
+        </w:rPr>
+        <w:t>7. Where do you run these scripts? Once you write your code in a file (e.g., solver.jl), you can run it in three ways: (a) Terminal execution: run 'julia solver.jl' directly from your Linux command line. (b) REPL inclusion: open the Julia REPL and type 'include("solver.jl")' to load and execute the file. (c) VS Code execution: open the file in VS Code and press Shift+Enter to run specific blocks interactively.</w:t>
+      </w:r>
+    </w:p>
+    <w:p>
+      <w:pPr>
         <w:pStyle w:val="Heading2"/>
       </w:pPr>
       <w:r>
@@ -3684,7 +3869,7 @@
           <w:color w:val="1F4E79"/>
           <w:sz w:val="36"/>
         </w:rPr>
-        <w:t>Step 5 — The PDE Solving Workflow</w:t>
+        <w:t>Step 7 — The PDE Solving Workflow (was Step 5)</w:t>
       </w:r>
     </w:p>
     <w:p>
@@ -6311,7 +6496,7 @@
           <w:color w:val="1F4E79"/>
           <w:sz w:val="36"/>
         </w:rPr>
-        <w:t>Step 6 — Configure VS Code for Julia + WSL</w:t>
+        <w:t>Step 8 — Package Design Patterns: Structs, Dispatch &amp; Plots (was Step 6)</w:t>
       </w:r>
     </w:p>
     <w:p>
@@ -6322,7 +6507,32 @@
           <w:i w:val="0"/>
           <w:sz w:val="22"/>
         </w:rPr>
-        <w:t>Install these VS Code extensions:</w:t>
+        <w:t>A well-designed Julia package separates three concerns into three types: the grid (where), the problem (what), and the solution (result). Multiple dispatch then lets you write one function name — solve, plot — and Julia picks the right method automatically based on which types you pass in. This section builds a minimal PDESolvers package from scratch to show that workflow.</w:t>
+      </w:r>
+    </w:p>
+    <w:p>
+      <w:pPr>
+        <w:pStyle w:val="Heading2"/>
+      </w:pPr>
+      <w:r>
+        <w:rPr>
+          <w:rFonts w:ascii="Arial" w:hAnsi="Arial"/>
+          <w:b/>
+          <w:color w:val="2E75B6"/>
+          <w:sz w:val="28"/>
+        </w:rPr>
+        <w:t>6.1  The Three-Type Architecture</w:t>
+      </w:r>
+    </w:p>
+    <w:p>
+      <w:r>
+        <w:rPr>
+          <w:rFonts w:ascii="Arial" w:hAnsi="Arial"/>
+          <w:b w:val="0"/>
+          <w:i w:val="0"/>
+          <w:sz w:val="22"/>
+        </w:rPr>
+        <w:t>Grid resolution, physical parameters, and computed results change at different rates and for different reasons. Separating them into their own types makes it trivial to refine the mesh, swap the boundary condition, or compare two physics models without rewriting the solver logic:</w:t>
       </w:r>
     </w:p>
     <w:tbl>
@@ -6332,13 +6542,14 @@
         <w:tblLook w:firstColumn="1" w:firstRow="1" w:lastColumn="0" w:lastRow="0" w:noHBand="0" w:noVBand="1" w:val="04A0"/>
       </w:tblPr>
       <w:tblGrid>
-        <w:gridCol w:w="4680"/>
-        <w:gridCol w:w="4680"/>
+        <w:gridCol w:w="3120"/>
+        <w:gridCol w:w="3120"/>
+        <w:gridCol w:w="3120"/>
       </w:tblGrid>
       <w:tr>
         <w:tc>
           <w:tcPr>
-            <w:tcW w:type="dxa" w:w="4680"/>
+            <w:tcW w:type="dxa" w:w="3120"/>
             <w:shd w:fill="1F4E79"/>
           </w:tcPr>
           <w:p>
@@ -6350,13 +6561,13 @@
                 <w:color w:val="FFFFFF"/>
                 <w:sz w:val="20"/>
               </w:rPr>
-              <w:t>Extension</w:t>
+              <w:t>Type</w:t>
             </w:r>
           </w:p>
         </w:tc>
         <w:tc>
           <w:tcPr>
-            <w:tcW w:type="dxa" w:w="4680"/>
+            <w:tcW w:type="dxa" w:w="3120"/>
             <w:shd w:fill="1F4E79"/>
           </w:tcPr>
           <w:p>
@@ -6368,7 +6579,25 @@
                 <w:color w:val="FFFFFF"/>
                 <w:sz w:val="20"/>
               </w:rPr>
-              <w:t>Purpose</w:t>
+              <w:t>Holds</w:t>
+            </w:r>
+          </w:p>
+        </w:tc>
+        <w:tc>
+          <w:tcPr>
+            <w:tcW w:type="dxa" w:w="3120"/>
+            <w:shd w:fill="1F4E79"/>
+          </w:tcPr>
+          <w:p>
+            <w:r/>
+            <w:r>
+              <w:rPr>
+                <w:rFonts w:ascii="Arial" w:hAnsi="Arial"/>
+                <w:b/>
+                <w:color w:val="FFFFFF"/>
+                <w:sz w:val="20"/>
+              </w:rPr>
+              <w:t>Changes when</w:t>
             </w:r>
           </w:p>
         </w:tc>
@@ -6376,7 +6605,7 @@
       <w:tr>
         <w:tc>
           <w:tcPr>
-            <w:tcW w:type="dxa" w:w="4680"/>
+            <w:tcW w:type="dxa" w:w="3120"/>
           </w:tcPr>
           <w:p>
             <w:r/>
@@ -6385,13 +6614,13 @@
                 <w:rFonts w:ascii="Arial" w:hAnsi="Arial"/>
                 <w:sz w:val="20"/>
               </w:rPr>
-              <w:t>WSL</w:t>
+              <w:t>Grid1D</w:t>
             </w:r>
           </w:p>
         </w:tc>
         <w:tc>
           <w:tcPr>
-            <w:tcW w:type="dxa" w:w="4680"/>
+            <w:tcW w:type="dxa" w:w="3120"/>
           </w:tcPr>
           <w:p>
             <w:r/>
@@ -6400,15 +6629,13 @@
                 <w:rFonts w:ascii="Arial" w:hAnsi="Arial"/>
                 <w:sz w:val="20"/>
               </w:rPr>
-              <w:t>Connect VS Code to WSL</w:t>
+              <w:t>n, dx, x array</w:t>
             </w:r>
           </w:p>
         </w:tc>
-      </w:tr>
-      <w:tr>
         <w:tc>
           <w:tcPr>
-            <w:tcW w:type="dxa" w:w="4680"/>
+            <w:tcW w:type="dxa" w:w="3120"/>
           </w:tcPr>
           <w:p>
             <w:r/>
@@ -6417,13 +6644,15 @@
                 <w:rFonts w:ascii="Arial" w:hAnsi="Arial"/>
                 <w:sz w:val="20"/>
               </w:rPr>
-              <w:t>Julia</w:t>
+              <w:t>you want finer resolution</w:t>
             </w:r>
           </w:p>
         </w:tc>
+      </w:tr>
+      <w:tr>
         <w:tc>
           <w:tcPr>
-            <w:tcW w:type="dxa" w:w="4680"/>
+            <w:tcW w:type="dxa" w:w="3120"/>
           </w:tcPr>
           <w:p>
             <w:r/>
@@ -6432,15 +6661,13 @@
                 <w:rFonts w:ascii="Arial" w:hAnsi="Arial"/>
                 <w:sz w:val="20"/>
               </w:rPr>
-              <w:t>Syntax, IntelliSense, REPL</w:t>
+              <w:t>HeatProblem</w:t>
             </w:r>
           </w:p>
         </w:tc>
-      </w:tr>
-      <w:tr>
         <w:tc>
           <w:tcPr>
-            <w:tcW w:type="dxa" w:w="4680"/>
+            <w:tcW w:type="dxa" w:w="3120"/>
           </w:tcPr>
           <w:p>
             <w:r/>
@@ -6449,13 +6676,13 @@
                 <w:rFonts w:ascii="Arial" w:hAnsi="Arial"/>
                 <w:sz w:val="20"/>
               </w:rPr>
-              <w:t>Jupyter</w:t>
+              <w:t>α, T, u0, a Grid1D</w:t>
             </w:r>
           </w:p>
         </w:tc>
         <w:tc>
           <w:tcPr>
-            <w:tcW w:type="dxa" w:w="4680"/>
+            <w:tcW w:type="dxa" w:w="3120"/>
           </w:tcPr>
           <w:p>
             <w:r/>
@@ -6464,7 +6691,7 @@
                 <w:rFonts w:ascii="Arial" w:hAnsi="Arial"/>
                 <w:sz w:val="20"/>
               </w:rPr>
-              <w:t>Run notebooks with Julia kernel</w:t>
+              <w:t>you change the physics or IC</w:t>
             </w:r>
           </w:p>
         </w:tc>
@@ -6472,7 +6699,7 @@
       <w:tr>
         <w:tc>
           <w:tcPr>
-            <w:tcW w:type="dxa" w:w="4680"/>
+            <w:tcW w:type="dxa" w:w="3120"/>
           </w:tcPr>
           <w:p>
             <w:r/>
@@ -6481,13 +6708,13 @@
                 <w:rFonts w:ascii="Arial" w:hAnsi="Arial"/>
                 <w:sz w:val="20"/>
               </w:rPr>
-              <w:t>Remote — SSH</w:t>
+              <w:t>Solution1D</w:t>
             </w:r>
           </w:p>
         </w:tc>
         <w:tc>
           <w:tcPr>
-            <w:tcW w:type="dxa" w:w="4680"/>
+            <w:tcW w:type="dxa" w:w="3120"/>
           </w:tcPr>
           <w:p>
             <w:r/>
@@ -6496,13 +6723,2527 @@
                 <w:rFonts w:ascii="Arial" w:hAnsi="Arial"/>
                 <w:sz w:val="20"/>
               </w:rPr>
-              <w:t>Connect to HPC cluster</w:t>
+              <w:t>x, u, t, the problem reference</w:t>
+            </w:r>
+          </w:p>
+        </w:tc>
+        <w:tc>
+          <w:tcPr>
+            <w:tcW w:type="dxa" w:w="3120"/>
+          </w:tcPr>
+          <w:p>
+            <w:r/>
+            <w:r>
+              <w:rPr>
+                <w:rFonts w:ascii="Arial" w:hAnsi="Arial"/>
+                <w:sz w:val="20"/>
+              </w:rPr>
+              <w:t>solve() returns one of these</w:t>
             </w:r>
           </w:p>
         </w:tc>
       </w:tr>
     </w:tbl>
     <w:p>
+      <w:pPr>
+        <w:pStyle w:val="Heading3"/>
+      </w:pPr>
+      <w:r>
+        <w:rPr>
+          <w:rFonts w:ascii="Arial" w:hAnsi="Arial"/>
+          <w:b/>
+          <w:color w:val="444444"/>
+          <w:sz w:val="24"/>
+        </w:rPr>
+        <w:t>Beginner Concept Check: Structs, Instances, and Functions</w:t>
+      </w:r>
+    </w:p>
+    <w:p>
+      <w:r>
+        <w:rPr>
+          <w:rFonts w:ascii="Arial" w:hAnsi="Arial"/>
+          <w:b w:val="0"/>
+          <w:i w:val="0"/>
+          <w:sz w:val="22"/>
+        </w:rPr>
+        <w:t>If you are new to custom data types, the interaction between structs, variables, and functions can feel abstract. Let's clarify exactly how they work together:</w:t>
+      </w:r>
+    </w:p>
+    <w:p>
+      <w:r>
+        <w:rPr>
+          <w:rFonts w:ascii="Arial" w:hAnsi="Arial"/>
+          <w:b w:val="0"/>
+          <w:i w:val="0"/>
+          <w:sz w:val="22"/>
+        </w:rPr>
+        <w:t>1. What is a Struct? A struct is a custom composite data type that bundles multiple pieces of related data (called fields) together under a single name. Instead of passing ten individual variables into every function, we pack them into one structured container blueprint.</w:t>
+      </w:r>
+    </w:p>
+    <w:p>
+      <w:r>
+        <w:rPr>
+          <w:rFonts w:ascii="Arial" w:hAnsi="Arial"/>
+          <w:b w:val="0"/>
+          <w:i w:val="0"/>
+          <w:sz w:val="22"/>
+        </w:rPr>
+        <w:t>2. How to create a Struct? We write the struct keyword followed by the container name, list its internal fields with their types, and end with end. Using the Base.@kwdef macro above it automatically writes a keyword constructor with convenient default values:</w:t>
+      </w:r>
+    </w:p>
+    <w:p>
+      <w:pPr>
+        <w:ind w:left="360"/>
+        <w:shd w:fill="F0F0F0"/>
+      </w:pPr>
+      <w:r>
+        <w:rPr>
+          <w:rFonts w:ascii="Courier New" w:hAnsi="Courier New"/>
+          <w:color w:val="1A1A1A"/>
+          <w:sz w:val="19"/>
+        </w:rPr>
+        <w:t>Base.@kwdef struct SimpleHeatConfig</w:t>
+      </w:r>
+    </w:p>
+    <w:p>
+      <w:pPr>
+        <w:ind w:left="360"/>
+        <w:shd w:fill="F0F0F0"/>
+      </w:pPr>
+      <w:r>
+        <w:rPr>
+          <w:rFonts w:ascii="Courier New" w:hAnsi="Courier New"/>
+          <w:color w:val="1A1A1A"/>
+          <w:sz w:val="19"/>
+        </w:rPr>
+        <w:t xml:space="preserve">    L::Float64 = 1.0       # Domain length</w:t>
+      </w:r>
+    </w:p>
+    <w:p>
+      <w:pPr>
+        <w:ind w:left="360"/>
+        <w:shd w:fill="F0F0F0"/>
+      </w:pPr>
+      <w:r>
+        <w:rPr>
+          <w:rFonts w:ascii="Courier New" w:hAnsi="Courier New"/>
+          <w:color w:val="1A1A1A"/>
+          <w:sz w:val="19"/>
+        </w:rPr>
+        <w:t xml:space="preserve">    α::Float64 = 0.01      # Thermal diffusivity</w:t>
+      </w:r>
+    </w:p>
+    <w:p>
+      <w:pPr>
+        <w:ind w:left="360"/>
+        <w:shd w:fill="F0F0F0"/>
+      </w:pPr>
+      <w:r>
+        <w:rPr>
+          <w:rFonts w:ascii="Courier New" w:hAnsi="Courier New"/>
+          <w:color w:val="1A1A1A"/>
+          <w:sz w:val="19"/>
+        </w:rPr>
+        <w:t xml:space="preserve">    N::Int     = 100       # Grid resolution</w:t>
+      </w:r>
+    </w:p>
+    <w:p>
+      <w:pPr>
+        <w:ind w:left="360"/>
+        <w:shd w:fill="F0F0F0"/>
+      </w:pPr>
+      <w:r>
+        <w:rPr>
+          <w:rFonts w:ascii="Courier New" w:hAnsi="Courier New"/>
+          <w:color w:val="1A1A1A"/>
+          <w:sz w:val="19"/>
+        </w:rPr>
+        <w:t>end</w:t>
+      </w:r>
+    </w:p>
+    <w:p>
+      <w:r>
+        <w:rPr>
+          <w:rFonts w:ascii="Arial" w:hAnsi="Arial"/>
+          <w:b w:val="0"/>
+          <w:i w:val="0"/>
+          <w:sz w:val="22"/>
+        </w:rPr>
+        <w:t>3. What is the variable that is the Struct (an Instance)? The code above is just a blueprint. To use it, we call the struct's name like a function to create a concrete object in computer memory, called an instance, and assign it to a variable. We can then read its internal fields using dot notation:</w:t>
+      </w:r>
+    </w:p>
+    <w:p>
+      <w:pPr>
+        <w:ind w:left="360"/>
+        <w:shd w:fill="F0F0F0"/>
+      </w:pPr>
+      <w:r>
+        <w:rPr>
+          <w:rFonts w:ascii="Courier New" w:hAnsi="Courier New"/>
+          <w:color w:val="1A1A1A"/>
+          <w:sz w:val="19"/>
+        </w:rPr>
+        <w:t># Create an instance; omitted fields automatically use defaults</w:t>
+      </w:r>
+    </w:p>
+    <w:p>
+      <w:pPr>
+        <w:ind w:left="360"/>
+        <w:shd w:fill="F0F0F0"/>
+      </w:pPr>
+      <w:r>
+        <w:rPr>
+          <w:rFonts w:ascii="Courier New" w:hAnsi="Courier New"/>
+          <w:color w:val="1A1A1A"/>
+          <w:sz w:val="19"/>
+        </w:rPr>
+        <w:t>my_config = SimpleHeatConfig(α=0.05, N=200)</w:t>
+      </w:r>
+    </w:p>
+    <w:p>
+      <w:pPr>
+        <w:ind w:left="360"/>
+        <w:shd w:fill="F0F0F0"/>
+      </w:pPr>
+      <w:r>
+        <w:rPr>
+          <w:rFonts w:ascii="Courier New" w:hAnsi="Courier New"/>
+          <w:color w:val="1A1A1A"/>
+          <w:sz w:val="19"/>
+        </w:rPr>
+      </w:r>
+    </w:p>
+    <w:p>
+      <w:pPr>
+        <w:ind w:left="360"/>
+        <w:shd w:fill="F0F0F0"/>
+      </w:pPr>
+      <w:r>
+        <w:rPr>
+          <w:rFonts w:ascii="Courier New" w:hAnsi="Courier New"/>
+          <w:color w:val="1A1A1A"/>
+          <w:sz w:val="19"/>
+        </w:rPr>
+        <w:t># Access individual bundled fields using a dot (.):</w:t>
+      </w:r>
+    </w:p>
+    <w:p>
+      <w:pPr>
+        <w:ind w:left="360"/>
+        <w:shd w:fill="F0F0F0"/>
+      </w:pPr>
+      <w:r>
+        <w:rPr>
+          <w:rFonts w:ascii="Courier New" w:hAnsi="Courier New"/>
+          <w:color w:val="1A1A1A"/>
+          <w:sz w:val="19"/>
+        </w:rPr>
+        <w:t>println("Configured diffusivity: ", my_config.α)</w:t>
+      </w:r>
+    </w:p>
+    <w:p>
+      <w:pPr>
+        <w:ind w:left="360"/>
+        <w:shd w:fill="F0F0F0"/>
+      </w:pPr>
+      <w:r>
+        <w:rPr>
+          <w:rFonts w:ascii="Courier New" w:hAnsi="Courier New"/>
+          <w:color w:val="1A1A1A"/>
+          <w:sz w:val="19"/>
+        </w:rPr>
+        <w:t>println("Configured grid points: ", my_config.N)</w:t>
+      </w:r>
+    </w:p>
+    <w:p>
+      <w:r>
+        <w:rPr>
+          <w:rFonts w:ascii="Arial" w:hAnsi="Arial"/>
+          <w:b w:val="0"/>
+          <w:i w:val="0"/>
+          <w:sz w:val="22"/>
+        </w:rPr>
+        <w:t>4. How to create a Function to receive the Struct? To write a function that operates on our configuration, we define a function that accepts a single argument annotated with our custom struct type. Inside the function body, we use dot notation to unpack the exact fields we need:</w:t>
+      </w:r>
+    </w:p>
+    <w:p>
+      <w:pPr>
+        <w:ind w:left="360"/>
+        <w:shd w:fill="F0F0F0"/>
+      </w:pPr>
+      <w:r>
+        <w:rPr>
+          <w:rFonts w:ascii="Courier New" w:hAnsi="Courier New"/>
+          <w:color w:val="1A1A1A"/>
+          <w:sz w:val="19"/>
+        </w:rPr>
+        <w:t>function print_stability_limit(config::SimpleHeatConfig)</w:t>
+      </w:r>
+    </w:p>
+    <w:p>
+      <w:pPr>
+        <w:ind w:left="360"/>
+        <w:shd w:fill="F0F0F0"/>
+      </w:pPr>
+      <w:r>
+        <w:rPr>
+          <w:rFonts w:ascii="Courier New" w:hAnsi="Courier New"/>
+          <w:color w:val="1A1A1A"/>
+          <w:sz w:val="19"/>
+        </w:rPr>
+        <w:t xml:space="preserve">    dx = config.L / (config.N + 1)</w:t>
+      </w:r>
+    </w:p>
+    <w:p>
+      <w:pPr>
+        <w:ind w:left="360"/>
+        <w:shd w:fill="F0F0F0"/>
+      </w:pPr>
+      <w:r>
+        <w:rPr>
+          <w:rFonts w:ascii="Courier New" w:hAnsi="Courier New"/>
+          <w:color w:val="1A1A1A"/>
+          <w:sz w:val="19"/>
+        </w:rPr>
+        <w:t xml:space="preserve">    max_dt = 0.5 * dx^2 / config.α</w:t>
+      </w:r>
+    </w:p>
+    <w:p>
+      <w:pPr>
+        <w:ind w:left="360"/>
+        <w:shd w:fill="F0F0F0"/>
+      </w:pPr>
+      <w:r>
+        <w:rPr>
+          <w:rFonts w:ascii="Courier New" w:hAnsi="Courier New"/>
+          <w:color w:val="1A1A1A"/>
+          <w:sz w:val="19"/>
+        </w:rPr>
+        <w:t xml:space="preserve">    println("Maximum stable time step dt: ", max_dt)</w:t>
+      </w:r>
+    </w:p>
+    <w:p>
+      <w:pPr>
+        <w:ind w:left="360"/>
+        <w:shd w:fill="F0F0F0"/>
+      </w:pPr>
+      <w:r>
+        <w:rPr>
+          <w:rFonts w:ascii="Courier New" w:hAnsi="Courier New"/>
+          <w:color w:val="1A1A1A"/>
+          <w:sz w:val="19"/>
+        </w:rPr>
+        <w:t>end</w:t>
+      </w:r>
+    </w:p>
+    <w:p>
+      <w:pPr>
+        <w:ind w:left="360"/>
+        <w:shd w:fill="F0F0F0"/>
+      </w:pPr>
+      <w:r>
+        <w:rPr>
+          <w:rFonts w:ascii="Courier New" w:hAnsi="Courier New"/>
+          <w:color w:val="1A1A1A"/>
+          <w:sz w:val="19"/>
+        </w:rPr>
+      </w:r>
+    </w:p>
+    <w:p>
+      <w:pPr>
+        <w:ind w:left="360"/>
+        <w:shd w:fill="F0F0F0"/>
+      </w:pPr>
+      <w:r>
+        <w:rPr>
+          <w:rFonts w:ascii="Courier New" w:hAnsi="Courier New"/>
+          <w:color w:val="1A1A1A"/>
+          <w:sz w:val="19"/>
+        </w:rPr>
+        <w:t># Pass our struct variable into the function</w:t>
+      </w:r>
+    </w:p>
+    <w:p>
+      <w:pPr>
+        <w:ind w:left="360"/>
+        <w:shd w:fill="F0F0F0"/>
+      </w:pPr>
+      <w:r>
+        <w:rPr>
+          <w:rFonts w:ascii="Courier New" w:hAnsi="Courier New"/>
+          <w:color w:val="1A1A1A"/>
+          <w:sz w:val="19"/>
+        </w:rPr>
+        <w:t>print_stability_limit(my_config)</w:t>
+      </w:r>
+    </w:p>
+    <w:p>
+      <w:r>
+        <w:rPr>
+          <w:rFonts w:ascii="Arial" w:hAnsi="Arial"/>
+          <w:b w:val="0"/>
+          <w:i w:val="0"/>
+          <w:sz w:val="22"/>
+        </w:rPr>
+        <w:t>5. Structs vs. Functions: Nouns vs. Verbs. A struct holds passive state and data (e.g., domain dimensions, arrays, physical constants). A function defines active behavior and logic (e.g., loops, time-stepping, mathematical updates). Structs are the materials; functions are the machines that transform them.</w:t>
+      </w:r>
+    </w:p>
+    <w:p>
+      <w:r>
+        <w:rPr>
+          <w:rFonts w:ascii="Arial" w:hAnsi="Arial"/>
+          <w:b w:val="0"/>
+          <w:i w:val="0"/>
+          <w:sz w:val="22"/>
+        </w:rPr>
+        <w:t>6. Global Scope vs. Local Scope (Crucial for Performance). Variables defined directly in the main script body live in the global scope. Because global variables can change their data type at any time, the Julia compiler cannot optimize them, making loops in global scope very slow. Variables defined inside a function body live in a local scope. The compiler knows their exact types, compiling local operations to extremely fast machine code. Best Practice: Always wrap your solver loops and computations inside functions!</w:t>
+      </w:r>
+    </w:p>
+    <w:p>
+      <w:r>
+        <w:rPr>
+          <w:rFonts w:ascii="Arial" w:hAnsi="Arial"/>
+          <w:b w:val="0"/>
+          <w:i w:val="0"/>
+          <w:sz w:val="22"/>
+        </w:rPr>
+        <w:t>7. Where do you run these scripts? Once you write your code in a file (e.g., solver.jl), you can run it in three ways: (a) Terminal execution: run 'julia solver.jl' directly from your Linux command line. (b) REPL inclusion: open the Julia REPL and type 'include("solver.jl")' to load and execute the file. (c) VS Code execution: open the file in VS Code and press Shift+Enter to run specific blocks interactively.</w:t>
+      </w:r>
+    </w:p>
+    <w:p>
+      <w:pPr>
+        <w:pStyle w:val="Heading2"/>
+      </w:pPr>
+      <w:r>
+        <w:rPr>
+          <w:rFonts w:ascii="Arial" w:hAnsi="Arial"/>
+          <w:b/>
+          <w:color w:val="2E75B6"/>
+          <w:sz w:val="28"/>
+        </w:rPr>
+        <w:t>6.2  The Grid Struct</w:t>
+      </w:r>
+    </w:p>
+    <w:p>
+      <w:r>
+        <w:rPr>
+          <w:rFonts w:ascii="Arial" w:hAnsi="Arial"/>
+          <w:b w:val="0"/>
+          <w:i w:val="0"/>
+          <w:sz w:val="22"/>
+        </w:rPr>
+        <w:t>Grid1D stores everything about the spatial domain. Computed fields (dx, x) are derived from n and L so callers cannot accidentally create an inconsistent grid. Base.@kwdef generates a keyword constructor with defaults — Grid1D() gives a 200-point unit interval and Grid1D(n=800, L=2.0) overrides only what you need:</w:t>
+      </w:r>
+    </w:p>
+    <w:p>
+      <w:pPr>
+        <w:ind w:left="360"/>
+        <w:shd w:fill="F0F0F0"/>
+      </w:pPr>
+      <w:r>
+        <w:rPr>
+          <w:rFonts w:ascii="Courier New" w:hAnsi="Courier New"/>
+          <w:color w:val="1A1A1A"/>
+          <w:sz w:val="19"/>
+        </w:rPr>
+        <w:t># src/grids.jl</w:t>
+      </w:r>
+    </w:p>
+    <w:p>
+      <w:pPr>
+        <w:ind w:left="360"/>
+        <w:shd w:fill="F0F0F0"/>
+      </w:pPr>
+      <w:r>
+        <w:rPr>
+          <w:rFonts w:ascii="Courier New" w:hAnsi="Courier New"/>
+          <w:color w:val="1A1A1A"/>
+          <w:sz w:val="19"/>
+        </w:rPr>
+        <w:t>Base.@kwdef struct Grid1D</w:t>
+      </w:r>
+    </w:p>
+    <w:p>
+      <w:pPr>
+        <w:ind w:left="360"/>
+        <w:shd w:fill="F0F0F0"/>
+      </w:pPr>
+      <w:r>
+        <w:rPr>
+          <w:rFonts w:ascii="Courier New" w:hAnsi="Courier New"/>
+          <w:color w:val="1A1A1A"/>
+          <w:sz w:val="19"/>
+        </w:rPr>
+        <w:t xml:space="preserve">    n  :: Int             = 200</w:t>
+      </w:r>
+    </w:p>
+    <w:p>
+      <w:pPr>
+        <w:ind w:left="360"/>
+        <w:shd w:fill="F0F0F0"/>
+      </w:pPr>
+      <w:r>
+        <w:rPr>
+          <w:rFonts w:ascii="Courier New" w:hAnsi="Courier New"/>
+          <w:color w:val="1A1A1A"/>
+          <w:sz w:val="19"/>
+        </w:rPr>
+        <w:t xml:space="preserve">    L  :: Float64         = 1.0</w:t>
+      </w:r>
+    </w:p>
+    <w:p>
+      <w:pPr>
+        <w:ind w:left="360"/>
+        <w:shd w:fill="F0F0F0"/>
+      </w:pPr>
+      <w:r>
+        <w:rPr>
+          <w:rFonts w:ascii="Courier New" w:hAnsi="Courier New"/>
+          <w:color w:val="1A1A1A"/>
+          <w:sz w:val="19"/>
+        </w:rPr>
+        <w:t xml:space="preserve">    dx :: Float64         = L / (n + 1)</w:t>
+      </w:r>
+    </w:p>
+    <w:p>
+      <w:pPr>
+        <w:ind w:left="360"/>
+        <w:shd w:fill="F0F0F0"/>
+      </w:pPr>
+      <w:r>
+        <w:rPr>
+          <w:rFonts w:ascii="Courier New" w:hAnsi="Courier New"/>
+          <w:color w:val="1A1A1A"/>
+          <w:sz w:val="19"/>
+        </w:rPr>
+        <w:t xml:space="preserve">    x  :: Vector{Float64} = collect(range(dx, L - dx, length=n))</w:t>
+      </w:r>
+    </w:p>
+    <w:p>
+      <w:pPr>
+        <w:ind w:left="360"/>
+        <w:shd w:fill="F0F0F0"/>
+      </w:pPr>
+      <w:r>
+        <w:rPr>
+          <w:rFonts w:ascii="Courier New" w:hAnsi="Courier New"/>
+          <w:color w:val="1A1A1A"/>
+          <w:sz w:val="19"/>
+        </w:rPr>
+        <w:t>end</w:t>
+      </w:r>
+    </w:p>
+    <w:p>
+      <w:pPr>
+        <w:pStyle w:val="Heading2"/>
+      </w:pPr>
+      <w:r>
+        <w:rPr>
+          <w:rFonts w:ascii="Arial" w:hAnsi="Arial"/>
+          <w:b/>
+          <w:color w:val="2E75B6"/>
+          <w:sz w:val="28"/>
+        </w:rPr>
+        <w:t>6.3  Problem Structs</w:t>
+      </w:r>
+    </w:p>
+    <w:p>
+      <w:r>
+        <w:rPr>
+          <w:rFonts w:ascii="Arial" w:hAnsi="Arial"/>
+          <w:b w:val="0"/>
+          <w:i w:val="0"/>
+          <w:sz w:val="22"/>
+        </w:rPr>
+        <w:t>Each physics model gets its own struct. Both embed a Grid1D so the solver can always reach the mesh through the problem — no extra arguments needed. Greek-letter field names (α, c) match the mathematical notation used in the PDE:</w:t>
+      </w:r>
+    </w:p>
+    <w:p>
+      <w:pPr>
+        <w:ind w:left="360"/>
+        <w:shd w:fill="F0F0F0"/>
+      </w:pPr>
+      <w:r>
+        <w:rPr>
+          <w:rFonts w:ascii="Courier New" w:hAnsi="Courier New"/>
+          <w:color w:val="1A1A1A"/>
+          <w:sz w:val="19"/>
+        </w:rPr>
+        <w:t># src/problems.jl</w:t>
+      </w:r>
+    </w:p>
+    <w:p>
+      <w:pPr>
+        <w:ind w:left="360"/>
+        <w:shd w:fill="F0F0F0"/>
+      </w:pPr>
+      <w:r>
+        <w:rPr>
+          <w:rFonts w:ascii="Courier New" w:hAnsi="Courier New"/>
+          <w:color w:val="1A1A1A"/>
+          <w:sz w:val="19"/>
+        </w:rPr>
+        <w:t>Base.@kwdef struct HeatProblem</w:t>
+      </w:r>
+    </w:p>
+    <w:p>
+      <w:pPr>
+        <w:ind w:left="360"/>
+        <w:shd w:fill="F0F0F0"/>
+      </w:pPr>
+      <w:r>
+        <w:rPr>
+          <w:rFonts w:ascii="Courier New" w:hAnsi="Courier New"/>
+          <w:color w:val="1A1A1A"/>
+          <w:sz w:val="19"/>
+        </w:rPr>
+        <w:t xml:space="preserve">    grid :: Grid1D   = Grid1D()</w:t>
+      </w:r>
+    </w:p>
+    <w:p>
+      <w:pPr>
+        <w:ind w:left="360"/>
+        <w:shd w:fill="F0F0F0"/>
+      </w:pPr>
+      <w:r>
+        <w:rPr>
+          <w:rFonts w:ascii="Courier New" w:hAnsi="Courier New"/>
+          <w:color w:val="1A1A1A"/>
+          <w:sz w:val="19"/>
+        </w:rPr>
+        <w:t xml:space="preserve">    α    :: Float64  = 0.01              # thermal diffusivity</w:t>
+      </w:r>
+    </w:p>
+    <w:p>
+      <w:pPr>
+        <w:ind w:left="360"/>
+        <w:shd w:fill="F0F0F0"/>
+      </w:pPr>
+      <w:r>
+        <w:rPr>
+          <w:rFonts w:ascii="Courier New" w:hAnsi="Courier New"/>
+          <w:color w:val="1A1A1A"/>
+          <w:sz w:val="19"/>
+        </w:rPr>
+        <w:t xml:space="preserve">    T    :: Float64  = 1.0               # final time</w:t>
+      </w:r>
+    </w:p>
+    <w:p>
+      <w:pPr>
+        <w:ind w:left="360"/>
+        <w:shd w:fill="F0F0F0"/>
+      </w:pPr>
+      <w:r>
+        <w:rPr>
+          <w:rFonts w:ascii="Courier New" w:hAnsi="Courier New"/>
+          <w:color w:val="1A1A1A"/>
+          <w:sz w:val="19"/>
+        </w:rPr>
+        <w:t xml:space="preserve">    u0   :: Function = x -&gt; exp(-100*(x - 0.5)^2)</w:t>
+      </w:r>
+    </w:p>
+    <w:p>
+      <w:pPr>
+        <w:ind w:left="360"/>
+        <w:shd w:fill="F0F0F0"/>
+      </w:pPr>
+      <w:r>
+        <w:rPr>
+          <w:rFonts w:ascii="Courier New" w:hAnsi="Courier New"/>
+          <w:color w:val="1A1A1A"/>
+          <w:sz w:val="19"/>
+        </w:rPr>
+        <w:t>end</w:t>
+      </w:r>
+    </w:p>
+    <w:p>
+      <w:pPr>
+        <w:ind w:left="360"/>
+        <w:shd w:fill="F0F0F0"/>
+      </w:pPr>
+      <w:r>
+        <w:rPr>
+          <w:rFonts w:ascii="Courier New" w:hAnsi="Courier New"/>
+          <w:color w:val="1A1A1A"/>
+          <w:sz w:val="19"/>
+        </w:rPr>
+      </w:r>
+    </w:p>
+    <w:p>
+      <w:pPr>
+        <w:ind w:left="360"/>
+        <w:shd w:fill="F0F0F0"/>
+      </w:pPr>
+      <w:r>
+        <w:rPr>
+          <w:rFonts w:ascii="Courier New" w:hAnsi="Courier New"/>
+          <w:color w:val="1A1A1A"/>
+          <w:sz w:val="19"/>
+        </w:rPr>
+        <w:t>Base.@kwdef struct WaveProblem</w:t>
+      </w:r>
+    </w:p>
+    <w:p>
+      <w:pPr>
+        <w:ind w:left="360"/>
+        <w:shd w:fill="F0F0F0"/>
+      </w:pPr>
+      <w:r>
+        <w:rPr>
+          <w:rFonts w:ascii="Courier New" w:hAnsi="Courier New"/>
+          <w:color w:val="1A1A1A"/>
+          <w:sz w:val="19"/>
+        </w:rPr>
+        <w:t xml:space="preserve">    grid :: Grid1D   = Grid1D()</w:t>
+      </w:r>
+    </w:p>
+    <w:p>
+      <w:pPr>
+        <w:ind w:left="360"/>
+        <w:shd w:fill="F0F0F0"/>
+      </w:pPr>
+      <w:r>
+        <w:rPr>
+          <w:rFonts w:ascii="Courier New" w:hAnsi="Courier New"/>
+          <w:color w:val="1A1A1A"/>
+          <w:sz w:val="19"/>
+        </w:rPr>
+        <w:t xml:space="preserve">    c    :: Float64  = 1.0               # wave speed</w:t>
+      </w:r>
+    </w:p>
+    <w:p>
+      <w:pPr>
+        <w:ind w:left="360"/>
+        <w:shd w:fill="F0F0F0"/>
+      </w:pPr>
+      <w:r>
+        <w:rPr>
+          <w:rFonts w:ascii="Courier New" w:hAnsi="Courier New"/>
+          <w:color w:val="1A1A1A"/>
+          <w:sz w:val="19"/>
+        </w:rPr>
+        <w:t xml:space="preserve">    T    :: Float64  = 1.5</w:t>
+      </w:r>
+    </w:p>
+    <w:p>
+      <w:pPr>
+        <w:ind w:left="360"/>
+        <w:shd w:fill="F0F0F0"/>
+      </w:pPr>
+      <w:r>
+        <w:rPr>
+          <w:rFonts w:ascii="Courier New" w:hAnsi="Courier New"/>
+          <w:color w:val="1A1A1A"/>
+          <w:sz w:val="19"/>
+        </w:rPr>
+        <w:t xml:space="preserve">    u0   :: Function = x -&gt; sin.(π .* x)</w:t>
+      </w:r>
+    </w:p>
+    <w:p>
+      <w:pPr>
+        <w:ind w:left="360"/>
+        <w:shd w:fill="F0F0F0"/>
+      </w:pPr>
+      <w:r>
+        <w:rPr>
+          <w:rFonts w:ascii="Courier New" w:hAnsi="Courier New"/>
+          <w:color w:val="1A1A1A"/>
+          <w:sz w:val="19"/>
+        </w:rPr>
+        <w:t>end</w:t>
+      </w:r>
+    </w:p>
+    <w:p>
+      <w:r>
+        <w:br w:type="page"/>
+      </w:r>
+    </w:p>
+    <w:p>
+      <w:pPr>
+        <w:pStyle w:val="Heading2"/>
+      </w:pPr>
+      <w:r>
+        <w:rPr>
+          <w:rFonts w:ascii="Arial" w:hAnsi="Arial"/>
+          <w:b/>
+          <w:color w:val="2E75B6"/>
+          <w:sz w:val="28"/>
+        </w:rPr>
+        <w:t>6.4  The Solution Type and solve() Dispatch</w:t>
+      </w:r>
+    </w:p>
+    <w:p>
+      <w:r>
+        <w:rPr>
+          <w:rFonts w:ascii="Arial" w:hAnsi="Arial"/>
+          <w:b w:val="0"/>
+          <w:i w:val="0"/>
+          <w:sz w:val="22"/>
+        </w:rPr>
+        <w:t>Solution1D is parameterised by the problem type P so that plot() can dispatch on it at compile time — zero runtime cost. Two solve() methods share the same name; Julia selects the right one from the argument type alone:</w:t>
+      </w:r>
+    </w:p>
+    <w:p>
+      <w:pPr>
+        <w:ind w:left="360"/>
+        <w:shd w:fill="F0F0F0"/>
+      </w:pPr>
+      <w:r>
+        <w:rPr>
+          <w:rFonts w:ascii="Courier New" w:hAnsi="Courier New"/>
+          <w:color w:val="1A1A1A"/>
+          <w:sz w:val="19"/>
+        </w:rPr>
+        <w:t># src/solvers.jl</w:t>
+      </w:r>
+    </w:p>
+    <w:p>
+      <w:pPr>
+        <w:ind w:left="360"/>
+        <w:shd w:fill="F0F0F0"/>
+      </w:pPr>
+      <w:r>
+        <w:rPr>
+          <w:rFonts w:ascii="Courier New" w:hAnsi="Courier New"/>
+          <w:color w:val="1A1A1A"/>
+          <w:sz w:val="19"/>
+        </w:rPr>
+        <w:t>struct Solution1D{P}</w:t>
+      </w:r>
+    </w:p>
+    <w:p>
+      <w:pPr>
+        <w:ind w:left="360"/>
+        <w:shd w:fill="F0F0F0"/>
+      </w:pPr>
+      <w:r>
+        <w:rPr>
+          <w:rFonts w:ascii="Courier New" w:hAnsi="Courier New"/>
+          <w:color w:val="1A1A1A"/>
+          <w:sz w:val="19"/>
+        </w:rPr>
+        <w:t xml:space="preserve">    prob :: P</w:t>
+      </w:r>
+    </w:p>
+    <w:p>
+      <w:pPr>
+        <w:ind w:left="360"/>
+        <w:shd w:fill="F0F0F0"/>
+      </w:pPr>
+      <w:r>
+        <w:rPr>
+          <w:rFonts w:ascii="Courier New" w:hAnsi="Courier New"/>
+          <w:color w:val="1A1A1A"/>
+          <w:sz w:val="19"/>
+        </w:rPr>
+        <w:t xml:space="preserve">    x    :: Vector{Float64}</w:t>
+      </w:r>
+    </w:p>
+    <w:p>
+      <w:pPr>
+        <w:ind w:left="360"/>
+        <w:shd w:fill="F0F0F0"/>
+      </w:pPr>
+      <w:r>
+        <w:rPr>
+          <w:rFonts w:ascii="Courier New" w:hAnsi="Courier New"/>
+          <w:color w:val="1A1A1A"/>
+          <w:sz w:val="19"/>
+        </w:rPr>
+        <w:t xml:space="preserve">    u    :: Vector{Float64}</w:t>
+      </w:r>
+    </w:p>
+    <w:p>
+      <w:pPr>
+        <w:ind w:left="360"/>
+        <w:shd w:fill="F0F0F0"/>
+      </w:pPr>
+      <w:r>
+        <w:rPr>
+          <w:rFonts w:ascii="Courier New" w:hAnsi="Courier New"/>
+          <w:color w:val="1A1A1A"/>
+          <w:sz w:val="19"/>
+        </w:rPr>
+        <w:t xml:space="preserve">    t    :: Float64</w:t>
+      </w:r>
+    </w:p>
+    <w:p>
+      <w:pPr>
+        <w:ind w:left="360"/>
+        <w:shd w:fill="F0F0F0"/>
+      </w:pPr>
+      <w:r>
+        <w:rPr>
+          <w:rFonts w:ascii="Courier New" w:hAnsi="Courier New"/>
+          <w:color w:val="1A1A1A"/>
+          <w:sz w:val="19"/>
+        </w:rPr>
+        <w:t>end</w:t>
+      </w:r>
+    </w:p>
+    <w:p>
+      <w:pPr>
+        <w:ind w:left="360"/>
+        <w:shd w:fill="F0F0F0"/>
+      </w:pPr>
+      <w:r>
+        <w:rPr>
+          <w:rFonts w:ascii="Courier New" w:hAnsi="Courier New"/>
+          <w:color w:val="1A1A1A"/>
+          <w:sz w:val="19"/>
+        </w:rPr>
+      </w:r>
+    </w:p>
+    <w:p>
+      <w:pPr>
+        <w:ind w:left="360"/>
+        <w:shd w:fill="F0F0F0"/>
+      </w:pPr>
+      <w:r>
+        <w:rPr>
+          <w:rFonts w:ascii="Courier New" w:hAnsi="Courier New"/>
+          <w:color w:val="1A1A1A"/>
+          <w:sz w:val="19"/>
+        </w:rPr>
+        <w:t>function solve(prob::HeatProblem)</w:t>
+      </w:r>
+    </w:p>
+    <w:p>
+      <w:pPr>
+        <w:ind w:left="360"/>
+        <w:shd w:fill="F0F0F0"/>
+      </w:pPr>
+      <w:r>
+        <w:rPr>
+          <w:rFonts w:ascii="Courier New" w:hAnsi="Courier New"/>
+          <w:color w:val="1A1A1A"/>
+          <w:sz w:val="19"/>
+        </w:rPr>
+        <w:t xml:space="preserve">    g  = prob.grid</w:t>
+      </w:r>
+    </w:p>
+    <w:p>
+      <w:pPr>
+        <w:ind w:left="360"/>
+        <w:shd w:fill="F0F0F0"/>
+      </w:pPr>
+      <w:r>
+        <w:rPr>
+          <w:rFonts w:ascii="Courier New" w:hAnsi="Courier New"/>
+          <w:color w:val="1A1A1A"/>
+          <w:sz w:val="19"/>
+        </w:rPr>
+        <w:t xml:space="preserve">    dt = 0.4 * g.dx^2 / prob.α          # CFL: r = α·dt/dx² ≤ 0.5</w:t>
+      </w:r>
+    </w:p>
+    <w:p>
+      <w:pPr>
+        <w:ind w:left="360"/>
+        <w:shd w:fill="F0F0F0"/>
+      </w:pPr>
+      <w:r>
+        <w:rPr>
+          <w:rFonts w:ascii="Courier New" w:hAnsi="Courier New"/>
+          <w:color w:val="1A1A1A"/>
+          <w:sz w:val="19"/>
+        </w:rPr>
+        <w:t xml:space="preserve">    u  = prob.u0.(g.x)</w:t>
+      </w:r>
+    </w:p>
+    <w:p>
+      <w:pPr>
+        <w:ind w:left="360"/>
+        <w:shd w:fill="F0F0F0"/>
+      </w:pPr>
+      <w:r>
+        <w:rPr>
+          <w:rFonts w:ascii="Courier New" w:hAnsi="Courier New"/>
+          <w:color w:val="1A1A1A"/>
+          <w:sz w:val="19"/>
+        </w:rPr>
+        <w:t xml:space="preserve">    for _ in 1:ceil(Int, prob.T / dt)</w:t>
+      </w:r>
+    </w:p>
+    <w:p>
+      <w:pPr>
+        <w:ind w:left="360"/>
+        <w:shd w:fill="F0F0F0"/>
+      </w:pPr>
+      <w:r>
+        <w:rPr>
+          <w:rFonts w:ascii="Courier New" w:hAnsi="Courier New"/>
+          <w:color w:val="1A1A1A"/>
+          <w:sz w:val="19"/>
+        </w:rPr>
+        <w:t xml:space="preserve">        u[2:end-1] .+= (prob.α * dt / g.dx^2) .*</w:t>
+      </w:r>
+    </w:p>
+    <w:p>
+      <w:pPr>
+        <w:ind w:left="360"/>
+        <w:shd w:fill="F0F0F0"/>
+      </w:pPr>
+      <w:r>
+        <w:rPr>
+          <w:rFonts w:ascii="Courier New" w:hAnsi="Courier New"/>
+          <w:color w:val="1A1A1A"/>
+          <w:sz w:val="19"/>
+        </w:rPr>
+        <w:t xml:space="preserve">            (u[3:end] .- 2 .* u[2:end-1] .+ u[1:end-2])</w:t>
+      </w:r>
+    </w:p>
+    <w:p>
+      <w:pPr>
+        <w:ind w:left="360"/>
+        <w:shd w:fill="F0F0F0"/>
+      </w:pPr>
+      <w:r>
+        <w:rPr>
+          <w:rFonts w:ascii="Courier New" w:hAnsi="Courier New"/>
+          <w:color w:val="1A1A1A"/>
+          <w:sz w:val="19"/>
+        </w:rPr>
+        <w:t xml:space="preserve">    end</w:t>
+      </w:r>
+    </w:p>
+    <w:p>
+      <w:pPr>
+        <w:ind w:left="360"/>
+        <w:shd w:fill="F0F0F0"/>
+      </w:pPr>
+      <w:r>
+        <w:rPr>
+          <w:rFonts w:ascii="Courier New" w:hAnsi="Courier New"/>
+          <w:color w:val="1A1A1A"/>
+          <w:sz w:val="19"/>
+        </w:rPr>
+        <w:t xml:space="preserve">    return Solution1D(prob, g.x, u, prob.T)</w:t>
+      </w:r>
+    </w:p>
+    <w:p>
+      <w:pPr>
+        <w:ind w:left="360"/>
+        <w:shd w:fill="F0F0F0"/>
+      </w:pPr>
+      <w:r>
+        <w:rPr>
+          <w:rFonts w:ascii="Courier New" w:hAnsi="Courier New"/>
+          <w:color w:val="1A1A1A"/>
+          <w:sz w:val="19"/>
+        </w:rPr>
+        <w:t>end</w:t>
+      </w:r>
+    </w:p>
+    <w:p>
+      <w:pPr>
+        <w:ind w:left="360"/>
+        <w:shd w:fill="F0F0F0"/>
+      </w:pPr>
+      <w:r>
+        <w:rPr>
+          <w:rFonts w:ascii="Courier New" w:hAnsi="Courier New"/>
+          <w:color w:val="1A1A1A"/>
+          <w:sz w:val="19"/>
+        </w:rPr>
+      </w:r>
+    </w:p>
+    <w:p>
+      <w:pPr>
+        <w:ind w:left="360"/>
+        <w:shd w:fill="F0F0F0"/>
+      </w:pPr>
+      <w:r>
+        <w:rPr>
+          <w:rFonts w:ascii="Courier New" w:hAnsi="Courier New"/>
+          <w:color w:val="1A1A1A"/>
+          <w:sz w:val="19"/>
+        </w:rPr>
+        <w:t>function solve(prob::WaveProblem)</w:t>
+      </w:r>
+    </w:p>
+    <w:p>
+      <w:pPr>
+        <w:ind w:left="360"/>
+        <w:shd w:fill="F0F0F0"/>
+      </w:pPr>
+      <w:r>
+        <w:rPr>
+          <w:rFonts w:ascii="Courier New" w:hAnsi="Courier New"/>
+          <w:color w:val="1A1A1A"/>
+          <w:sz w:val="19"/>
+        </w:rPr>
+        <w:t xml:space="preserve">    g  = prob.grid</w:t>
+      </w:r>
+    </w:p>
+    <w:p>
+      <w:pPr>
+        <w:ind w:left="360"/>
+        <w:shd w:fill="F0F0F0"/>
+      </w:pPr>
+      <w:r>
+        <w:rPr>
+          <w:rFonts w:ascii="Courier New" w:hAnsi="Courier New"/>
+          <w:color w:val="1A1A1A"/>
+          <w:sz w:val="19"/>
+        </w:rPr>
+        <w:t xml:space="preserve">    dt = g.dx / prob.c                  # CFL = 1 (exact for leap-frog)</w:t>
+      </w:r>
+    </w:p>
+    <w:p>
+      <w:pPr>
+        <w:ind w:left="360"/>
+        <w:shd w:fill="F0F0F0"/>
+      </w:pPr>
+      <w:r>
+        <w:rPr>
+          <w:rFonts w:ascii="Courier New" w:hAnsi="Courier New"/>
+          <w:color w:val="1A1A1A"/>
+          <w:sz w:val="19"/>
+        </w:rPr>
+        <w:t xml:space="preserve">    λ  = (prob.c * dt / g.dx)^2</w:t>
+      </w:r>
+    </w:p>
+    <w:p>
+      <w:pPr>
+        <w:ind w:left="360"/>
+        <w:shd w:fill="F0F0F0"/>
+      </w:pPr>
+      <w:r>
+        <w:rPr>
+          <w:rFonts w:ascii="Courier New" w:hAnsi="Courier New"/>
+          <w:color w:val="1A1A1A"/>
+          <w:sz w:val="19"/>
+        </w:rPr>
+        <w:t xml:space="preserve">    u_prev = prob.u0.(g.x)</w:t>
+      </w:r>
+    </w:p>
+    <w:p>
+      <w:pPr>
+        <w:ind w:left="360"/>
+        <w:shd w:fill="F0F0F0"/>
+      </w:pPr>
+      <w:r>
+        <w:rPr>
+          <w:rFonts w:ascii="Courier New" w:hAnsi="Courier New"/>
+          <w:color w:val="1A1A1A"/>
+          <w:sz w:val="19"/>
+        </w:rPr>
+        <w:t xml:space="preserve">    u_curr = copy(u_prev); u_next = similar(u_prev)</w:t>
+      </w:r>
+    </w:p>
+    <w:p>
+      <w:pPr>
+        <w:ind w:left="360"/>
+        <w:shd w:fill="F0F0F0"/>
+      </w:pPr>
+      <w:r>
+        <w:rPr>
+          <w:rFonts w:ascii="Courier New" w:hAnsi="Courier New"/>
+          <w:color w:val="1A1A1A"/>
+          <w:sz w:val="19"/>
+        </w:rPr>
+        <w:t xml:space="preserve">    for _ in 1:ceil(Int, prob.T / dt)</w:t>
+      </w:r>
+    </w:p>
+    <w:p>
+      <w:pPr>
+        <w:ind w:left="360"/>
+        <w:shd w:fill="F0F0F0"/>
+      </w:pPr>
+      <w:r>
+        <w:rPr>
+          <w:rFonts w:ascii="Courier New" w:hAnsi="Courier New"/>
+          <w:color w:val="1A1A1A"/>
+          <w:sz w:val="19"/>
+        </w:rPr>
+        <w:t xml:space="preserve">        u_next[2:end-1] .= 2 .* u_curr[2:end-1] .- u_prev[2:end-1] .+</w:t>
+      </w:r>
+    </w:p>
+    <w:p>
+      <w:pPr>
+        <w:ind w:left="360"/>
+        <w:shd w:fill="F0F0F0"/>
+      </w:pPr>
+      <w:r>
+        <w:rPr>
+          <w:rFonts w:ascii="Courier New" w:hAnsi="Courier New"/>
+          <w:color w:val="1A1A1A"/>
+          <w:sz w:val="19"/>
+        </w:rPr>
+        <w:t xml:space="preserve">            λ .* (u_curr[3:end] .- 2 .* u_curr[2:end-1] .+ u_curr[1:end-2])</w:t>
+      </w:r>
+    </w:p>
+    <w:p>
+      <w:pPr>
+        <w:ind w:left="360"/>
+        <w:shd w:fill="F0F0F0"/>
+      </w:pPr>
+      <w:r>
+        <w:rPr>
+          <w:rFonts w:ascii="Courier New" w:hAnsi="Courier New"/>
+          <w:color w:val="1A1A1A"/>
+          <w:sz w:val="19"/>
+        </w:rPr>
+        <w:t xml:space="preserve">        u_next[[1,end]] .= 0.0          # Dirichlet BCs</w:t>
+      </w:r>
+    </w:p>
+    <w:p>
+      <w:pPr>
+        <w:ind w:left="360"/>
+        <w:shd w:fill="F0F0F0"/>
+      </w:pPr>
+      <w:r>
+        <w:rPr>
+          <w:rFonts w:ascii="Courier New" w:hAnsi="Courier New"/>
+          <w:color w:val="1A1A1A"/>
+          <w:sz w:val="19"/>
+        </w:rPr>
+        <w:t xml:space="preserve">        u_prev, u_curr, u_next = u_curr, u_next, u_prev</w:t>
+      </w:r>
+    </w:p>
+    <w:p>
+      <w:pPr>
+        <w:ind w:left="360"/>
+        <w:shd w:fill="F0F0F0"/>
+      </w:pPr>
+      <w:r>
+        <w:rPr>
+          <w:rFonts w:ascii="Courier New" w:hAnsi="Courier New"/>
+          <w:color w:val="1A1A1A"/>
+          <w:sz w:val="19"/>
+        </w:rPr>
+        <w:t xml:space="preserve">    end</w:t>
+      </w:r>
+    </w:p>
+    <w:p>
+      <w:pPr>
+        <w:ind w:left="360"/>
+        <w:shd w:fill="F0F0F0"/>
+      </w:pPr>
+      <w:r>
+        <w:rPr>
+          <w:rFonts w:ascii="Courier New" w:hAnsi="Courier New"/>
+          <w:color w:val="1A1A1A"/>
+          <w:sz w:val="19"/>
+        </w:rPr>
+        <w:t xml:space="preserve">    return Solution1D(prob, g.x, u_curr, prob.T)</w:t>
+      </w:r>
+    </w:p>
+    <w:p>
+      <w:pPr>
+        <w:ind w:left="360"/>
+        <w:shd w:fill="F0F0F0"/>
+      </w:pPr>
+      <w:r>
+        <w:rPr>
+          <w:rFonts w:ascii="Courier New" w:hAnsi="Courier New"/>
+          <w:color w:val="1A1A1A"/>
+          <w:sz w:val="19"/>
+        </w:rPr>
+        <w:t>end</w:t>
+      </w:r>
+    </w:p>
+    <w:p>
+      <w:pPr>
+        <w:pStyle w:val="Heading2"/>
+      </w:pPr>
+      <w:r>
+        <w:rPr>
+          <w:rFonts w:ascii="Arial" w:hAnsi="Arial"/>
+          <w:b/>
+          <w:color w:val="2E75B6"/>
+          <w:sz w:val="28"/>
+        </w:rPr>
+        <w:t>6.5  Plot Dispatch in the Project Style</w:t>
+      </w:r>
+    </w:p>
+    <w:p>
+      <w:r>
+        <w:rPr>
+          <w:rFonts w:ascii="Arial" w:hAnsi="Arial"/>
+          <w:b w:val="0"/>
+          <w:i w:val="0"/>
+          <w:sz w:val="22"/>
+        </w:rPr>
+        <w:t>Extending Plots.plot for your own types uses the same dispatch. Import the function first so you add a method to the existing generic rather than shadow it. The kwargs... passthrough lets callers override any keyword — color, linestyle, legend — without touching the defaults:</w:t>
+      </w:r>
+    </w:p>
+    <w:p>
+      <w:pPr>
+        <w:ind w:left="360"/>
+        <w:shd w:fill="F0F0F0"/>
+      </w:pPr>
+      <w:r>
+        <w:rPr>
+          <w:rFonts w:ascii="Courier New" w:hAnsi="Courier New"/>
+          <w:color w:val="1A1A1A"/>
+          <w:sz w:val="19"/>
+        </w:rPr>
+        <w:t># src/visualization.jl</w:t>
+      </w:r>
+    </w:p>
+    <w:p>
+      <w:pPr>
+        <w:ind w:left="360"/>
+        <w:shd w:fill="F0F0F0"/>
+      </w:pPr>
+      <w:r>
+        <w:rPr>
+          <w:rFonts w:ascii="Courier New" w:hAnsi="Courier New"/>
+          <w:color w:val="1A1A1A"/>
+          <w:sz w:val="19"/>
+        </w:rPr>
+        <w:t>import Plots: plot</w:t>
+      </w:r>
+    </w:p>
+    <w:p>
+      <w:pPr>
+        <w:ind w:left="360"/>
+        <w:shd w:fill="F0F0F0"/>
+      </w:pPr>
+      <w:r>
+        <w:rPr>
+          <w:rFonts w:ascii="Courier New" w:hAnsi="Courier New"/>
+          <w:color w:val="1A1A1A"/>
+          <w:sz w:val="19"/>
+        </w:rPr>
+      </w:r>
+    </w:p>
+    <w:p>
+      <w:pPr>
+        <w:ind w:left="360"/>
+        <w:shd w:fill="F0F0F0"/>
+      </w:pPr>
+      <w:r>
+        <w:rPr>
+          <w:rFonts w:ascii="Courier New" w:hAnsi="Courier New"/>
+          <w:color w:val="1A1A1A"/>
+          <w:sz w:val="19"/>
+        </w:rPr>
+        <w:t>function plot(sol::Solution1D{HeatProblem}; kwargs...)</w:t>
+      </w:r>
+    </w:p>
+    <w:p>
+      <w:pPr>
+        <w:ind w:left="360"/>
+        <w:shd w:fill="F0F0F0"/>
+      </w:pPr>
+      <w:r>
+        <w:rPr>
+          <w:rFonts w:ascii="Courier New" w:hAnsi="Courier New"/>
+          <w:color w:val="1A1A1A"/>
+          <w:sz w:val="19"/>
+        </w:rPr>
+        <w:t xml:space="preserve">    plot(sol.x, sol.u;</w:t>
+      </w:r>
+    </w:p>
+    <w:p>
+      <w:pPr>
+        <w:ind w:left="360"/>
+        <w:shd w:fill="F0F0F0"/>
+      </w:pPr>
+      <w:r>
+        <w:rPr>
+          <w:rFonts w:ascii="Courier New" w:hAnsi="Courier New"/>
+          <w:color w:val="1A1A1A"/>
+          <w:sz w:val="19"/>
+        </w:rPr>
+        <w:t xml:space="preserve">        xlabel = "x",</w:t>
+      </w:r>
+    </w:p>
+    <w:p>
+      <w:pPr>
+        <w:ind w:left="360"/>
+        <w:shd w:fill="F0F0F0"/>
+      </w:pPr>
+      <w:r>
+        <w:rPr>
+          <w:rFonts w:ascii="Courier New" w:hAnsi="Courier New"/>
+          <w:color w:val="1A1A1A"/>
+          <w:sz w:val="19"/>
+        </w:rPr>
+        <w:t xml:space="preserve">        ylabel = "u(x,t)",</w:t>
+      </w:r>
+    </w:p>
+    <w:p>
+      <w:pPr>
+        <w:ind w:left="360"/>
+        <w:shd w:fill="F0F0F0"/>
+      </w:pPr>
+      <w:r>
+        <w:rPr>
+          <w:rFonts w:ascii="Courier New" w:hAnsi="Courier New"/>
+          <w:color w:val="1A1A1A"/>
+          <w:sz w:val="19"/>
+        </w:rPr>
+        <w:t xml:space="preserve">        title  = "Heat equation  α=$(sol.prob.α)  t=$(sol.t)",</w:t>
+      </w:r>
+    </w:p>
+    <w:p>
+      <w:pPr>
+        <w:ind w:left="360"/>
+        <w:shd w:fill="F0F0F0"/>
+      </w:pPr>
+      <w:r>
+        <w:rPr>
+          <w:rFonts w:ascii="Courier New" w:hAnsi="Courier New"/>
+          <w:color w:val="1A1A1A"/>
+          <w:sz w:val="19"/>
+        </w:rPr>
+        <w:t xml:space="preserve">        lw     = 2,</w:t>
+      </w:r>
+    </w:p>
+    <w:p>
+      <w:pPr>
+        <w:ind w:left="360"/>
+        <w:shd w:fill="F0F0F0"/>
+      </w:pPr>
+      <w:r>
+        <w:rPr>
+          <w:rFonts w:ascii="Courier New" w:hAnsi="Courier New"/>
+          <w:color w:val="1A1A1A"/>
+          <w:sz w:val="19"/>
+        </w:rPr>
+        <w:t xml:space="preserve">        label  = "Numerical",</w:t>
+      </w:r>
+    </w:p>
+    <w:p>
+      <w:pPr>
+        <w:ind w:left="360"/>
+        <w:shd w:fill="F0F0F0"/>
+      </w:pPr>
+      <w:r>
+        <w:rPr>
+          <w:rFonts w:ascii="Courier New" w:hAnsi="Courier New"/>
+          <w:color w:val="1A1A1A"/>
+          <w:sz w:val="19"/>
+        </w:rPr>
+        <w:t xml:space="preserve">        kwargs...)</w:t>
+      </w:r>
+    </w:p>
+    <w:p>
+      <w:pPr>
+        <w:ind w:left="360"/>
+        <w:shd w:fill="F0F0F0"/>
+      </w:pPr>
+      <w:r>
+        <w:rPr>
+          <w:rFonts w:ascii="Courier New" w:hAnsi="Courier New"/>
+          <w:color w:val="1A1A1A"/>
+          <w:sz w:val="19"/>
+        </w:rPr>
+        <w:t>end</w:t>
+      </w:r>
+    </w:p>
+    <w:p>
+      <w:pPr>
+        <w:ind w:left="360"/>
+        <w:shd w:fill="F0F0F0"/>
+      </w:pPr>
+      <w:r>
+        <w:rPr>
+          <w:rFonts w:ascii="Courier New" w:hAnsi="Courier New"/>
+          <w:color w:val="1A1A1A"/>
+          <w:sz w:val="19"/>
+        </w:rPr>
+      </w:r>
+    </w:p>
+    <w:p>
+      <w:pPr>
+        <w:ind w:left="360"/>
+        <w:shd w:fill="F0F0F0"/>
+      </w:pPr>
+      <w:r>
+        <w:rPr>
+          <w:rFonts w:ascii="Courier New" w:hAnsi="Courier New"/>
+          <w:color w:val="1A1A1A"/>
+          <w:sz w:val="19"/>
+        </w:rPr>
+        <w:t>function plot(sol::Solution1D{WaveProblem}; kwargs...)</w:t>
+      </w:r>
+    </w:p>
+    <w:p>
+      <w:pPr>
+        <w:ind w:left="360"/>
+        <w:shd w:fill="F0F0F0"/>
+      </w:pPr>
+      <w:r>
+        <w:rPr>
+          <w:rFonts w:ascii="Courier New" w:hAnsi="Courier New"/>
+          <w:color w:val="1A1A1A"/>
+          <w:sz w:val="19"/>
+        </w:rPr>
+        <w:t xml:space="preserve">    plot(sol.x, sol.u;</w:t>
+      </w:r>
+    </w:p>
+    <w:p>
+      <w:pPr>
+        <w:ind w:left="360"/>
+        <w:shd w:fill="F0F0F0"/>
+      </w:pPr>
+      <w:r>
+        <w:rPr>
+          <w:rFonts w:ascii="Courier New" w:hAnsi="Courier New"/>
+          <w:color w:val="1A1A1A"/>
+          <w:sz w:val="19"/>
+        </w:rPr>
+        <w:t xml:space="preserve">        xlabel = "x",</w:t>
+      </w:r>
+    </w:p>
+    <w:p>
+      <w:pPr>
+        <w:ind w:left="360"/>
+        <w:shd w:fill="F0F0F0"/>
+      </w:pPr>
+      <w:r>
+        <w:rPr>
+          <w:rFonts w:ascii="Courier New" w:hAnsi="Courier New"/>
+          <w:color w:val="1A1A1A"/>
+          <w:sz w:val="19"/>
+        </w:rPr>
+        <w:t xml:space="preserve">        ylabel = "u(x,t)",</w:t>
+      </w:r>
+    </w:p>
+    <w:p>
+      <w:pPr>
+        <w:ind w:left="360"/>
+        <w:shd w:fill="F0F0F0"/>
+      </w:pPr>
+      <w:r>
+        <w:rPr>
+          <w:rFonts w:ascii="Courier New" w:hAnsi="Courier New"/>
+          <w:color w:val="1A1A1A"/>
+          <w:sz w:val="19"/>
+        </w:rPr>
+        <w:t xml:space="preserve">        title  = "Wave equation  c=$(sol.prob.c)  t=$(sol.t)",</w:t>
+      </w:r>
+    </w:p>
+    <w:p>
+      <w:pPr>
+        <w:ind w:left="360"/>
+        <w:shd w:fill="F0F0F0"/>
+      </w:pPr>
+      <w:r>
+        <w:rPr>
+          <w:rFonts w:ascii="Courier New" w:hAnsi="Courier New"/>
+          <w:color w:val="1A1A1A"/>
+          <w:sz w:val="19"/>
+        </w:rPr>
+        <w:t xml:space="preserve">        lw     = 2,</w:t>
+      </w:r>
+    </w:p>
+    <w:p>
+      <w:pPr>
+        <w:ind w:left="360"/>
+        <w:shd w:fill="F0F0F0"/>
+      </w:pPr>
+      <w:r>
+        <w:rPr>
+          <w:rFonts w:ascii="Courier New" w:hAnsi="Courier New"/>
+          <w:color w:val="1A1A1A"/>
+          <w:sz w:val="19"/>
+        </w:rPr>
+        <w:t xml:space="preserve">        label  = "Numerical",</w:t>
+      </w:r>
+    </w:p>
+    <w:p>
+      <w:pPr>
+        <w:ind w:left="360"/>
+        <w:shd w:fill="F0F0F0"/>
+      </w:pPr>
+      <w:r>
+        <w:rPr>
+          <w:rFonts w:ascii="Courier New" w:hAnsi="Courier New"/>
+          <w:color w:val="1A1A1A"/>
+          <w:sz w:val="19"/>
+        </w:rPr>
+        <w:t xml:space="preserve">        kwargs...)</w:t>
+      </w:r>
+    </w:p>
+    <w:p>
+      <w:pPr>
+        <w:ind w:left="360"/>
+        <w:shd w:fill="F0F0F0"/>
+      </w:pPr>
+      <w:r>
+        <w:rPr>
+          <w:rFonts w:ascii="Courier New" w:hAnsi="Courier New"/>
+          <w:color w:val="1A1A1A"/>
+          <w:sz w:val="19"/>
+        </w:rPr>
+        <w:t>end</w:t>
+      </w:r>
+    </w:p>
+    <w:p>
+      <w:r>
+        <w:br w:type="page"/>
+      </w:r>
+    </w:p>
+    <w:p>
+      <w:pPr>
+        <w:pStyle w:val="Heading2"/>
+      </w:pPr>
+      <w:r>
+        <w:rPr>
+          <w:rFonts w:ascii="Arial" w:hAnsi="Arial"/>
+          <w:b/>
+          <w:color w:val="2E75B6"/>
+          <w:sz w:val="28"/>
+        </w:rPr>
+        <w:t>6.6  The Full Package Layout</w:t>
+      </w:r>
+    </w:p>
+    <w:p>
+      <w:r>
+        <w:rPr>
+          <w:rFonts w:ascii="Arial" w:hAnsi="Arial"/>
+          <w:b w:val="0"/>
+          <w:i w:val="0"/>
+          <w:sz w:val="22"/>
+        </w:rPr>
+        <w:t>Splitting the four concerns into four files keeps each file under 200 lines and lets you include only the solver files you need. The module entry point is the only file that contains using and export — sub-files just define functions and types:</w:t>
+      </w:r>
+    </w:p>
+    <w:p>
+      <w:pPr>
+        <w:ind w:left="360"/>
+        <w:shd w:fill="F0F0F0"/>
+      </w:pPr>
+      <w:r>
+        <w:rPr>
+          <w:rFonts w:ascii="Courier New" w:hAnsi="Courier New"/>
+          <w:color w:val="1A1A1A"/>
+          <w:sz w:val="19"/>
+        </w:rPr>
+        <w:t>PDESolvers/</w:t>
+      </w:r>
+    </w:p>
+    <w:p>
+      <w:pPr>
+        <w:ind w:left="360"/>
+        <w:shd w:fill="F0F0F0"/>
+      </w:pPr>
+      <w:r>
+        <w:rPr>
+          <w:rFonts w:ascii="Courier New" w:hAnsi="Courier New"/>
+          <w:color w:val="1A1A1A"/>
+          <w:sz w:val="19"/>
+        </w:rPr>
+        <w:t>├── Project.toml</w:t>
+      </w:r>
+    </w:p>
+    <w:p>
+      <w:pPr>
+        <w:ind w:left="360"/>
+        <w:shd w:fill="F0F0F0"/>
+      </w:pPr>
+      <w:r>
+        <w:rPr>
+          <w:rFonts w:ascii="Courier New" w:hAnsi="Courier New"/>
+          <w:color w:val="1A1A1A"/>
+          <w:sz w:val="19"/>
+        </w:rPr>
+        <w:t>└── src/</w:t>
+      </w:r>
+    </w:p>
+    <w:p>
+      <w:pPr>
+        <w:ind w:left="360"/>
+        <w:shd w:fill="F0F0F0"/>
+      </w:pPr>
+      <w:r>
+        <w:rPr>
+          <w:rFonts w:ascii="Courier New" w:hAnsi="Courier New"/>
+          <w:color w:val="1A1A1A"/>
+          <w:sz w:val="19"/>
+        </w:rPr>
+        <w:t xml:space="preserve">    ├── PDESolvers.jl      # module entry — using, include, export</w:t>
+      </w:r>
+    </w:p>
+    <w:p>
+      <w:pPr>
+        <w:ind w:left="360"/>
+        <w:shd w:fill="F0F0F0"/>
+      </w:pPr>
+      <w:r>
+        <w:rPr>
+          <w:rFonts w:ascii="Courier New" w:hAnsi="Courier New"/>
+          <w:color w:val="1A1A1A"/>
+          <w:sz w:val="19"/>
+        </w:rPr>
+        <w:t xml:space="preserve">    ├── grids.jl           # Grid1D</w:t>
+      </w:r>
+    </w:p>
+    <w:p>
+      <w:pPr>
+        <w:ind w:left="360"/>
+        <w:shd w:fill="F0F0F0"/>
+      </w:pPr>
+      <w:r>
+        <w:rPr>
+          <w:rFonts w:ascii="Courier New" w:hAnsi="Courier New"/>
+          <w:color w:val="1A1A1A"/>
+          <w:sz w:val="19"/>
+        </w:rPr>
+        <w:t xml:space="preserve">    ├── problems.jl        # HeatProblem, WaveProblem</w:t>
+      </w:r>
+    </w:p>
+    <w:p>
+      <w:pPr>
+        <w:ind w:left="360"/>
+        <w:shd w:fill="F0F0F0"/>
+      </w:pPr>
+      <w:r>
+        <w:rPr>
+          <w:rFonts w:ascii="Courier New" w:hAnsi="Courier New"/>
+          <w:color w:val="1A1A1A"/>
+          <w:sz w:val="19"/>
+        </w:rPr>
+        <w:t xml:space="preserve">    ├── solvers.jl         # solve(::HeatProblem), solve(::WaveProblem)</w:t>
+      </w:r>
+    </w:p>
+    <w:p>
+      <w:pPr>
+        <w:ind w:left="360"/>
+        <w:shd w:fill="F0F0F0"/>
+      </w:pPr>
+      <w:r>
+        <w:rPr>
+          <w:rFonts w:ascii="Courier New" w:hAnsi="Courier New"/>
+          <w:color w:val="1A1A1A"/>
+          <w:sz w:val="19"/>
+        </w:rPr>
+        <w:t xml:space="preserve">    └── visualization.jl   # plot(::Solution1D{P})</w:t>
+      </w:r>
+    </w:p>
+    <w:p>
+      <w:pPr>
+        <w:ind w:left="360"/>
+        <w:shd w:fill="F0F0F0"/>
+      </w:pPr>
+      <w:r>
+        <w:rPr>
+          <w:rFonts w:ascii="Courier New" w:hAnsi="Courier New"/>
+          <w:color w:val="1A1A1A"/>
+          <w:sz w:val="19"/>
+        </w:rPr>
+        <w:t># src/PDESolvers.jl</w:t>
+      </w:r>
+    </w:p>
+    <w:p>
+      <w:pPr>
+        <w:ind w:left="360"/>
+        <w:shd w:fill="F0F0F0"/>
+      </w:pPr>
+      <w:r>
+        <w:rPr>
+          <w:rFonts w:ascii="Courier New" w:hAnsi="Courier New"/>
+          <w:color w:val="1A1A1A"/>
+          <w:sz w:val="19"/>
+        </w:rPr>
+        <w:t>module PDESolvers</w:t>
+      </w:r>
+    </w:p>
+    <w:p>
+      <w:pPr>
+        <w:ind w:left="360"/>
+        <w:shd w:fill="F0F0F0"/>
+      </w:pPr>
+      <w:r>
+        <w:rPr>
+          <w:rFonts w:ascii="Courier New" w:hAnsi="Courier New"/>
+          <w:color w:val="1A1A1A"/>
+          <w:sz w:val="19"/>
+        </w:rPr>
+      </w:r>
+    </w:p>
+    <w:p>
+      <w:pPr>
+        <w:ind w:left="360"/>
+        <w:shd w:fill="F0F0F0"/>
+      </w:pPr>
+      <w:r>
+        <w:rPr>
+          <w:rFonts w:ascii="Courier New" w:hAnsi="Courier New"/>
+          <w:color w:val="1A1A1A"/>
+          <w:sz w:val="19"/>
+        </w:rPr>
+        <w:t>using Plots</w:t>
+      </w:r>
+    </w:p>
+    <w:p>
+      <w:pPr>
+        <w:ind w:left="360"/>
+        <w:shd w:fill="F0F0F0"/>
+      </w:pPr>
+      <w:r>
+        <w:rPr>
+          <w:rFonts w:ascii="Courier New" w:hAnsi="Courier New"/>
+          <w:color w:val="1A1A1A"/>
+          <w:sz w:val="19"/>
+        </w:rPr>
+      </w:r>
+    </w:p>
+    <w:p>
+      <w:pPr>
+        <w:ind w:left="360"/>
+        <w:shd w:fill="F0F0F0"/>
+      </w:pPr>
+      <w:r>
+        <w:rPr>
+          <w:rFonts w:ascii="Courier New" w:hAnsi="Courier New"/>
+          <w:color w:val="1A1A1A"/>
+          <w:sz w:val="19"/>
+        </w:rPr>
+        <w:t>include("grids.jl")</w:t>
+      </w:r>
+    </w:p>
+    <w:p>
+      <w:pPr>
+        <w:ind w:left="360"/>
+        <w:shd w:fill="F0F0F0"/>
+      </w:pPr>
+      <w:r>
+        <w:rPr>
+          <w:rFonts w:ascii="Courier New" w:hAnsi="Courier New"/>
+          <w:color w:val="1A1A1A"/>
+          <w:sz w:val="19"/>
+        </w:rPr>
+        <w:t>include("problems.jl")</w:t>
+      </w:r>
+    </w:p>
+    <w:p>
+      <w:pPr>
+        <w:ind w:left="360"/>
+        <w:shd w:fill="F0F0F0"/>
+      </w:pPr>
+      <w:r>
+        <w:rPr>
+          <w:rFonts w:ascii="Courier New" w:hAnsi="Courier New"/>
+          <w:color w:val="1A1A1A"/>
+          <w:sz w:val="19"/>
+        </w:rPr>
+        <w:t>include("solvers.jl")</w:t>
+      </w:r>
+    </w:p>
+    <w:p>
+      <w:pPr>
+        <w:ind w:left="360"/>
+        <w:shd w:fill="F0F0F0"/>
+      </w:pPr>
+      <w:r>
+        <w:rPr>
+          <w:rFonts w:ascii="Courier New" w:hAnsi="Courier New"/>
+          <w:color w:val="1A1A1A"/>
+          <w:sz w:val="19"/>
+        </w:rPr>
+        <w:t>include("visualization.jl")</w:t>
+      </w:r>
+    </w:p>
+    <w:p>
+      <w:pPr>
+        <w:ind w:left="360"/>
+        <w:shd w:fill="F0F0F0"/>
+      </w:pPr>
+      <w:r>
+        <w:rPr>
+          <w:rFonts w:ascii="Courier New" w:hAnsi="Courier New"/>
+          <w:color w:val="1A1A1A"/>
+          <w:sz w:val="19"/>
+        </w:rPr>
+      </w:r>
+    </w:p>
+    <w:p>
+      <w:pPr>
+        <w:ind w:left="360"/>
+        <w:shd w:fill="F0F0F0"/>
+      </w:pPr>
+      <w:r>
+        <w:rPr>
+          <w:rFonts w:ascii="Courier New" w:hAnsi="Courier New"/>
+          <w:color w:val="1A1A1A"/>
+          <w:sz w:val="19"/>
+        </w:rPr>
+        <w:t>export Grid1D, HeatProblem, WaveProblem, Solution1D, solve</w:t>
+      </w:r>
+    </w:p>
+    <w:p>
+      <w:pPr>
+        <w:ind w:left="360"/>
+        <w:shd w:fill="F0F0F0"/>
+      </w:pPr>
+      <w:r>
+        <w:rPr>
+          <w:rFonts w:ascii="Courier New" w:hAnsi="Courier New"/>
+          <w:color w:val="1A1A1A"/>
+          <w:sz w:val="19"/>
+        </w:rPr>
+      </w:r>
+    </w:p>
+    <w:p>
+      <w:pPr>
+        <w:ind w:left="360"/>
+        <w:shd w:fill="F0F0F0"/>
+      </w:pPr>
+      <w:r>
+        <w:rPr>
+          <w:rFonts w:ascii="Courier New" w:hAnsi="Courier New"/>
+          <w:color w:val="1A1A1A"/>
+          <w:sz w:val="19"/>
+        </w:rPr>
+        <w:t>end # module PDESolvers</w:t>
+      </w:r>
+    </w:p>
+    <w:p>
+      <w:pPr>
+        <w:pStyle w:val="Heading2"/>
+      </w:pPr>
+      <w:r>
+        <w:rPr>
+          <w:rFonts w:ascii="Arial" w:hAnsi="Arial"/>
+          <w:b/>
+          <w:color w:val="2E75B6"/>
+          <w:sz w:val="28"/>
+        </w:rPr>
+        <w:t>6.7  Calling the Package</w:t>
+      </w:r>
+    </w:p>
+    <w:p>
+      <w:r>
+        <w:rPr>
+          <w:rFonts w:ascii="Arial" w:hAnsi="Arial"/>
+          <w:b w:val="0"/>
+          <w:i w:val="0"/>
+          <w:sz w:val="22"/>
+        </w:rPr>
+        <w:t>With the types and dispatch in place, switching between physics models is a one-word change at the call site — the grid, the plot call, and the output pipeline stay identical. This is the payoff of the three-type architecture:</w:t>
+      </w:r>
+    </w:p>
+    <w:p>
+      <w:pPr>
+        <w:ind w:left="360"/>
+        <w:shd w:fill="F0F0F0"/>
+      </w:pPr>
+      <w:r>
+        <w:rPr>
+          <w:rFonts w:ascii="Courier New" w:hAnsi="Courier New"/>
+          <w:color w:val="1A1A1A"/>
+          <w:sz w:val="19"/>
+        </w:rPr>
+        <w:t>using PDESolvers, Plots</w:t>
+      </w:r>
+    </w:p>
+    <w:p>
+      <w:pPr>
+        <w:ind w:left="360"/>
+        <w:shd w:fill="F0F0F0"/>
+      </w:pPr>
+      <w:r>
+        <w:rPr>
+          <w:rFonts w:ascii="Courier New" w:hAnsi="Courier New"/>
+          <w:color w:val="1A1A1A"/>
+          <w:sz w:val="19"/>
+        </w:rPr>
+      </w:r>
+    </w:p>
+    <w:p>
+      <w:pPr>
+        <w:ind w:left="360"/>
+        <w:shd w:fill="F0F0F0"/>
+      </w:pPr>
+      <w:r>
+        <w:rPr>
+          <w:rFonts w:ascii="Courier New" w:hAnsi="Courier New"/>
+          <w:color w:val="1A1A1A"/>
+          <w:sz w:val="19"/>
+        </w:rPr>
+        <w:t># -- Heat: 400-point grid, low diffusivity, run to T=0.5 --</w:t>
+      </w:r>
+    </w:p>
+    <w:p>
+      <w:pPr>
+        <w:ind w:left="360"/>
+        <w:shd w:fill="F0F0F0"/>
+      </w:pPr>
+      <w:r>
+        <w:rPr>
+          <w:rFonts w:ascii="Courier New" w:hAnsi="Courier New"/>
+          <w:color w:val="1A1A1A"/>
+          <w:sz w:val="19"/>
+        </w:rPr>
+        <w:t>grid  = Grid1D(n=400, L=2.0)</w:t>
+      </w:r>
+    </w:p>
+    <w:p>
+      <w:pPr>
+        <w:ind w:left="360"/>
+        <w:shd w:fill="F0F0F0"/>
+      </w:pPr>
+      <w:r>
+        <w:rPr>
+          <w:rFonts w:ascii="Courier New" w:hAnsi="Courier New"/>
+          <w:color w:val="1A1A1A"/>
+          <w:sz w:val="19"/>
+        </w:rPr>
+        <w:t>hprob = HeatProblem(grid=grid, α=0.005, T=0.5)</w:t>
+      </w:r>
+    </w:p>
+    <w:p>
+      <w:pPr>
+        <w:ind w:left="360"/>
+        <w:shd w:fill="F0F0F0"/>
+      </w:pPr>
+      <w:r>
+        <w:rPr>
+          <w:rFonts w:ascii="Courier New" w:hAnsi="Courier New"/>
+          <w:color w:val="1A1A1A"/>
+          <w:sz w:val="19"/>
+        </w:rPr>
+        <w:t>hsol  = solve(hprob)          # dispatches to HeatProblem method</w:t>
+      </w:r>
+    </w:p>
+    <w:p>
+      <w:pPr>
+        <w:ind w:left="360"/>
+        <w:shd w:fill="F0F0F0"/>
+      </w:pPr>
+      <w:r>
+        <w:rPr>
+          <w:rFonts w:ascii="Courier New" w:hAnsi="Courier New"/>
+          <w:color w:val="1A1A1A"/>
+          <w:sz w:val="19"/>
+        </w:rPr>
+        <w:t>plot(hsol)                    # dispatches to Solution1D{HeatProblem}</w:t>
+      </w:r>
+    </w:p>
+    <w:p>
+      <w:pPr>
+        <w:ind w:left="360"/>
+        <w:shd w:fill="F0F0F0"/>
+      </w:pPr>
+      <w:r>
+        <w:rPr>
+          <w:rFonts w:ascii="Courier New" w:hAnsi="Courier New"/>
+          <w:color w:val="1A1A1A"/>
+          <w:sz w:val="19"/>
+        </w:rPr>
+        <w:t>savefig("heat_solution.png")</w:t>
+      </w:r>
+    </w:p>
+    <w:p>
+      <w:pPr>
+        <w:ind w:left="360"/>
+        <w:shd w:fill="F0F0F0"/>
+      </w:pPr>
+      <w:r>
+        <w:rPr>
+          <w:rFonts w:ascii="Courier New" w:hAnsi="Courier New"/>
+          <w:color w:val="1A1A1A"/>
+          <w:sz w:val="19"/>
+        </w:rPr>
+      </w:r>
+    </w:p>
+    <w:p>
+      <w:pPr>
+        <w:ind w:left="360"/>
+        <w:shd w:fill="F0F0F0"/>
+      </w:pPr>
+      <w:r>
+        <w:rPr>
+          <w:rFonts w:ascii="Courier New" w:hAnsi="Courier New"/>
+          <w:color w:val="1A1A1A"/>
+          <w:sz w:val="19"/>
+        </w:rPr>
+        <w:t># -- Wave: same grid, different physics, identical API --</w:t>
+      </w:r>
+    </w:p>
+    <w:p>
+      <w:pPr>
+        <w:ind w:left="360"/>
+        <w:shd w:fill="F0F0F0"/>
+      </w:pPr>
+      <w:r>
+        <w:rPr>
+          <w:rFonts w:ascii="Courier New" w:hAnsi="Courier New"/>
+          <w:color w:val="1A1A1A"/>
+          <w:sz w:val="19"/>
+        </w:rPr>
+        <w:t>wprob = WaveProblem(grid=grid, c=1.5, T=2.0)</w:t>
+      </w:r>
+    </w:p>
+    <w:p>
+      <w:pPr>
+        <w:ind w:left="360"/>
+        <w:shd w:fill="F0F0F0"/>
+      </w:pPr>
+      <w:r>
+        <w:rPr>
+          <w:rFonts w:ascii="Courier New" w:hAnsi="Courier New"/>
+          <w:color w:val="1A1A1A"/>
+          <w:sz w:val="19"/>
+        </w:rPr>
+        <w:t>wsol  = solve(wprob)          # dispatches to WaveProblem method</w:t>
+      </w:r>
+    </w:p>
+    <w:p>
+      <w:pPr>
+        <w:ind w:left="360"/>
+        <w:shd w:fill="F0F0F0"/>
+      </w:pPr>
+      <w:r>
+        <w:rPr>
+          <w:rFonts w:ascii="Courier New" w:hAnsi="Courier New"/>
+          <w:color w:val="1A1A1A"/>
+          <w:sz w:val="19"/>
+        </w:rPr>
+        <w:t>plot(wsol)                    # dispatches to Solution1D{WaveProblem}</w:t>
+      </w:r>
+    </w:p>
+    <w:p>
+      <w:pPr>
+        <w:ind w:left="360"/>
+        <w:shd w:fill="F0F0F0"/>
+      </w:pPr>
+      <w:r>
+        <w:rPr>
+          <w:rFonts w:ascii="Courier New" w:hAnsi="Courier New"/>
+          <w:color w:val="1A1A1A"/>
+          <w:sz w:val="19"/>
+        </w:rPr>
+        <w:t>savefig("wave_solution.png")</w:t>
+      </w:r>
+    </w:p>
+    <w:p>
+      <w:pPr>
+        <w:pStyle w:val="Heading2"/>
+      </w:pPr>
+      <w:r>
+        <w:rPr>
+          <w:rFonts w:ascii="Arial" w:hAnsi="Arial"/>
+          <w:b/>
+          <w:color w:val="2E75B6"/>
+          <w:sz w:val="28"/>
+        </w:rPr>
+        <w:t>6.8  Generalizing to Coupled Multi-Field Systems</w:t>
+      </w:r>
+    </w:p>
+    <w:p>
+      <w:r>
+        <w:rPr>
+          <w:rFonts w:ascii="Arial" w:hAnsi="Arial"/>
+          <w:b w:val="0"/>
+          <w:i w:val="0"/>
+          <w:sz w:val="22"/>
+        </w:rPr>
+        <w:t>Every problem so far — HeatProblem, WaveProblem — advances ONE scalar field. Many real models need two (or more) fields that feed into each other every time step: two temperatures exchanging heat, predator/prey populations diffusing and interacting, or the ψ (streamfunction) / ω (vorticity) pair in the Navier-Stokes solver you already saw in Step 7. What changes when a problem has more than one field?</w:t>
+      </w:r>
+    </w:p>
+    <w:p>
+      <w:r>
+        <w:rPr>
+          <w:rFonts w:ascii="Arial" w:hAnsi="Arial"/>
+          <w:b w:val="0"/>
+          <w:i w:val="0"/>
+          <w:sz w:val="22"/>
+        </w:rPr>
+        <w:t>What changes: stack both fields into ONE vector and solve ONE sparse linear system per time step, instead of looping two independent solves. For two coupled heat fields ∂u/∂t = α₁∇²u − κ(u−v) and ∂v/∂t = α₂∇²v − κ(v−u), the unknown becomes w = [u; v] and backward Euler gives a single block matrix:</w:t>
+      </w:r>
+    </w:p>
+    <w:p>
+      <w:pPr>
+        <w:ind w:left="360"/>
+        <w:shd w:fill="F0F0F0"/>
+      </w:pPr>
+      <w:r>
+        <w:rPr>
+          <w:rFonts w:ascii="Courier New" w:hAnsi="Courier New"/>
+          <w:color w:val="1A1A1A"/>
+          <w:sz w:val="19"/>
+        </w:rPr>
+        <w:t>#   [ I + dt(α₁·Lap + κI)      −dt·κ·I          ] [uⁿ⁺¹]   [uⁿ]</w:t>
+      </w:r>
+    </w:p>
+    <w:p>
+      <w:pPr>
+        <w:ind w:left="360"/>
+        <w:shd w:fill="F0F0F0"/>
+      </w:pPr>
+      <w:r>
+        <w:rPr>
+          <w:rFonts w:ascii="Courier New" w:hAnsi="Courier New"/>
+          <w:color w:val="1A1A1A"/>
+          <w:sz w:val="19"/>
+        </w:rPr>
+        <w:t>#   [      −dt·κ·I          I + dt(α₂·Lap + κI) ] [vⁿ⁺¹] = [vⁿ]</w:t>
+      </w:r>
+    </w:p>
+    <w:p>
+      <w:pPr>
+        <w:ind w:left="360"/>
+        <w:shd w:fill="F0F0F0"/>
+      </w:pPr>
+      <w:r>
+        <w:rPr>
+          <w:rFonts w:ascii="Courier New" w:hAnsi="Courier New"/>
+          <w:color w:val="1A1A1A"/>
+          <w:sz w:val="19"/>
+        </w:rPr>
+        <w:t>#</w:t>
+      </w:r>
+    </w:p>
+    <w:p>
+      <w:pPr>
+        <w:ind w:left="360"/>
+        <w:shd w:fill="F0F0F0"/>
+      </w:pPr>
+      <w:r>
+        <w:rPr>
+          <w:rFonts w:ascii="Courier New" w:hAnsi="Courier New"/>
+          <w:color w:val="1A1A1A"/>
+          <w:sz w:val="19"/>
+        </w:rPr>
+        <w:t># src/coupled.jl (juliaPDEs package)</w:t>
+      </w:r>
+    </w:p>
+    <w:p>
+      <w:pPr>
+        <w:ind w:left="360"/>
+        <w:shd w:fill="F0F0F0"/>
+      </w:pPr>
+      <w:r>
+        <w:rPr>
+          <w:rFonts w:ascii="Courier New" w:hAnsi="Courier New"/>
+          <w:color w:val="1A1A1A"/>
+          <w:sz w:val="19"/>
+        </w:rPr>
+        <w:t>Base.@kwdef struct CoupledHeatEquation{N,F1,F2} &lt;: ParabolicProblem</w:t>
+      </w:r>
+    </w:p>
+    <w:p>
+      <w:pPr>
+        <w:ind w:left="360"/>
+        <w:shd w:fill="F0F0F0"/>
+      </w:pPr>
+      <w:r>
+        <w:rPr>
+          <w:rFonts w:ascii="Courier New" w:hAnsi="Courier New"/>
+          <w:color w:val="1A1A1A"/>
+          <w:sz w:val="19"/>
+        </w:rPr>
+        <w:t xml:space="preserve">    grid::Grid{N}</w:t>
+      </w:r>
+    </w:p>
+    <w:p>
+      <w:pPr>
+        <w:ind w:left="360"/>
+        <w:shd w:fill="F0F0F0"/>
+      </w:pPr>
+      <w:r>
+        <w:rPr>
+          <w:rFonts w:ascii="Courier New" w:hAnsi="Courier New"/>
+          <w:color w:val="1A1A1A"/>
+          <w:sz w:val="19"/>
+        </w:rPr>
+        <w:t xml:space="preserve">    α::NTuple{2,Float64} = (0.01, 0.02)   # diffusivity per field</w:t>
+      </w:r>
+    </w:p>
+    <w:p>
+      <w:pPr>
+        <w:ind w:left="360"/>
+        <w:shd w:fill="F0F0F0"/>
+      </w:pPr>
+      <w:r>
+        <w:rPr>
+          <w:rFonts w:ascii="Courier New" w:hAnsi="Courier New"/>
+          <w:color w:val="1A1A1A"/>
+          <w:sz w:val="19"/>
+        </w:rPr>
+        <w:t xml:space="preserve">    κ::Float64           = 0.5            # exchange rate</w:t>
+      </w:r>
+    </w:p>
+    <w:p>
+      <w:pPr>
+        <w:ind w:left="360"/>
+        <w:shd w:fill="F0F0F0"/>
+      </w:pPr>
+      <w:r>
+        <w:rPr>
+          <w:rFonts w:ascii="Courier New" w:hAnsi="Courier New"/>
+          <w:color w:val="1A1A1A"/>
+          <w:sz w:val="19"/>
+        </w:rPr>
+        <w:t xml:space="preserve">    f_init::Tuple{F1,F2}</w:t>
+      </w:r>
+    </w:p>
+    <w:p>
+      <w:pPr>
+        <w:ind w:left="360"/>
+        <w:shd w:fill="F0F0F0"/>
+      </w:pPr>
+      <w:r>
+        <w:rPr>
+          <w:rFonts w:ascii="Courier New" w:hAnsi="Courier New"/>
+          <w:color w:val="1A1A1A"/>
+          <w:sz w:val="19"/>
+        </w:rPr>
+        <w:t xml:space="preserve">    Nt::Int              = 1000</w:t>
+      </w:r>
+    </w:p>
+    <w:p>
+      <w:pPr>
+        <w:ind w:left="360"/>
+        <w:shd w:fill="F0F0F0"/>
+      </w:pPr>
+      <w:r>
+        <w:rPr>
+          <w:rFonts w:ascii="Courier New" w:hAnsi="Courier New"/>
+          <w:color w:val="1A1A1A"/>
+          <w:sz w:val="19"/>
+        </w:rPr>
+        <w:t xml:space="preserve">    T::Float64           = 1.0</w:t>
+      </w:r>
+    </w:p>
+    <w:p>
+      <w:pPr>
+        <w:ind w:left="360"/>
+        <w:shd w:fill="F0F0F0"/>
+      </w:pPr>
+      <w:r>
+        <w:rPr>
+          <w:rFonts w:ascii="Courier New" w:hAnsi="Courier New"/>
+          <w:color w:val="1A1A1A"/>
+          <w:sz w:val="19"/>
+        </w:rPr>
+        <w:t>end</w:t>
+      </w:r>
+    </w:p>
+    <w:p>
+      <w:pPr>
+        <w:ind w:left="360"/>
+        <w:shd w:fill="F0F0F0"/>
+      </w:pPr>
+      <w:r>
+        <w:rPr>
+          <w:rFonts w:ascii="Courier New" w:hAnsi="Courier New"/>
+          <w:color w:val="1A1A1A"/>
+          <w:sz w:val="19"/>
+        </w:rPr>
+      </w:r>
+    </w:p>
+    <w:p>
+      <w:pPr>
+        <w:ind w:left="360"/>
+        <w:shd w:fill="F0F0F0"/>
+      </w:pPr>
+      <w:r>
+        <w:rPr>
+          <w:rFonts w:ascii="Courier New" w:hAnsi="Courier New"/>
+          <w:color w:val="1A1A1A"/>
+          <w:sz w:val="19"/>
+        </w:rPr>
+        <w:t>function solve(p::CoupledHeatEquation{N,F1,F2}) where {N,F1,F2}</w:t>
+      </w:r>
+    </w:p>
+    <w:p>
+      <w:pPr>
+        <w:ind w:left="360"/>
+        <w:shd w:fill="F0F0F0"/>
+      </w:pPr>
+      <w:r>
+        <w:rPr>
+          <w:rFonts w:ascii="Courier New" w:hAnsi="Courier New"/>
+          <w:color w:val="1A1A1A"/>
+          <w:sz w:val="19"/>
+        </w:rPr>
+        <w:t xml:space="preserve">    Lap  = nd_laplacian(d, inner_n)      # same operator PoissonEquation uses</w:t>
+      </w:r>
+    </w:p>
+    <w:p>
+      <w:pPr>
+        <w:ind w:left="360"/>
+        <w:shd w:fill="F0F0F0"/>
+      </w:pPr>
+      <w:r>
+        <w:rPr>
+          <w:rFonts w:ascii="Courier New" w:hAnsi="Courier New"/>
+          <w:color w:val="1A1A1A"/>
+          <w:sz w:val="19"/>
+        </w:rPr>
+        <w:t xml:space="preserve">    Iden = sparse(I, n, n)</w:t>
+      </w:r>
+    </w:p>
+    <w:p>
+      <w:pPr>
+        <w:ind w:left="360"/>
+        <w:shd w:fill="F0F0F0"/>
+      </w:pPr>
+      <w:r>
+        <w:rPr>
+          <w:rFonts w:ascii="Courier New" w:hAnsi="Courier New"/>
+          <w:color w:val="1A1A1A"/>
+          <w:sz w:val="19"/>
+        </w:rPr>
+        <w:t xml:space="preserve">    A11  = Iden + dt * (p.α[1] * Lap + p.κ * Iden)</w:t>
+      </w:r>
+    </w:p>
+    <w:p>
+      <w:pPr>
+        <w:ind w:left="360"/>
+        <w:shd w:fill="F0F0F0"/>
+      </w:pPr>
+      <w:r>
+        <w:rPr>
+          <w:rFonts w:ascii="Courier New" w:hAnsi="Courier New"/>
+          <w:color w:val="1A1A1A"/>
+          <w:sz w:val="19"/>
+        </w:rPr>
+        <w:t xml:space="preserve">    A22  = Iden + dt * (p.α[2] * Lap + p.κ * Iden)</w:t>
+      </w:r>
+    </w:p>
+    <w:p>
+      <w:pPr>
+        <w:ind w:left="360"/>
+        <w:shd w:fill="F0F0F0"/>
+      </w:pPr>
+      <w:r>
+        <w:rPr>
+          <w:rFonts w:ascii="Courier New" w:hAnsi="Courier New"/>
+          <w:color w:val="1A1A1A"/>
+          <w:sz w:val="19"/>
+        </w:rPr>
+        <w:t xml:space="preserve">    Aoff = -dt * p.κ * Iden</w:t>
+      </w:r>
+    </w:p>
+    <w:p>
+      <w:pPr>
+        <w:ind w:left="360"/>
+        <w:shd w:fill="F0F0F0"/>
+      </w:pPr>
+      <w:r>
+        <w:rPr>
+          <w:rFonts w:ascii="Courier New" w:hAnsi="Courier New"/>
+          <w:color w:val="1A1A1A"/>
+          <w:sz w:val="19"/>
+        </w:rPr>
+        <w:t xml:space="preserve">    Afact = lu([A11 Aoff; Aoff A22])      # ONE factorisation, reused every step</w:t>
+      </w:r>
+    </w:p>
+    <w:p>
+      <w:pPr>
+        <w:ind w:left="360"/>
+        <w:shd w:fill="F0F0F0"/>
+      </w:pPr>
+      <w:r>
+        <w:rPr>
+          <w:rFonts w:ascii="Courier New" w:hAnsi="Courier New"/>
+          <w:color w:val="1A1A1A"/>
+          <w:sz w:val="19"/>
+        </w:rPr>
+        <w:t xml:space="preserve">    # … time-step both fields together via Afact \\ [u; v] …</w:t>
+      </w:r>
+    </w:p>
+    <w:p>
+      <w:pPr>
+        <w:ind w:left="360"/>
+        <w:shd w:fill="F0F0F0"/>
+      </w:pPr>
+      <w:r>
+        <w:rPr>
+          <w:rFonts w:ascii="Courier New" w:hAnsi="Courier New"/>
+          <w:color w:val="1A1A1A"/>
+          <w:sz w:val="19"/>
+        </w:rPr>
+        <w:t>end</w:t>
+      </w:r>
+    </w:p>
+    <w:p>
+      <w:r>
+        <w:rPr>
+          <w:rFonts w:ascii="Arial" w:hAnsi="Arial"/>
+          <w:b w:val="0"/>
+          <w:i w:val="0"/>
+          <w:sz w:val="22"/>
+        </w:rPr>
+        <w:t>Why this is necessary: if you instead time-step u and v with two separate independent solves, the coupling term κ(u−v) has to be evaluated using the OLD value of the other field, which is only first-order accurate in the coupling and can become unstable for large κ (stiff exchange). Solving both fields at the same implicit time level, in one system, keeps the scheme unconditionally stable no matter how strong the coupling is — exactly the same reason Step 7's implicit heat solver beats forward Euler.</w:t>
+      </w:r>
+    </w:p>
+    <w:p>
+      <w:r>
+        <w:rPr>
+          <w:rFonts w:ascii="Arial" w:hAnsi="Arial"/>
+          <w:b w:val="0"/>
+          <w:i w:val="0"/>
+          <w:sz w:val="22"/>
+        </w:rPr>
+        <w:t>Benefit: the block-system technique reuses every piece of linear-algebra machinery already in the package — the same nd_laplacian sparse assembly and the same lu / \\ solve used by PoissonEquation and HeatEquation.solve_implicit — it just gets called on a bigger, block-structured matrix. And because CoupledHeatEquation still subtypes ParabolicProblem, it slots into the exact same solve()/plot() dispatch as every other problem type; nothing else in the package needs to know or care that a solution came from two coupled fields instead of one.</w:t>
+      </w:r>
+    </w:p>
+    <w:p>
+      <w:r>
+        <w:rPr>
+          <w:rFonts w:ascii="Arial" w:hAnsi="Arial"/>
+          <w:b w:val="0"/>
+          <w:i w:val="0"/>
+          <w:sz w:val="22"/>
+        </w:rPr>
+        <w:t>Connection to Navier-Stokes: the LidCavityFlow solver from Step 7 already advances two coupled fields, ψ and ω, every time step — but via splitting (an explicit vorticity update, then two separate sparse solves: one lu factorisation for diffusion, another for the streamfunction Poisson equation). That is a perfectly standard and efficient scheme. As an exercise, ask what would change if ψ and ω were instead stacked into one block system like u and v above — you would trade two smaller factorisations for one larger one, gaining the same 'exact at the same time level' coupling this section demonstrates.</w:t>
+      </w:r>
+    </w:p>
+    <w:p>
+      <w:pPr>
+        <w:jc w:val="center"/>
+      </w:pPr>
+      <w:r>
+        <w:drawing>
+          <wp:inline xmlns:a="http://schemas.openxmlformats.org/drawingml/2006/main" xmlns:pic="http://schemas.openxmlformats.org/drawingml/2006/picture">
+            <wp:extent cx="5943600" cy="2427871"/>
+            <wp:docPr id="9" name="Picture 9"/>
+            <wp:cNvGraphicFramePr>
+              <a:graphicFrameLocks noChangeAspect="1"/>
+            </wp:cNvGraphicFramePr>
+            <a:graphic>
+              <a:graphicData uri="http://schemas.openxmlformats.org/drawingml/2006/picture">
+                <pic:pic>
+                  <pic:nvPicPr>
+                    <pic:cNvPr id="0" name="coupled_heat.png"/>
+                    <pic:cNvPicPr/>
+                  </pic:nvPicPr>
+                  <pic:blipFill>
+                    <a:blip r:embed="rId17"/>
+                    <a:stretch>
+                      <a:fillRect/>
+                    </a:stretch>
+                  </pic:blipFill>
+                  <pic:spPr>
+                    <a:xfrm>
+                      <a:off x="0" y="0"/>
+                      <a:ext cx="5943600" cy="2427871"/>
+                    </a:xfrm>
+                    <a:prstGeom prst="rect"/>
+                  </pic:spPr>
+                </pic:pic>
+              </a:graphicData>
+            </a:graphic>
+          </wp:inline>
+        </w:drawing>
+      </w:r>
+    </w:p>
+    <w:p>
+      <w:pPr>
+        <w:jc w:val="center"/>
+      </w:pPr>
+      <w:r>
+        <w:rPr>
+          <w:rFonts w:ascii="Arial" w:hAnsi="Arial"/>
+          <w:b w:val="0"/>
+          <w:i/>
+          <w:color w:val="555555"/>
+          <w:sz w:val="18"/>
+        </w:rPr>
+        <w:t>Figure. Two coupled heat fields (left) starting from separate Gaussian pulses, pulled toward each other by κ while each also diffuses; the coupling residual |u−v| (right) shrinks toward zero.</w:t>
+      </w:r>
+    </w:p>
+    <w:p>
       <w:r>
         <w:br w:type="page"/>
       </w:r>
@@ -6518,7 +9259,7 @@
           <w:color w:val="1F4E79"/>
           <w:sz w:val="36"/>
         </w:rPr>
-        <w:t>Step 7 — Connect to the HPC Cluster</w:t>
+        <w:t>Step 9 — Connect to the HPC Cluster</w:t>
       </w:r>
     </w:p>
     <w:p>
@@ -6660,7 +9401,7 @@
           <w:color w:val="1F4E79"/>
           <w:sz w:val="36"/>
         </w:rPr>
-        <w:t>Step 8 — Submitting Julia PDE Jobs with Slurm</w:t>
+        <w:t>Step 10 — Submitting Julia PDE Jobs with Slurm</w:t>
       </w:r>
     </w:p>
     <w:tbl>
@@ -7268,6 +10009,847 @@
         </w:tc>
       </w:tr>
     </w:tbl>
+    <w:p>
+      <w:r>
+        <w:br w:type="page"/>
+      </w:r>
+    </w:p>
+    <w:p>
+      <w:pPr>
+        <w:pStyle w:val="Heading1"/>
+      </w:pPr>
+      <w:r>
+        <w:rPr>
+          <w:rFonts w:ascii="Arial" w:hAnsi="Arial"/>
+          <w:b/>
+          <w:color w:val="1F4E79"/>
+          <w:sz w:val="36"/>
+        </w:rPr>
+        <w:t>Step 11 — Share Your Code with Git &amp; GitHub</w:t>
+      </w:r>
+    </w:p>
+    <w:p>
+      <w:r>
+        <w:rPr>
+          <w:rFonts w:ascii="Arial" w:hAnsi="Arial"/>
+          <w:b w:val="0"/>
+          <w:i w:val="0"/>
+          <w:sz w:val="22"/>
+        </w:rPr>
+        <w:t>You now have a working Julia project with PDE solvers and a Slurm job script. The last step is to put your code under version control with Git, and push a copy to GitHub so you can access it from anywhere (including the HPC cluster) and share it with classmates or your advisor.</w:t>
+      </w:r>
+    </w:p>
+    <w:p>
+      <w:r>
+        <w:rPr>
+          <w:rFonts w:ascii="Arial" w:hAnsi="Arial"/>
+          <w:b w:val="0"/>
+          <w:i w:val="0"/>
+          <w:sz w:val="22"/>
+        </w:rPr>
+        <w:t>What is Git? Git records snapshots of your project over time so you can see what changed, undo mistakes, and collaborate without emailing zip files. GitHub is a website that hosts those snapshots online.</w:t>
+      </w:r>
+    </w:p>
+    <w:p>
+      <w:pPr>
+        <w:pStyle w:val="Heading2"/>
+      </w:pPr>
+      <w:r>
+        <w:rPr>
+          <w:rFonts w:ascii="Arial" w:hAnsi="Arial"/>
+          <w:b/>
+          <w:color w:val="2E75B6"/>
+          <w:sz w:val="28"/>
+        </w:rPr>
+        <w:t>11.1  Install Git (inside WSL)</w:t>
+      </w:r>
+    </w:p>
+    <w:p>
+      <w:r>
+        <w:rPr>
+          <w:rFonts w:ascii="Arial" w:hAnsi="Arial"/>
+          <w:b w:val="0"/>
+          <w:i w:val="0"/>
+          <w:sz w:val="22"/>
+        </w:rPr>
+        <w:t>Open your Ubuntu terminal and run:</w:t>
+      </w:r>
+    </w:p>
+    <w:p>
+      <w:pPr>
+        <w:ind w:left="360"/>
+        <w:shd w:fill="F0F0F0"/>
+      </w:pPr>
+      <w:r>
+        <w:rPr>
+          <w:rFonts w:ascii="Courier New" w:hAnsi="Courier New"/>
+          <w:color w:val="1A1A1A"/>
+          <w:sz w:val="19"/>
+        </w:rPr>
+        <w:t>sudo apt update</w:t>
+      </w:r>
+    </w:p>
+    <w:p>
+      <w:pPr>
+        <w:ind w:left="360"/>
+        <w:shd w:fill="F0F0F0"/>
+      </w:pPr>
+      <w:r>
+        <w:rPr>
+          <w:rFonts w:ascii="Courier New" w:hAnsi="Courier New"/>
+          <w:color w:val="1A1A1A"/>
+          <w:sz w:val="19"/>
+        </w:rPr>
+        <w:t>sudo apt install -y git</w:t>
+      </w:r>
+    </w:p>
+    <w:p>
+      <w:pPr>
+        <w:ind w:left="360"/>
+        <w:shd w:fill="F0F0F0"/>
+      </w:pPr>
+      <w:r>
+        <w:rPr>
+          <w:rFonts w:ascii="Courier New" w:hAnsi="Courier New"/>
+          <w:color w:val="1A1A1A"/>
+          <w:sz w:val="19"/>
+        </w:rPr>
+        <w:t>git --version   # should print: git version 2.43.x or similar</w:t>
+      </w:r>
+    </w:p>
+    <w:p>
+      <w:pPr>
+        <w:pStyle w:val="Heading2"/>
+      </w:pPr>
+      <w:r>
+        <w:rPr>
+          <w:rFonts w:ascii="Arial" w:hAnsi="Arial"/>
+          <w:b/>
+          <w:color w:val="2E75B6"/>
+          <w:sz w:val="28"/>
+        </w:rPr>
+        <w:t>11.2  Tell Git who you are (one-time setup)</w:t>
+      </w:r>
+    </w:p>
+    <w:p>
+      <w:r>
+        <w:rPr>
+          <w:rFonts w:ascii="Arial" w:hAnsi="Arial"/>
+          <w:b w:val="0"/>
+          <w:i w:val="0"/>
+          <w:sz w:val="22"/>
+        </w:rPr>
+        <w:t>Every snapshot is stamped with your name and email. Set them once and Git remembers them for every project on this computer.</w:t>
+      </w:r>
+    </w:p>
+    <w:p>
+      <w:pPr>
+        <w:ind w:left="360"/>
+        <w:shd w:fill="F0F0F0"/>
+      </w:pPr>
+      <w:r>
+        <w:rPr>
+          <w:rFonts w:ascii="Courier New" w:hAnsi="Courier New"/>
+          <w:color w:val="1A1A1A"/>
+          <w:sz w:val="19"/>
+        </w:rPr>
+        <w:t>git config --global user.name  "Your Name"</w:t>
+      </w:r>
+    </w:p>
+    <w:p>
+      <w:pPr>
+        <w:ind w:left="360"/>
+        <w:shd w:fill="F0F0F0"/>
+      </w:pPr>
+      <w:r>
+        <w:rPr>
+          <w:rFonts w:ascii="Courier New" w:hAnsi="Courier New"/>
+          <w:color w:val="1A1A1A"/>
+          <w:sz w:val="19"/>
+        </w:rPr>
+        <w:t>git config --global user.email "you@example.com"</w:t>
+      </w:r>
+    </w:p>
+    <w:p>
+      <w:r>
+        <w:rPr>
+          <w:rFonts w:ascii="Arial" w:hAnsi="Arial"/>
+          <w:b w:val="0"/>
+          <w:i w:val="0"/>
+          <w:sz w:val="22"/>
+        </w:rPr>
+        <w:t>Use the same email as your GitHub account when you create one in step 11.6.</w:t>
+      </w:r>
+    </w:p>
+    <w:p>
+      <w:pPr>
+        <w:pStyle w:val="Heading2"/>
+      </w:pPr>
+      <w:r>
+        <w:rPr>
+          <w:rFonts w:ascii="Arial" w:hAnsi="Arial"/>
+          <w:b/>
+          <w:color w:val="2E75B6"/>
+          <w:sz w:val="28"/>
+        </w:rPr>
+        <w:t>11.3  Initialise the repo in your project folder</w:t>
+      </w:r>
+    </w:p>
+    <w:p>
+      <w:r>
+        <w:rPr>
+          <w:rFonts w:ascii="Arial" w:hAnsi="Arial"/>
+          <w:b w:val="0"/>
+          <w:i w:val="0"/>
+          <w:sz w:val="22"/>
+        </w:rPr>
+        <w:t>Go to the folder that holds your Julia project (the one with Project.toml) and turn it into a Git repository:</w:t>
+      </w:r>
+    </w:p>
+    <w:p>
+      <w:pPr>
+        <w:ind w:left="360"/>
+        <w:shd w:fill="F0F0F0"/>
+      </w:pPr>
+      <w:r>
+        <w:rPr>
+          <w:rFonts w:ascii="Courier New" w:hAnsi="Courier New"/>
+          <w:color w:val="1A1A1A"/>
+          <w:sz w:val="19"/>
+        </w:rPr>
+        <w:t>cd ~/projects/julia-docx-tutorial   # adjust to your folder</w:t>
+      </w:r>
+    </w:p>
+    <w:p>
+      <w:pPr>
+        <w:ind w:left="360"/>
+        <w:shd w:fill="F0F0F0"/>
+      </w:pPr>
+      <w:r>
+        <w:rPr>
+          <w:rFonts w:ascii="Courier New" w:hAnsi="Courier New"/>
+          <w:color w:val="1A1A1A"/>
+          <w:sz w:val="19"/>
+        </w:rPr>
+        <w:t>git init</w:t>
+      </w:r>
+    </w:p>
+    <w:p>
+      <w:pPr>
+        <w:ind w:left="360"/>
+        <w:shd w:fill="F0F0F0"/>
+      </w:pPr>
+      <w:r>
+        <w:rPr>
+          <w:rFonts w:ascii="Courier New" w:hAnsi="Courier New"/>
+          <w:color w:val="1A1A1A"/>
+          <w:sz w:val="19"/>
+        </w:rPr>
+        <w:t>git status</w:t>
+      </w:r>
+    </w:p>
+    <w:p>
+      <w:r>
+        <w:rPr>
+          <w:rFonts w:ascii="Arial" w:hAnsi="Arial"/>
+          <w:b w:val="0"/>
+          <w:i w:val="0"/>
+          <w:sz w:val="22"/>
+        </w:rPr>
+        <w:t>git init creates a hidden .git/ folder where Git stores all history. git status shows every file Git can see; right now they will all be listed as untracked.</w:t>
+      </w:r>
+    </w:p>
+    <w:p>
+      <w:pPr>
+        <w:pStyle w:val="Heading2"/>
+      </w:pPr>
+      <w:r>
+        <w:rPr>
+          <w:rFonts w:ascii="Arial" w:hAnsi="Arial"/>
+          <w:b/>
+          <w:color w:val="2E75B6"/>
+          <w:sz w:val="28"/>
+        </w:rPr>
+        <w:t>11.4  Tell Git which files to ignore</w:t>
+      </w:r>
+    </w:p>
+    <w:p>
+      <w:r>
+        <w:rPr>
+          <w:rFonts w:ascii="Arial" w:hAnsi="Arial"/>
+          <w:b w:val="0"/>
+          <w:i w:val="0"/>
+          <w:sz w:val="22"/>
+        </w:rPr>
+        <w:t>You do NOT want to commit generated PNG figures, the large .docx, Julia's package cache, or editor temp files. Create a file named .gitignore at the top of the project with this content (one pattern per line):</w:t>
+      </w:r>
+    </w:p>
+    <w:p>
+      <w:pPr>
+        <w:ind w:left="360"/>
+        <w:shd w:fill="F0F0F0"/>
+      </w:pPr>
+      <w:r>
+        <w:rPr>
+          <w:rFonts w:ascii="Courier New" w:hAnsi="Courier New"/>
+          <w:color w:val="1A1A1A"/>
+          <w:sz w:val="19"/>
+        </w:rPr>
+        <w:t># Julia</w:t>
+      </w:r>
+    </w:p>
+    <w:p>
+      <w:pPr>
+        <w:ind w:left="360"/>
+        <w:shd w:fill="F0F0F0"/>
+      </w:pPr>
+      <w:r>
+        <w:rPr>
+          <w:rFonts w:ascii="Courier New" w:hAnsi="Courier New"/>
+          <w:color w:val="1A1A1A"/>
+          <w:sz w:val="19"/>
+        </w:rPr>
+        <w:t>Manifest.toml</w:t>
+      </w:r>
+    </w:p>
+    <w:p>
+      <w:pPr>
+        <w:ind w:left="360"/>
+        <w:shd w:fill="F0F0F0"/>
+      </w:pPr>
+      <w:r>
+        <w:rPr>
+          <w:rFonts w:ascii="Courier New" w:hAnsi="Courier New"/>
+          <w:color w:val="1A1A1A"/>
+          <w:sz w:val="19"/>
+        </w:rPr>
+        <w:t>*.jl.cov</w:t>
+      </w:r>
+    </w:p>
+    <w:p>
+      <w:pPr>
+        <w:ind w:left="360"/>
+        <w:shd w:fill="F0F0F0"/>
+      </w:pPr>
+      <w:r>
+        <w:rPr>
+          <w:rFonts w:ascii="Courier New" w:hAnsi="Courier New"/>
+          <w:color w:val="1A1A1A"/>
+          <w:sz w:val="19"/>
+        </w:rPr>
+        <w:t>*.jl.mem</w:t>
+      </w:r>
+    </w:p>
+    <w:p>
+      <w:pPr>
+        <w:ind w:left="360"/>
+        <w:shd w:fill="F0F0F0"/>
+      </w:pPr>
+      <w:r>
+        <w:rPr>
+          <w:rFonts w:ascii="Courier New" w:hAnsi="Courier New"/>
+          <w:color w:val="1A1A1A"/>
+          <w:sz w:val="19"/>
+        </w:rPr>
+        <w:t>.julia/</w:t>
+      </w:r>
+    </w:p>
+    <w:p>
+      <w:pPr>
+        <w:ind w:left="360"/>
+        <w:shd w:fill="F0F0F0"/>
+      </w:pPr>
+      <w:r>
+        <w:rPr>
+          <w:rFonts w:ascii="Courier New" w:hAnsi="Courier New"/>
+          <w:color w:val="1A1A1A"/>
+          <w:sz w:val="19"/>
+        </w:rPr>
+      </w:r>
+    </w:p>
+    <w:p>
+      <w:pPr>
+        <w:ind w:left="360"/>
+        <w:shd w:fill="F0F0F0"/>
+      </w:pPr>
+      <w:r>
+        <w:rPr>
+          <w:rFonts w:ascii="Courier New" w:hAnsi="Courier New"/>
+          <w:color w:val="1A1A1A"/>
+          <w:sz w:val="19"/>
+        </w:rPr>
+        <w:t># Generated artifacts</w:t>
+      </w:r>
+    </w:p>
+    <w:p>
+      <w:pPr>
+        <w:ind w:left="360"/>
+        <w:shd w:fill="F0F0F0"/>
+      </w:pPr>
+      <w:r>
+        <w:rPr>
+          <w:rFonts w:ascii="Courier New" w:hAnsi="Courier New"/>
+          <w:color w:val="1A1A1A"/>
+          <w:sz w:val="19"/>
+        </w:rPr>
+        <w:t>output/</w:t>
+      </w:r>
+    </w:p>
+    <w:p>
+      <w:pPr>
+        <w:ind w:left="360"/>
+        <w:shd w:fill="F0F0F0"/>
+      </w:pPr>
+      <w:r>
+        <w:rPr>
+          <w:rFonts w:ascii="Courier New" w:hAnsi="Courier New"/>
+          <w:color w:val="1A1A1A"/>
+          <w:sz w:val="19"/>
+        </w:rPr>
+        <w:t>site/output/figures/</w:t>
+      </w:r>
+    </w:p>
+    <w:p>
+      <w:pPr>
+        <w:ind w:left="360"/>
+        <w:shd w:fill="F0F0F0"/>
+      </w:pPr>
+      <w:r>
+        <w:rPr>
+          <w:rFonts w:ascii="Courier New" w:hAnsi="Courier New"/>
+          <w:color w:val="1A1A1A"/>
+          <w:sz w:val="19"/>
+        </w:rPr>
+        <w:t>*.docx</w:t>
+      </w:r>
+    </w:p>
+    <w:p>
+      <w:pPr>
+        <w:ind w:left="360"/>
+        <w:shd w:fill="F0F0F0"/>
+      </w:pPr>
+      <w:r>
+        <w:rPr>
+          <w:rFonts w:ascii="Courier New" w:hAnsi="Courier New"/>
+          <w:color w:val="1A1A1A"/>
+          <w:sz w:val="19"/>
+        </w:rPr>
+        <w:t>*.png</w:t>
+      </w:r>
+    </w:p>
+    <w:p>
+      <w:pPr>
+        <w:ind w:left="360"/>
+        <w:shd w:fill="F0F0F0"/>
+      </w:pPr>
+      <w:r>
+        <w:rPr>
+          <w:rFonts w:ascii="Courier New" w:hAnsi="Courier New"/>
+          <w:color w:val="1A1A1A"/>
+          <w:sz w:val="19"/>
+        </w:rPr>
+      </w:r>
+    </w:p>
+    <w:p>
+      <w:pPr>
+        <w:ind w:left="360"/>
+        <w:shd w:fill="F0F0F0"/>
+      </w:pPr>
+      <w:r>
+        <w:rPr>
+          <w:rFonts w:ascii="Courier New" w:hAnsi="Courier New"/>
+          <w:color w:val="1A1A1A"/>
+          <w:sz w:val="19"/>
+        </w:rPr>
+        <w:t># OS / editor</w:t>
+      </w:r>
+    </w:p>
+    <w:p>
+      <w:pPr>
+        <w:ind w:left="360"/>
+        <w:shd w:fill="F0F0F0"/>
+      </w:pPr>
+      <w:r>
+        <w:rPr>
+          <w:rFonts w:ascii="Courier New" w:hAnsi="Courier New"/>
+          <w:color w:val="1A1A1A"/>
+          <w:sz w:val="19"/>
+        </w:rPr>
+        <w:t>.DS_Store</w:t>
+      </w:r>
+    </w:p>
+    <w:p>
+      <w:pPr>
+        <w:ind w:left="360"/>
+        <w:shd w:fill="F0F0F0"/>
+      </w:pPr>
+      <w:r>
+        <w:rPr>
+          <w:rFonts w:ascii="Courier New" w:hAnsi="Courier New"/>
+          <w:color w:val="1A1A1A"/>
+          <w:sz w:val="19"/>
+        </w:rPr>
+        <w:t>.vscode/</w:t>
+      </w:r>
+    </w:p>
+    <w:p>
+      <w:pPr>
+        <w:ind w:left="360"/>
+        <w:shd w:fill="F0F0F0"/>
+      </w:pPr>
+      <w:r>
+        <w:rPr>
+          <w:rFonts w:ascii="Courier New" w:hAnsi="Courier New"/>
+          <w:color w:val="1A1A1A"/>
+          <w:sz w:val="19"/>
+        </w:rPr>
+        <w:t>*.swp</w:t>
+      </w:r>
+    </w:p>
+    <w:p>
+      <w:r>
+        <w:rPr>
+          <w:rFonts w:ascii="Arial" w:hAnsi="Arial"/>
+          <w:b w:val="0"/>
+          <w:i w:val="0"/>
+          <w:sz w:val="22"/>
+        </w:rPr>
+        <w:t>Anything matching one of these patterns is hidden from Git. You can always remove a line later if you decide you do want to track that file.</w:t>
+      </w:r>
+    </w:p>
+    <w:p>
+      <w:pPr>
+        <w:pStyle w:val="Heading2"/>
+      </w:pPr>
+      <w:r>
+        <w:rPr>
+          <w:rFonts w:ascii="Arial" w:hAnsi="Arial"/>
+          <w:b/>
+          <w:color w:val="2E75B6"/>
+          <w:sz w:val="28"/>
+        </w:rPr>
+        <w:t>11.5  Make your first commit</w:t>
+      </w:r>
+    </w:p>
+    <w:p>
+      <w:r>
+        <w:rPr>
+          <w:rFonts w:ascii="Arial" w:hAnsi="Arial"/>
+          <w:b w:val="0"/>
+          <w:i w:val="0"/>
+          <w:sz w:val="22"/>
+        </w:rPr>
+        <w:t>A commit is a labelled snapshot of every file currently staged. Stage all files, then commit with a short message:</w:t>
+      </w:r>
+    </w:p>
+    <w:p>
+      <w:pPr>
+        <w:ind w:left="360"/>
+        <w:shd w:fill="F0F0F0"/>
+      </w:pPr>
+      <w:r>
+        <w:rPr>
+          <w:rFonts w:ascii="Courier New" w:hAnsi="Courier New"/>
+          <w:color w:val="1A1A1A"/>
+          <w:sz w:val="19"/>
+        </w:rPr>
+        <w:t>git add .</w:t>
+      </w:r>
+    </w:p>
+    <w:p>
+      <w:pPr>
+        <w:ind w:left="360"/>
+        <w:shd w:fill="F0F0F0"/>
+      </w:pPr>
+      <w:r>
+        <w:rPr>
+          <w:rFonts w:ascii="Courier New" w:hAnsi="Courier New"/>
+          <w:color w:val="1A1A1A"/>
+          <w:sz w:val="19"/>
+        </w:rPr>
+        <w:t>git status                          # confirm what is staged</w:t>
+      </w:r>
+    </w:p>
+    <w:p>
+      <w:pPr>
+        <w:ind w:left="360"/>
+        <w:shd w:fill="F0F0F0"/>
+      </w:pPr>
+      <w:r>
+        <w:rPr>
+          <w:rFonts w:ascii="Courier New" w:hAnsi="Courier New"/>
+          <w:color w:val="1A1A1A"/>
+          <w:sz w:val="19"/>
+        </w:rPr>
+        <w:t>git commit -m "Initial project: Julia PDE solvers and setup guide"</w:t>
+      </w:r>
+    </w:p>
+    <w:p>
+      <w:r>
+        <w:rPr>
+          <w:rFonts w:ascii="Arial" w:hAnsi="Arial"/>
+          <w:b w:val="0"/>
+          <w:i w:val="0"/>
+          <w:sz w:val="22"/>
+        </w:rPr>
+        <w:t>Git replies with something like '[main (root-commit) 9e4c42c] Initial project ...'. That hash is the snapshot's unique ID; you can always come back to it later.</w:t>
+      </w:r>
+    </w:p>
+    <w:p>
+      <w:r>
+        <w:rPr>
+          <w:rFonts w:ascii="Arial" w:hAnsi="Arial"/>
+          <w:b w:val="0"/>
+          <w:i w:val="0"/>
+          <w:sz w:val="22"/>
+        </w:rPr>
+        <w:t>Good commit messages describe what you did and why, in the present tense. 'Add heat-equation solver and convergence test' is better than 'changes' or 'wip'.</w:t>
+      </w:r>
+    </w:p>
+    <w:p>
+      <w:pPr>
+        <w:pStyle w:val="Heading2"/>
+      </w:pPr>
+      <w:r>
+        <w:rPr>
+          <w:rFonts w:ascii="Arial" w:hAnsi="Arial"/>
+          <w:b/>
+          <w:color w:val="2E75B6"/>
+          <w:sz w:val="28"/>
+        </w:rPr>
+        <w:t>11.6  Create a GitHub account and an empty repository</w:t>
+      </w:r>
+    </w:p>
+    <w:p>
+      <w:pPr>
+        <w:pStyle w:val="ListBullet"/>
+      </w:pPr>
+      <w:r>
+        <w:rPr>
+          <w:rFonts w:ascii="Arial" w:hAnsi="Arial"/>
+          <w:sz w:val="22"/>
+        </w:rPr>
+        <w:t>Go to https://github.com and sign up (free).</w:t>
+      </w:r>
+    </w:p>
+    <w:p>
+      <w:pPr>
+        <w:pStyle w:val="ListBullet"/>
+      </w:pPr>
+      <w:r>
+        <w:rPr>
+          <w:rFonts w:ascii="Arial" w:hAnsi="Arial"/>
+          <w:sz w:val="22"/>
+        </w:rPr>
+        <w:t>Click + → New repository in the top-right corner.</w:t>
+      </w:r>
+    </w:p>
+    <w:p>
+      <w:pPr>
+        <w:pStyle w:val="ListBullet"/>
+      </w:pPr>
+      <w:r>
+        <w:rPr>
+          <w:rFonts w:ascii="Arial" w:hAnsi="Arial"/>
+          <w:sz w:val="22"/>
+        </w:rPr>
+        <w:t>Name it (for example julia-pde-tutorial), keep it public or private as you prefer.</w:t>
+      </w:r>
+    </w:p>
+    <w:p>
+      <w:pPr>
+        <w:pStyle w:val="ListBullet"/>
+      </w:pPr>
+      <w:r>
+        <w:rPr>
+          <w:rFonts w:ascii="Arial" w:hAnsi="Arial"/>
+          <w:sz w:val="22"/>
+        </w:rPr>
+        <w:t>Do NOT tick 'Add a README' or 'Add .gitignore' — your local folder already has those.</w:t>
+      </w:r>
+    </w:p>
+    <w:p>
+      <w:pPr>
+        <w:pStyle w:val="ListBullet"/>
+      </w:pPr>
+      <w:r>
+        <w:rPr>
+          <w:rFonts w:ascii="Arial" w:hAnsi="Arial"/>
+          <w:sz w:val="22"/>
+        </w:rPr>
+        <w:t>Click Create repository. GitHub shows a page with the URL of your new (empty) repo.</w:t>
+      </w:r>
+    </w:p>
+    <w:p>
+      <w:pPr>
+        <w:pStyle w:val="Heading2"/>
+      </w:pPr>
+      <w:r>
+        <w:rPr>
+          <w:rFonts w:ascii="Arial" w:hAnsi="Arial"/>
+          <w:b/>
+          <w:color w:val="2E75B6"/>
+          <w:sz w:val="28"/>
+        </w:rPr>
+        <w:t>11.7  Connect your local repo to GitHub and push</w:t>
+      </w:r>
+    </w:p>
+    <w:p>
+      <w:r>
+        <w:rPr>
+          <w:rFonts w:ascii="Arial" w:hAnsi="Arial"/>
+          <w:b w:val="0"/>
+          <w:i w:val="0"/>
+          <w:sz w:val="22"/>
+        </w:rPr>
+        <w:t>On the GitHub repo page, copy the HTTPS URL (looks like https://github.com/&lt;you&gt;/julia-pde-tutorial.git). Then in your terminal:</w:t>
+      </w:r>
+    </w:p>
+    <w:p>
+      <w:pPr>
+        <w:ind w:left="360"/>
+        <w:shd w:fill="F0F0F0"/>
+      </w:pPr>
+      <w:r>
+        <w:rPr>
+          <w:rFonts w:ascii="Courier New" w:hAnsi="Courier New"/>
+          <w:color w:val="1A1A1A"/>
+          <w:sz w:val="19"/>
+        </w:rPr>
+        <w:t>git branch -M main</w:t>
+      </w:r>
+    </w:p>
+    <w:p>
+      <w:pPr>
+        <w:ind w:left="360"/>
+        <w:shd w:fill="F0F0F0"/>
+      </w:pPr>
+      <w:r>
+        <w:rPr>
+          <w:rFonts w:ascii="Courier New" w:hAnsi="Courier New"/>
+          <w:color w:val="1A1A1A"/>
+          <w:sz w:val="19"/>
+        </w:rPr>
+        <w:t>git remote add origin https://github.com/&lt;your-username&gt;/julia-pde-tutorial.git</w:t>
+      </w:r>
+    </w:p>
+    <w:p>
+      <w:pPr>
+        <w:ind w:left="360"/>
+        <w:shd w:fill="F0F0F0"/>
+      </w:pPr>
+      <w:r>
+        <w:rPr>
+          <w:rFonts w:ascii="Courier New" w:hAnsi="Courier New"/>
+          <w:color w:val="1A1A1A"/>
+          <w:sz w:val="19"/>
+        </w:rPr>
+        <w:t>git push -u origin main</w:t>
+      </w:r>
+    </w:p>
+    <w:p>
+      <w:r>
+        <w:rPr>
+          <w:rFonts w:ascii="Arial" w:hAnsi="Arial"/>
+          <w:b w:val="0"/>
+          <w:i w:val="0"/>
+          <w:sz w:val="22"/>
+        </w:rPr>
+        <w:t>The first time you push, GitHub will ask for your username and a personal access token (PAT) instead of a password. Create one at https://github.com/settings/tokens → Generate new token (classic), give it the 'repo' scope, and paste it where Git asks for the password. Git will cache it so you don't have to enter it again.</w:t>
+      </w:r>
+    </w:p>
+    <w:p>
+      <w:pPr>
+        <w:pStyle w:val="Heading2"/>
+      </w:pPr>
+      <w:r>
+        <w:rPr>
+          <w:rFonts w:ascii="Arial" w:hAnsi="Arial"/>
+          <w:b/>
+          <w:color w:val="2E75B6"/>
+          <w:sz w:val="28"/>
+        </w:rPr>
+        <w:t>11.8  Day-to-day loop</w:t>
+      </w:r>
+    </w:p>
+    <w:p>
+      <w:r>
+        <w:rPr>
+          <w:rFonts w:ascii="Arial" w:hAnsi="Arial"/>
+          <w:b w:val="0"/>
+          <w:i w:val="0"/>
+          <w:sz w:val="22"/>
+        </w:rPr>
+        <w:t>From now on, every time you change something you want to keep:</w:t>
+      </w:r>
+    </w:p>
+    <w:p>
+      <w:pPr>
+        <w:ind w:left="360"/>
+        <w:shd w:fill="F0F0F0"/>
+      </w:pPr>
+      <w:r>
+        <w:rPr>
+          <w:rFonts w:ascii="Courier New" w:hAnsi="Courier New"/>
+          <w:color w:val="1A1A1A"/>
+          <w:sz w:val="19"/>
+        </w:rPr>
+        <w:t>git status                          # what changed?</w:t>
+      </w:r>
+    </w:p>
+    <w:p>
+      <w:pPr>
+        <w:ind w:left="360"/>
+        <w:shd w:fill="F0F0F0"/>
+      </w:pPr>
+      <w:r>
+        <w:rPr>
+          <w:rFonts w:ascii="Courier New" w:hAnsi="Courier New"/>
+          <w:color w:val="1A1A1A"/>
+          <w:sz w:val="19"/>
+        </w:rPr>
+        <w:t>git add path/to/file.jl             # stage specific files (or 'git add .' for all)</w:t>
+      </w:r>
+    </w:p>
+    <w:p>
+      <w:pPr>
+        <w:ind w:left="360"/>
+        <w:shd w:fill="F0F0F0"/>
+      </w:pPr>
+      <w:r>
+        <w:rPr>
+          <w:rFonts w:ascii="Courier New" w:hAnsi="Courier New"/>
+          <w:color w:val="1A1A1A"/>
+          <w:sz w:val="19"/>
+        </w:rPr>
+        <w:t>git commit -m "Fix CFL bug in wave solver"</w:t>
+      </w:r>
+    </w:p>
+    <w:p>
+      <w:pPr>
+        <w:ind w:left="360"/>
+        <w:shd w:fill="F0F0F0"/>
+      </w:pPr>
+      <w:r>
+        <w:rPr>
+          <w:rFonts w:ascii="Courier New" w:hAnsi="Courier New"/>
+          <w:color w:val="1A1A1A"/>
+          <w:sz w:val="19"/>
+        </w:rPr>
+        <w:t>git push                            # send the new commits to GitHub</w:t>
+      </w:r>
+    </w:p>
+    <w:p>
+      <w:r>
+        <w:rPr>
+          <w:rFonts w:ascii="Arial" w:hAnsi="Arial"/>
+          <w:b w:val="0"/>
+          <w:i w:val="0"/>
+          <w:sz w:val="22"/>
+        </w:rPr>
+        <w:t>Refresh your GitHub repo page in the browser — you should see every file from your project, your commit message at the top, and a clickable history. From here you can 'git clone' the same repo on the HPC cluster and run the exact same code there.</w:t>
+      </w:r>
+    </w:p>
     <w:sectPr>
       <w:pgSz w:w="12240" w:h="15840"/>
       <w:pgMar w:top="1440" w:right="1440" w:bottom="1440" w:left="1440" w:header="720" w:footer="720" w:gutter="0"/>

</xml_diff>

<commit_message>
docs: rewrite teaching material around the CoupledPDESystem generalization
§6.8 ("Generalizing to Coupled Multi-Field Systems") was written as a
forward-looking exercise; rewrite it as a walkthrough of the now-implemented
CoupledPDESystem/Ind, with a new 3-field figure (three plates in a thermal
exchange chain, 1↔2 and 2↔3 coupled, 1↔3 not) alongside the original 2-field
one. §4.5.8 ("Write tests") taught a test/runtests.jl convention that never
actually existed in the package; rewrite it to walk through the real test
suite added in the companion package commit.

Mirror both updates in site/polish.html §8.9 and site/build-package.html
Step H, and add a v0.6.0 entry to site/changelog.html, so the static site
doesn't immediately drift back out of sync with the docx.

Regenerate all figures and rebuild output/julia_hpc_setup_guide.docx.

Co-Authored-By: Claude Sonnet 5 <noreply@anthropic.com>
</commit_message>
<xml_diff>
--- a/output/julia_hpc_setup_guide.docx
+++ b/output/julia_hpc_setup_guide.docx
@@ -3497,118 +3497,146 @@
           <w:i w:val="0"/>
           <w:sz w:val="22"/>
         </w:rPr>
-        <w:t>Tests live in test/runtests.jl. Run them with `(@juliaPDEs) pkg&gt; test`:</w:t>
-      </w:r>
-    </w:p>
-    <w:p>
-      <w:pPr>
-        <w:ind w:left="360"/>
-        <w:shd w:fill="F0F0F0"/>
-      </w:pPr>
-      <w:r>
-        <w:rPr>
-          <w:rFonts w:ascii="Courier New" w:hAnsi="Courier New"/>
-          <w:color w:val="1A1A1A"/>
-          <w:sz w:val="19"/>
-        </w:rPr>
-        <w:t>using juliaPDEs, Test</w:t>
-      </w:r>
-    </w:p>
-    <w:p>
-      <w:pPr>
-        <w:ind w:left="360"/>
-        <w:shd w:fill="F0F0F0"/>
-      </w:pPr>
-      <w:r>
-        <w:rPr>
-          <w:rFonts w:ascii="Courier New" w:hAnsi="Courier New"/>
-          <w:color w:val="1A1A1A"/>
-          <w:sz w:val="19"/>
-        </w:rPr>
-      </w:r>
-    </w:p>
-    <w:p>
-      <w:pPr>
-        <w:ind w:left="360"/>
-        <w:shd w:fill="F0F0F0"/>
-      </w:pPr>
-      <w:r>
-        <w:rPr>
-          <w:rFonts w:ascii="Courier New" w:hAnsi="Courier New"/>
-          <w:color w:val="1A1A1A"/>
-          <w:sz w:val="19"/>
-        </w:rPr>
-        <w:t>@testset "Heat equation" begin</w:t>
-      </w:r>
-    </w:p>
-    <w:p>
-      <w:pPr>
-        <w:ind w:left="360"/>
-        <w:shd w:fill="F0F0F0"/>
-      </w:pPr>
-      <w:r>
-        <w:rPr>
-          <w:rFonts w:ascii="Courier New" w:hAnsi="Courier New"/>
-          <w:color w:val="1A1A1A"/>
-          <w:sz w:val="19"/>
-        </w:rPr>
-        <w:t xml:space="preserve">    x, u = solve_heat_1d(N=50, T=0.1)</w:t>
-      </w:r>
-    </w:p>
-    <w:p>
-      <w:pPr>
-        <w:ind w:left="360"/>
-        <w:shd w:fill="F0F0F0"/>
-      </w:pPr>
-      <w:r>
-        <w:rPr>
-          <w:rFonts w:ascii="Courier New" w:hAnsi="Courier New"/>
-          <w:color w:val="1A1A1A"/>
-          <w:sz w:val="19"/>
-        </w:rPr>
-        <w:t xml:space="preserve">    @test length(x) == 50</w:t>
-      </w:r>
-    </w:p>
-    <w:p>
-      <w:pPr>
-        <w:ind w:left="360"/>
-        <w:shd w:fill="F0F0F0"/>
-      </w:pPr>
-      <w:r>
-        <w:rPr>
-          <w:rFonts w:ascii="Courier New" w:hAnsi="Courier New"/>
-          <w:color w:val="1A1A1A"/>
-          <w:sz w:val="19"/>
-        </w:rPr>
-        <w:t xml:space="preserve">    @test maximum(u) &lt; 1.0</w:t>
-      </w:r>
-    </w:p>
-    <w:p>
-      <w:pPr>
-        <w:ind w:left="360"/>
-        <w:shd w:fill="F0F0F0"/>
-      </w:pPr>
-      <w:r>
-        <w:rPr>
-          <w:rFonts w:ascii="Courier New" w:hAnsi="Courier New"/>
-          <w:color w:val="1A1A1A"/>
-          <w:sz w:val="19"/>
-        </w:rPr>
-        <w:t xml:space="preserve">    @test u[1]   ≈ 0.0 atol=1e-10</w:t>
-      </w:r>
-    </w:p>
-    <w:p>
-      <w:pPr>
-        <w:ind w:left="360"/>
-        <w:shd w:fill="F0F0F0"/>
-      </w:pPr>
-      <w:r>
-        <w:rPr>
-          <w:rFonts w:ascii="Courier New" w:hAnsi="Courier New"/>
-          <w:color w:val="1A1A1A"/>
-          <w:sz w:val="19"/>
-        </w:rPr>
-        <w:t xml:space="preserve">    @test u[end] ≈ 0.0 atol=1e-10</w:t>
+        <w:t>Tests live in test/runtests.jl. Run them with `(@juliaPDEs) pkg&gt; test`, or `julia --project=juliaPDEs -e 'using Pkg; Pkg.test()'` from the command line. Beyond basic smoke tests per solver, the suite includes a real cross-check: the generalized CoupledPDESystem, run with zero coupling, must reproduce HeatEquation.solve_implicit exactly — if it doesn't, the block-system assembly in coupled.jl has a bug:</w:t>
+      </w:r>
+    </w:p>
+    <w:p>
+      <w:pPr>
+        <w:ind w:left="360"/>
+        <w:shd w:fill="F0F0F0"/>
+      </w:pPr>
+      <w:r>
+        <w:rPr>
+          <w:rFonts w:ascii="Courier New" w:hAnsi="Courier New"/>
+          <w:color w:val="1A1A1A"/>
+          <w:sz w:val="19"/>
+        </w:rPr>
+        <w:t>using Test, juliaPDEs</w:t>
+      </w:r>
+    </w:p>
+    <w:p>
+      <w:pPr>
+        <w:ind w:left="360"/>
+        <w:shd w:fill="F0F0F0"/>
+      </w:pPr>
+      <w:r>
+        <w:rPr>
+          <w:rFonts w:ascii="Courier New" w:hAnsi="Courier New"/>
+          <w:color w:val="1A1A1A"/>
+          <w:sz w:val="19"/>
+        </w:rPr>
+      </w:r>
+    </w:p>
+    <w:p>
+      <w:pPr>
+        <w:ind w:left="360"/>
+        <w:shd w:fill="F0F0F0"/>
+      </w:pPr>
+      <w:r>
+        <w:rPr>
+          <w:rFonts w:ascii="Courier New" w:hAnsi="Courier New"/>
+          <w:color w:val="1A1A1A"/>
+          <w:sz w:val="19"/>
+        </w:rPr>
+        <w:t>@testset "Ind indexing" begin</w:t>
+      </w:r>
+    </w:p>
+    <w:p>
+      <w:pPr>
+        <w:ind w:left="360"/>
+        <w:shd w:fill="F0F0F0"/>
+      </w:pPr>
+      <w:r>
+        <w:rPr>
+          <w:rFonts w:ascii="Courier New" w:hAnsi="Courier New"/>
+          <w:color w:val="1A1A1A"/>
+          <w:sz w:val="19"/>
+        </w:rPr>
+        <w:t xml:space="preserve">    d = Ind((:u, :v, :w), (4, 5))</w:t>
+      </w:r>
+    </w:p>
+    <w:p>
+      <w:pPr>
+        <w:ind w:left="360"/>
+        <w:shd w:fill="F0F0F0"/>
+      </w:pPr>
+      <w:r>
+        <w:rPr>
+          <w:rFonts w:ascii="Courier New" w:hAnsi="Courier New"/>
+          <w:color w:val="1A1A1A"/>
+          <w:sz w:val="19"/>
+        </w:rPr>
+        <w:t xml:space="preserve">    for var in (:u, :v, :w), I in CartesianIndices((4, 5))</w:t>
+      </w:r>
+    </w:p>
+    <w:p>
+      <w:pPr>
+        <w:ind w:left="360"/>
+        <w:shd w:fill="F0F0F0"/>
+      </w:pPr>
+      <w:r>
+        <w:rPr>
+          <w:rFonts w:ascii="Courier New" w:hAnsi="Courier New"/>
+          <w:color w:val="1A1A1A"/>
+          <w:sz w:val="19"/>
+        </w:rPr>
+        <w:t xml:space="preserve">        flat = d[var, I.I...]</w:t>
+      </w:r>
+    </w:p>
+    <w:p>
+      <w:pPr>
+        <w:ind w:left="360"/>
+        <w:shd w:fill="F0F0F0"/>
+      </w:pPr>
+      <w:r>
+        <w:rPr>
+          <w:rFonts w:ascii="Courier New" w:hAnsi="Courier New"/>
+          <w:color w:val="1A1A1A"/>
+          <w:sz w:val="19"/>
+        </w:rPr>
+        <w:t xml:space="preserve">        (var2, I2) = d[flat]</w:t>
+      </w:r>
+    </w:p>
+    <w:p>
+      <w:pPr>
+        <w:ind w:left="360"/>
+        <w:shd w:fill="F0F0F0"/>
+      </w:pPr>
+      <w:r>
+        <w:rPr>
+          <w:rFonts w:ascii="Courier New" w:hAnsi="Courier New"/>
+          <w:color w:val="1A1A1A"/>
+          <w:sz w:val="19"/>
+        </w:rPr>
+        <w:t xml:space="preserve">        @test var2 == var</w:t>
+      </w:r>
+    </w:p>
+    <w:p>
+      <w:pPr>
+        <w:ind w:left="360"/>
+        <w:shd w:fill="F0F0F0"/>
+      </w:pPr>
+      <w:r>
+        <w:rPr>
+          <w:rFonts w:ascii="Courier New" w:hAnsi="Courier New"/>
+          <w:color w:val="1A1A1A"/>
+          <w:sz w:val="19"/>
+        </w:rPr>
+        <w:t xml:space="preserve">        @test I2 == I</w:t>
+      </w:r>
+    </w:p>
+    <w:p>
+      <w:pPr>
+        <w:ind w:left="360"/>
+        <w:shd w:fill="F0F0F0"/>
+      </w:pPr>
+      <w:r>
+        <w:rPr>
+          <w:rFonts w:ascii="Courier New" w:hAnsi="Courier New"/>
+          <w:color w:val="1A1A1A"/>
+          <w:sz w:val="19"/>
+        </w:rPr>
+        <w:t xml:space="preserve">    end</w:t>
       </w:r>
     </w:p>
     <w:p>
@@ -3649,63 +3677,186 @@
           <w:color w:val="1A1A1A"/>
           <w:sz w:val="19"/>
         </w:rPr>
-        <w:t>@testset "Wave equation" begin</w:t>
-      </w:r>
-    </w:p>
-    <w:p>
-      <w:pPr>
-        <w:ind w:left="360"/>
-        <w:shd w:fill="F0F0F0"/>
-      </w:pPr>
-      <w:r>
-        <w:rPr>
-          <w:rFonts w:ascii="Courier New" w:hAnsi="Courier New"/>
-          <w:color w:val="1A1A1A"/>
-          <w:sz w:val="19"/>
-        </w:rPr>
-        <w:t xml:space="preserve">    prob = juliaPDEs.WaveEquation(nx=100, nt=200, T=0.5)</w:t>
-      </w:r>
-    </w:p>
-    <w:p>
-      <w:pPr>
-        <w:ind w:left="360"/>
-        <w:shd w:fill="F0F0F0"/>
-      </w:pPr>
-      <w:r>
-        <w:rPr>
-          <w:rFonts w:ascii="Courier New" w:hAnsi="Courier New"/>
-          <w:color w:val="1A1A1A"/>
-          <w:sz w:val="19"/>
-        </w:rPr>
-        <w:t xml:space="preserve">    x, u = solve_wave_1d(prob)</w:t>
-      </w:r>
-    </w:p>
-    <w:p>
-      <w:pPr>
-        <w:ind w:left="360"/>
-        <w:shd w:fill="F0F0F0"/>
-      </w:pPr>
-      <w:r>
-        <w:rPr>
-          <w:rFonts w:ascii="Courier New" w:hAnsi="Courier New"/>
-          <w:color w:val="1A1A1A"/>
-          <w:sz w:val="19"/>
-        </w:rPr>
-        <w:t xml:space="preserve">    @test length(x) == 100</w:t>
-      </w:r>
-    </w:p>
-    <w:p>
-      <w:pPr>
-        <w:ind w:left="360"/>
-        <w:shd w:fill="F0F0F0"/>
-      </w:pPr>
-      <w:r>
-        <w:rPr>
-          <w:rFonts w:ascii="Courier New" w:hAnsi="Courier New"/>
-          <w:color w:val="1A1A1A"/>
-          <w:sz w:val="19"/>
-        </w:rPr>
-        <w:t xml:space="preserve">    @test all(isfinite, u)</w:t>
+        <w:t>@testset "CoupledPDESystem at K=0 ≡ HeatEquation.solve_implicit (θ=1)" begin</w:t>
+      </w:r>
+    </w:p>
+    <w:p>
+      <w:pPr>
+        <w:ind w:left="360"/>
+        <w:shd w:fill="F0F0F0"/>
+      </w:pPr>
+      <w:r>
+        <w:rPr>
+          <w:rFonts w:ascii="Courier New" w:hAnsi="Courier New"/>
+          <w:color w:val="1A1A1A"/>
+          <w:sz w:val="19"/>
+        </w:rPr>
+        <w:t xml:space="preserve">    grid = Grid(a=(0.0,), b=(1.0,), stepsize=(0.02,))</w:t>
+      </w:r>
+    </w:p>
+    <w:p>
+      <w:pPr>
+        <w:ind w:left="360"/>
+        <w:shd w:fill="F0F0F0"/>
+      </w:pPr>
+      <w:r>
+        <w:rPr>
+          <w:rFonts w:ascii="Courier New" w:hAnsi="Courier New"/>
+          <w:color w:val="1A1A1A"/>
+          <w:sz w:val="19"/>
+        </w:rPr>
+        <w:t xml:space="preserve">    f_init(x) = sin(pi * x)</w:t>
+      </w:r>
+    </w:p>
+    <w:p>
+      <w:pPr>
+        <w:ind w:left="360"/>
+        <w:shd w:fill="F0F0F0"/>
+      </w:pPr>
+      <w:r>
+        <w:rPr>
+          <w:rFonts w:ascii="Courier New" w:hAnsi="Courier New"/>
+          <w:color w:val="1A1A1A"/>
+          <w:sz w:val="19"/>
+        </w:rPr>
+        <w:t xml:space="preserve">    tg = TestGrid(grid, (t -&gt; 0.0,), (t -&gt; 0.0,), f_init)</w:t>
+      </w:r>
+    </w:p>
+    <w:p>
+      <w:pPr>
+        <w:ind w:left="360"/>
+        <w:shd w:fill="F0F0F0"/>
+      </w:pPr>
+      <w:r>
+        <w:rPr>
+          <w:rFonts w:ascii="Courier New" w:hAnsi="Courier New"/>
+          <w:color w:val="1A1A1A"/>
+          <w:sz w:val="19"/>
+        </w:rPr>
+      </w:r>
+    </w:p>
+    <w:p>
+      <w:pPr>
+        <w:ind w:left="360"/>
+        <w:shd w:fill="F0F0F0"/>
+      </w:pPr>
+      <w:r>
+        <w:rPr>
+          <w:rFonts w:ascii="Courier New" w:hAnsi="Courier New"/>
+          <w:color w:val="1A1A1A"/>
+          <w:sz w:val="19"/>
+        </w:rPr>
+        <w:t xml:space="preserve">    heat     = HeatEquation(testgrid=tg, Nt=200, T=0.1, α=0.01)</w:t>
+      </w:r>
+    </w:p>
+    <w:p>
+      <w:pPr>
+        <w:ind w:left="360"/>
+        <w:shd w:fill="F0F0F0"/>
+      </w:pPr>
+      <w:r>
+        <w:rPr>
+          <w:rFonts w:ascii="Courier New" w:hAnsi="Courier New"/>
+          <w:color w:val="1A1A1A"/>
+          <w:sz w:val="19"/>
+        </w:rPr>
+        <w:t xml:space="preserve">    sol_heat = solve_implicit(heat; θ=1.0)</w:t>
+      </w:r>
+    </w:p>
+    <w:p>
+      <w:pPr>
+        <w:ind w:left="360"/>
+        <w:shd w:fill="F0F0F0"/>
+      </w:pPr>
+      <w:r>
+        <w:rPr>
+          <w:rFonts w:ascii="Courier New" w:hAnsi="Courier New"/>
+          <w:color w:val="1A1A1A"/>
+          <w:sz w:val="19"/>
+        </w:rPr>
+      </w:r>
+    </w:p>
+    <w:p>
+      <w:pPr>
+        <w:ind w:left="360"/>
+        <w:shd w:fill="F0F0F0"/>
+      </w:pPr>
+      <w:r>
+        <w:rPr>
+          <w:rFonts w:ascii="Courier New" w:hAnsi="Courier New"/>
+          <w:color w:val="1A1A1A"/>
+          <w:sz w:val="19"/>
+        </w:rPr>
+        <w:t xml:space="preserve">    sys = CoupledPDESystem(grid=grid, vars=(:u, :v), α=(0.01, 0.01),</w:t>
+      </w:r>
+    </w:p>
+    <w:p>
+      <w:pPr>
+        <w:ind w:left="360"/>
+        <w:shd w:fill="F0F0F0"/>
+      </w:pPr>
+      <w:r>
+        <w:rPr>
+          <w:rFonts w:ascii="Courier New" w:hAnsi="Courier New"/>
+          <w:color w:val="1A1A1A"/>
+          <w:sz w:val="19"/>
+        </w:rPr>
+        <w:t xml:space="preserve">                           f_init=(f_init, f_init), Nt=200, T=0.1)</w:t>
+      </w:r>
+    </w:p>
+    <w:p>
+      <w:pPr>
+        <w:ind w:left="360"/>
+        <w:shd w:fill="F0F0F0"/>
+      </w:pPr>
+      <w:r>
+        <w:rPr>
+          <w:rFonts w:ascii="Courier New" w:hAnsi="Courier New"/>
+          <w:color w:val="1A1A1A"/>
+          <w:sz w:val="19"/>
+        </w:rPr>
+        <w:t xml:space="preserve">    sol_sys = solve(sys)</w:t>
+      </w:r>
+    </w:p>
+    <w:p>
+      <w:pPr>
+        <w:ind w:left="360"/>
+        <w:shd w:fill="F0F0F0"/>
+      </w:pPr>
+      <w:r>
+        <w:rPr>
+          <w:rFonts w:ascii="Courier New" w:hAnsi="Courier New"/>
+          <w:color w:val="1A1A1A"/>
+          <w:sz w:val="19"/>
+        </w:rPr>
+      </w:r>
+    </w:p>
+    <w:p>
+      <w:pPr>
+        <w:ind w:left="360"/>
+        <w:shd w:fill="F0F0F0"/>
+      </w:pPr>
+      <w:r>
+        <w:rPr>
+          <w:rFonts w:ascii="Courier New" w:hAnsi="Courier New"/>
+          <w:color w:val="1A1A1A"/>
+          <w:sz w:val="19"/>
+        </w:rPr>
+        <w:t xml:space="preserve">    @test sol_sys.u ≈ sol_heat.u</w:t>
+      </w:r>
+    </w:p>
+    <w:p>
+      <w:pPr>
+        <w:ind w:left="360"/>
+        <w:shd w:fill="F0F0F0"/>
+      </w:pPr>
+      <w:r>
+        <w:rPr>
+          <w:rFonts w:ascii="Courier New" w:hAnsi="Courier New"/>
+          <w:color w:val="1A1A1A"/>
+          <w:sz w:val="19"/>
+        </w:rPr>
+        <w:t xml:space="preserve">    @test sol_sys.v ≈ sol_heat.u</w:t>
       </w:r>
     </w:p>
     <w:p>
@@ -3720,6 +3871,128 @@
           <w:sz w:val="19"/>
         </w:rPr>
         <w:t>end</w:t>
+      </w:r>
+    </w:p>
+    <w:p>
+      <w:pPr>
+        <w:ind w:left="360"/>
+        <w:shd w:fill="F0F0F0"/>
+      </w:pPr>
+      <w:r>
+        <w:rPr>
+          <w:rFonts w:ascii="Courier New" w:hAnsi="Courier New"/>
+          <w:color w:val="1A1A1A"/>
+          <w:sz w:val="19"/>
+        </w:rPr>
+      </w:r>
+    </w:p>
+    <w:p>
+      <w:pPr>
+        <w:ind w:left="360"/>
+        <w:shd w:fill="F0F0F0"/>
+      </w:pPr>
+      <w:r>
+        <w:rPr>
+          <w:rFonts w:ascii="Courier New" w:hAnsi="Courier New"/>
+          <w:color w:val="1A1A1A"/>
+          <w:sz w:val="19"/>
+        </w:rPr>
+        <w:t>@testset "WaveEquation smoke test" begin</w:t>
+      </w:r>
+    </w:p>
+    <w:p>
+      <w:pPr>
+        <w:ind w:left="360"/>
+        <w:shd w:fill="F0F0F0"/>
+      </w:pPr>
+      <w:r>
+        <w:rPr>
+          <w:rFonts w:ascii="Courier New" w:hAnsi="Courier New"/>
+          <w:color w:val="1A1A1A"/>
+          <w:sz w:val="19"/>
+        </w:rPr>
+        <w:t xml:space="preserve">    p = WaveEquation(N_grid=(80,), a=(0.0,), b=(1.0,), Nt=200,</w:t>
+      </w:r>
+    </w:p>
+    <w:p>
+      <w:pPr>
+        <w:ind w:left="360"/>
+        <w:shd w:fill="F0F0F0"/>
+      </w:pPr>
+      <w:r>
+        <w:rPr>
+          <w:rFonts w:ascii="Courier New" w:hAnsi="Courier New"/>
+          <w:color w:val="1A1A1A"/>
+          <w:sz w:val="19"/>
+        </w:rPr>
+        <w:t xml:space="preserve">                     T=0.2, c=1.0, f_init=x -&gt; sin(pi * x))</w:t>
+      </w:r>
+    </w:p>
+    <w:p>
+      <w:pPr>
+        <w:ind w:left="360"/>
+        <w:shd w:fill="F0F0F0"/>
+      </w:pPr>
+      <w:r>
+        <w:rPr>
+          <w:rFonts w:ascii="Courier New" w:hAnsi="Courier New"/>
+          <w:color w:val="1A1A1A"/>
+          <w:sz w:val="19"/>
+        </w:rPr>
+        <w:t xml:space="preserve">    sol = solve(p)</w:t>
+      </w:r>
+    </w:p>
+    <w:p>
+      <w:pPr>
+        <w:ind w:left="360"/>
+        <w:shd w:fill="F0F0F0"/>
+      </w:pPr>
+      <w:r>
+        <w:rPr>
+          <w:rFonts w:ascii="Courier New" w:hAnsi="Courier New"/>
+          <w:color w:val="1A1A1A"/>
+          <w:sz w:val="19"/>
+        </w:rPr>
+        <w:t xml:space="preserve">    @test length(sol.u) == 80</w:t>
+      </w:r>
+    </w:p>
+    <w:p>
+      <w:pPr>
+        <w:ind w:left="360"/>
+        <w:shd w:fill="F0F0F0"/>
+      </w:pPr>
+      <w:r>
+        <w:rPr>
+          <w:rFonts w:ascii="Courier New" w:hAnsi="Courier New"/>
+          <w:color w:val="1A1A1A"/>
+          <w:sz w:val="19"/>
+        </w:rPr>
+        <w:t xml:space="preserve">    @test all(isfinite, sol.u)</w:t>
+      </w:r>
+    </w:p>
+    <w:p>
+      <w:pPr>
+        <w:ind w:left="360"/>
+        <w:shd w:fill="F0F0F0"/>
+      </w:pPr>
+      <w:r>
+        <w:rPr>
+          <w:rFonts w:ascii="Courier New" w:hAnsi="Courier New"/>
+          <w:color w:val="1A1A1A"/>
+          <w:sz w:val="19"/>
+        </w:rPr>
+        <w:t>end</w:t>
+      </w:r>
+    </w:p>
+    <w:p>
+      <w:r>
+        <w:rPr>
+          <w:rFonts w:ascii="Arial" w:hAnsi="Arial"/>
+          <w:b w:val="0"/>
+          <w:i w:val="0"/>
+          <w:sz w:val="22"/>
+        </w:rPr>
+        <w:t>This turns the earlier promise — that CoupledHeatEquation is 'verified against HeatEquation.solve_implicit at κ=0' — into something Pkg.test() actually checks on every run, rather than a claim that only lived in a changelog entry.</w:t>
       </w:r>
     </w:p>
     <w:p>
@@ -8835,7 +9108,7 @@
           <w:i w:val="0"/>
           <w:sz w:val="22"/>
         </w:rPr>
-        <w:t>Every problem so far — HeatProblem, WaveProblem — advances ONE scalar field. Many real models need two (or more) fields that feed into each other every time step: two temperatures exchanging heat, predator/prey populations diffusing and interacting, or the ψ (streamfunction) / ω (vorticity) pair in the Navier-Stokes solver you already saw in Step 7. What changes when a problem has more than one field?</w:t>
+        <w:t>Every problem in Step 7 — HeatEquation, WaveEquation, PoissonEquation — advances ONE scalar field. Many real models need two or more fields that feed into each other every time step: two temperatures exchanging heat, predator/prey populations diffusing and interacting, or the ψ (streamfunction) / ω (vorticity) pair in the Navier-Stokes solver from Step 7. What changes when a problem has more than one field?</w:t>
       </w:r>
     </w:p>
     <w:p>
@@ -8846,77 +9119,159 @@
           <w:i w:val="0"/>
           <w:sz w:val="22"/>
         </w:rPr>
-        <w:t>What changes: stack both fields into ONE vector and solve ONE sparse linear system per time step, instead of looping two independent solves. For two coupled heat fields ∂u/∂t = α₁∇²u − κ(u−v) and ∂v/∂t = α₂∇²v − κ(v−u), the unknown becomes w = [u; v] and backward Euler gives a single block matrix:</w:t>
-      </w:r>
-    </w:p>
-    <w:p>
-      <w:pPr>
-        <w:ind w:left="360"/>
-        <w:shd w:fill="F0F0F0"/>
-      </w:pPr>
-      <w:r>
-        <w:rPr>
-          <w:rFonts w:ascii="Courier New" w:hAnsi="Courier New"/>
-          <w:color w:val="1A1A1A"/>
-          <w:sz w:val="19"/>
-        </w:rPr>
-        <w:t>#   [ I + dt(α₁·Lap + κI)      −dt·κ·I          ] [uⁿ⁺¹]   [uⁿ]</w:t>
-      </w:r>
-    </w:p>
-    <w:p>
-      <w:pPr>
-        <w:ind w:left="360"/>
-        <w:shd w:fill="F0F0F0"/>
-      </w:pPr>
-      <w:r>
-        <w:rPr>
-          <w:rFonts w:ascii="Courier New" w:hAnsi="Courier New"/>
-          <w:color w:val="1A1A1A"/>
-          <w:sz w:val="19"/>
-        </w:rPr>
-        <w:t>#   [      −dt·κ·I          I + dt(α₂·Lap + κI) ] [vⁿ⁺¹] = [vⁿ]</w:t>
-      </w:r>
-    </w:p>
-    <w:p>
-      <w:pPr>
-        <w:ind w:left="360"/>
-        <w:shd w:fill="F0F0F0"/>
-      </w:pPr>
-      <w:r>
-        <w:rPr>
-          <w:rFonts w:ascii="Courier New" w:hAnsi="Courier New"/>
-          <w:color w:val="1A1A1A"/>
-          <w:sz w:val="19"/>
-        </w:rPr>
-        <w:t>#</w:t>
-      </w:r>
-    </w:p>
-    <w:p>
-      <w:pPr>
-        <w:ind w:left="360"/>
-        <w:shd w:fill="F0F0F0"/>
-      </w:pPr>
-      <w:r>
-        <w:rPr>
-          <w:rFonts w:ascii="Courier New" w:hAnsi="Courier New"/>
-          <w:color w:val="1A1A1A"/>
-          <w:sz w:val="19"/>
-        </w:rPr>
-        <w:t># src/coupled.jl (juliaPDEs package)</w:t>
-      </w:r>
-    </w:p>
-    <w:p>
-      <w:pPr>
-        <w:ind w:left="360"/>
-        <w:shd w:fill="F0F0F0"/>
-      </w:pPr>
-      <w:r>
-        <w:rPr>
-          <w:rFonts w:ascii="Courier New" w:hAnsi="Courier New"/>
-          <w:color w:val="1A1A1A"/>
-          <w:sz w:val="19"/>
-        </w:rPr>
-        <w:t>Base.@kwdef struct CoupledHeatEquation{N,F1,F2} &lt;: ParabolicProblem</w:t>
+        <w:t>What changes: stack every field into ONE vector and solve ONE sparse linear system per time step, instead of looping independent solves. The package's CoupledPDESystem{M,N} type does exactly this for any number M of named fields — it is the actual generalization of the two-field CoupledHeatEquation you may already have used, not just a sketch of one:</w:t>
+      </w:r>
+    </w:p>
+    <w:p>
+      <w:pPr>
+        <w:ind w:left="360"/>
+        <w:shd w:fill="F0F0F0"/>
+      </w:pPr>
+      <w:r>
+        <w:rPr>
+          <w:rFonts w:ascii="Courier New" w:hAnsi="Courier New"/>
+          <w:color w:val="1A1A1A"/>
+          <w:sz w:val="19"/>
+        </w:rPr>
+        <w:t># src/types.jl — flat indexing across M named fields sharing one grid</w:t>
+      </w:r>
+    </w:p>
+    <w:p>
+      <w:pPr>
+        <w:ind w:left="360"/>
+        <w:shd w:fill="F0F0F0"/>
+      </w:pPr>
+      <w:r>
+        <w:rPr>
+          <w:rFonts w:ascii="Courier New" w:hAnsi="Courier New"/>
+          <w:color w:val="1A1A1A"/>
+          <w:sz w:val="19"/>
+        </w:rPr>
+        <w:t>struct Ind{M,N}</w:t>
+      </w:r>
+    </w:p>
+    <w:p>
+      <w:pPr>
+        <w:ind w:left="360"/>
+        <w:shd w:fill="F0F0F0"/>
+      </w:pPr>
+      <w:r>
+        <w:rPr>
+          <w:rFonts w:ascii="Courier New" w:hAnsi="Courier New"/>
+          <w:color w:val="1A1A1A"/>
+          <w:sz w:val="19"/>
+        </w:rPr>
+        <w:t xml:space="preserve">    vars::NTuple{M,Symbol}</w:t>
+      </w:r>
+    </w:p>
+    <w:p>
+      <w:pPr>
+        <w:ind w:left="360"/>
+        <w:shd w:fill="F0F0F0"/>
+      </w:pPr>
+      <w:r>
+        <w:rPr>
+          <w:rFonts w:ascii="Courier New" w:hAnsi="Courier New"/>
+          <w:color w:val="1A1A1A"/>
+          <w:sz w:val="19"/>
+        </w:rPr>
+        <w:t xml:space="preserve">    NumGrid::NTuple{M,NTuple{N,Int}}</w:t>
+      </w:r>
+    </w:p>
+    <w:p>
+      <w:pPr>
+        <w:ind w:left="360"/>
+        <w:shd w:fill="F0F0F0"/>
+      </w:pPr>
+      <w:r>
+        <w:rPr>
+          <w:rFonts w:ascii="Courier New" w:hAnsi="Courier New"/>
+          <w:color w:val="1A1A1A"/>
+          <w:sz w:val="19"/>
+        </w:rPr>
+        <w:t>end</w:t>
+      </w:r>
+    </w:p>
+    <w:p>
+      <w:pPr>
+        <w:ind w:left="360"/>
+        <w:shd w:fill="F0F0F0"/>
+      </w:pPr>
+      <w:r>
+        <w:rPr>
+          <w:rFonts w:ascii="Courier New" w:hAnsi="Courier New"/>
+          <w:color w:val="1A1A1A"/>
+          <w:sz w:val="19"/>
+        </w:rPr>
+      </w:r>
+    </w:p>
+    <w:p>
+      <w:pPr>
+        <w:ind w:left="360"/>
+        <w:shd w:fill="F0F0F0"/>
+      </w:pPr>
+      <w:r>
+        <w:rPr>
+          <w:rFonts w:ascii="Courier New" w:hAnsi="Courier New"/>
+          <w:color w:val="1A1A1A"/>
+          <w:sz w:val="19"/>
+        </w:rPr>
+        <w:t># Ind(:v, i, j) → flat position of field :v at grid point (i,j)</w:t>
+      </w:r>
+    </w:p>
+    <w:p>
+      <w:pPr>
+        <w:ind w:left="360"/>
+        <w:shd w:fill="F0F0F0"/>
+      </w:pPr>
+      <w:r>
+        <w:rPr>
+          <w:rFonts w:ascii="Courier New" w:hAnsi="Courier New"/>
+          <w:color w:val="1A1A1A"/>
+          <w:sz w:val="19"/>
+        </w:rPr>
+        <w:t># Ind(42)       → (which field, CartesianIndex within that field)</w:t>
+      </w:r>
+    </w:p>
+    <w:p>
+      <w:pPr>
+        <w:ind w:left="360"/>
+        <w:shd w:fill="F0F0F0"/>
+      </w:pPr>
+      <w:r>
+        <w:rPr>
+          <w:rFonts w:ascii="Courier New" w:hAnsi="Courier New"/>
+          <w:color w:val="1A1A1A"/>
+          <w:sz w:val="19"/>
+        </w:rPr>
+      </w:r>
+    </w:p>
+    <w:p>
+      <w:pPr>
+        <w:ind w:left="360"/>
+        <w:shd w:fill="F0F0F0"/>
+      </w:pPr>
+      <w:r>
+        <w:rPr>
+          <w:rFonts w:ascii="Courier New" w:hAnsi="Courier New"/>
+          <w:color w:val="1A1A1A"/>
+          <w:sz w:val="19"/>
+        </w:rPr>
+        <w:t># src/coupled.jl</w:t>
+      </w:r>
+    </w:p>
+    <w:p>
+      <w:pPr>
+        <w:ind w:left="360"/>
+        <w:shd w:fill="F0F0F0"/>
+      </w:pPr>
+      <w:r>
+        <w:rPr>
+          <w:rFonts w:ascii="Courier New" w:hAnsi="Courier New"/>
+          <w:color w:val="1A1A1A"/>
+          <w:sz w:val="19"/>
+        </w:rPr>
+        <w:t>Base.@kwdef struct CoupledPDESystem{M,N} &lt;: ParabolicProblem</w:t>
       </w:r>
     </w:p>
     <w:p>
@@ -8944,63 +9299,77 @@
           <w:color w:val="1A1A1A"/>
           <w:sz w:val="19"/>
         </w:rPr>
-        <w:t xml:space="preserve">    α::NTuple{2,Float64} = (0.01, 0.02)   # diffusivity per field</w:t>
-      </w:r>
-    </w:p>
-    <w:p>
-      <w:pPr>
-        <w:ind w:left="360"/>
-        <w:shd w:fill="F0F0F0"/>
-      </w:pPr>
-      <w:r>
-        <w:rPr>
-          <w:rFonts w:ascii="Courier New" w:hAnsi="Courier New"/>
-          <w:color w:val="1A1A1A"/>
-          <w:sz w:val="19"/>
-        </w:rPr>
-        <w:t xml:space="preserve">    κ::Float64           = 0.5            # exchange rate</w:t>
-      </w:r>
-    </w:p>
-    <w:p>
-      <w:pPr>
-        <w:ind w:left="360"/>
-        <w:shd w:fill="F0F0F0"/>
-      </w:pPr>
-      <w:r>
-        <w:rPr>
-          <w:rFonts w:ascii="Courier New" w:hAnsi="Courier New"/>
-          <w:color w:val="1A1A1A"/>
-          <w:sz w:val="19"/>
-        </w:rPr>
-        <w:t xml:space="preserve">    f_init::Tuple{F1,F2}</w:t>
-      </w:r>
-    </w:p>
-    <w:p>
-      <w:pPr>
-        <w:ind w:left="360"/>
-        <w:shd w:fill="F0F0F0"/>
-      </w:pPr>
-      <w:r>
-        <w:rPr>
-          <w:rFonts w:ascii="Courier New" w:hAnsi="Courier New"/>
-          <w:color w:val="1A1A1A"/>
-          <w:sz w:val="19"/>
-        </w:rPr>
-        <w:t xml:space="preserve">    Nt::Int              = 1000</w:t>
-      </w:r>
-    </w:p>
-    <w:p>
-      <w:pPr>
-        <w:ind w:left="360"/>
-        <w:shd w:fill="F0F0F0"/>
-      </w:pPr>
-      <w:r>
-        <w:rPr>
-          <w:rFonts w:ascii="Courier New" w:hAnsi="Courier New"/>
-          <w:color w:val="1A1A1A"/>
-          <w:sz w:val="19"/>
-        </w:rPr>
-        <w:t xml:space="preserve">    T::Float64           = 1.0</w:t>
+        <w:t xml:space="preserve">    vars::NTuple{M,Symbol}                 # e.g. (:u, :v, :w)</w:t>
+      </w:r>
+    </w:p>
+    <w:p>
+      <w:pPr>
+        <w:ind w:left="360"/>
+        <w:shd w:fill="F0F0F0"/>
+      </w:pPr>
+      <w:r>
+        <w:rPr>
+          <w:rFonts w:ascii="Courier New" w:hAnsi="Courier New"/>
+          <w:color w:val="1A1A1A"/>
+          <w:sz w:val="19"/>
+        </w:rPr>
+        <w:t xml:space="preserve">    α::NTuple{M,Float64}                   # diffusivity per field</w:t>
+      </w:r>
+    </w:p>
+    <w:p>
+      <w:pPr>
+        <w:ind w:left="360"/>
+        <w:shd w:fill="F0F0F0"/>
+      </w:pPr>
+      <w:r>
+        <w:rPr>
+          <w:rFonts w:ascii="Courier New" w:hAnsi="Courier New"/>
+          <w:color w:val="1A1A1A"/>
+          <w:sz w:val="19"/>
+        </w:rPr>
+        <w:t xml:space="preserve">    K::NTuple{M,NTuple{M,Float64}} = ntuple(_-&gt;ntuple(_-&gt;0.0,length(vars)),length(vars)) # M×M coupling matrix</w:t>
+      </w:r>
+    </w:p>
+    <w:p>
+      <w:pPr>
+        <w:ind w:left="360"/>
+        <w:shd w:fill="F0F0F0"/>
+      </w:pPr>
+      <w:r>
+        <w:rPr>
+          <w:rFonts w:ascii="Courier New" w:hAnsi="Courier New"/>
+          <w:color w:val="1A1A1A"/>
+          <w:sz w:val="19"/>
+        </w:rPr>
+        <w:t xml:space="preserve">    f_init::NTuple{M,Function}</w:t>
+      </w:r>
+    </w:p>
+    <w:p>
+      <w:pPr>
+        <w:ind w:left="360"/>
+        <w:shd w:fill="F0F0F0"/>
+      </w:pPr>
+      <w:r>
+        <w:rPr>
+          <w:rFonts w:ascii="Courier New" w:hAnsi="Courier New"/>
+          <w:color w:val="1A1A1A"/>
+          <w:sz w:val="19"/>
+        </w:rPr>
+        <w:t xml:space="preserve">    Nt::Int    = 1000</w:t>
+      </w:r>
+    </w:p>
+    <w:p>
+      <w:pPr>
+        <w:ind w:left="360"/>
+        <w:shd w:fill="F0F0F0"/>
+      </w:pPr>
+      <w:r>
+        <w:rPr>
+          <w:rFonts w:ascii="Courier New" w:hAnsi="Courier New"/>
+          <w:color w:val="1A1A1A"/>
+          <w:sz w:val="19"/>
+        </w:rPr>
+        <w:t xml:space="preserve">    T::Float64 = 1.0</w:t>
       </w:r>
     </w:p>
     <w:p>
@@ -9041,21 +9410,21 @@
           <w:color w:val="1A1A1A"/>
           <w:sz w:val="19"/>
         </w:rPr>
-        <w:t>function solve(p::CoupledHeatEquation{N,F1,F2}) where {N,F1,F2}</w:t>
-      </w:r>
-    </w:p>
-    <w:p>
-      <w:pPr>
-        <w:ind w:left="360"/>
-        <w:shd w:fill="F0F0F0"/>
-      </w:pPr>
-      <w:r>
-        <w:rPr>
-          <w:rFonts w:ascii="Courier New" w:hAnsi="Courier New"/>
-          <w:color w:val="1A1A1A"/>
-          <w:sz w:val="19"/>
-        </w:rPr>
-        <w:t xml:space="preserve">    Lap  = nd_laplacian(d, inner_n)      # same operator PoissonEquation uses</w:t>
+        <w:t>function solve(p::CoupledPDESystem{M,N}) where {M,N}</w:t>
+      </w:r>
+    </w:p>
+    <w:p>
+      <w:pPr>
+        <w:ind w:left="360"/>
+        <w:shd w:fill="F0F0F0"/>
+      </w:pPr>
+      <w:r>
+        <w:rPr>
+          <w:rFonts w:ascii="Courier New" w:hAnsi="Courier New"/>
+          <w:color w:val="1A1A1A"/>
+          <w:sz w:val="19"/>
+        </w:rPr>
+        <w:t xml:space="preserve">    Lap  = nd_laplacian(d, inner_n)     # same operator PoissonEquation uses</w:t>
       </w:r>
     </w:p>
     <w:p>
@@ -9083,63 +9452,49 @@
           <w:color w:val="1A1A1A"/>
           <w:sz w:val="19"/>
         </w:rPr>
-        <w:t xml:space="preserve">    A11  = Iden + dt * (p.α[1] * Lap + p.κ * Iden)</w:t>
-      </w:r>
-    </w:p>
-    <w:p>
-      <w:pPr>
-        <w:ind w:left="360"/>
-        <w:shd w:fill="F0F0F0"/>
-      </w:pPr>
-      <w:r>
-        <w:rPr>
-          <w:rFonts w:ascii="Courier New" w:hAnsi="Courier New"/>
-          <w:color w:val="1A1A1A"/>
-          <w:sz w:val="19"/>
-        </w:rPr>
-        <w:t xml:space="preserve">    A22  = Iden + dt * (p.α[2] * Lap + p.κ * Iden)</w:t>
-      </w:r>
-    </w:p>
-    <w:p>
-      <w:pPr>
-        <w:ind w:left="360"/>
-        <w:shd w:fill="F0F0F0"/>
-      </w:pPr>
-      <w:r>
-        <w:rPr>
-          <w:rFonts w:ascii="Courier New" w:hAnsi="Courier New"/>
-          <w:color w:val="1A1A1A"/>
-          <w:sz w:val="19"/>
-        </w:rPr>
-        <w:t xml:space="preserve">    Aoff = -dt * p.κ * Iden</w:t>
-      </w:r>
-    </w:p>
-    <w:p>
-      <w:pPr>
-        <w:ind w:left="360"/>
-        <w:shd w:fill="F0F0F0"/>
-      </w:pPr>
-      <w:r>
-        <w:rPr>
-          <w:rFonts w:ascii="Courier New" w:hAnsi="Courier New"/>
-          <w:color w:val="1A1A1A"/>
-          <w:sz w:val="19"/>
-        </w:rPr>
-        <w:t xml:space="preserve">    Afact = lu([A11 Aoff; Aoff A22])      # ONE factorisation, reused every step</w:t>
-      </w:r>
-    </w:p>
-    <w:p>
-      <w:pPr>
-        <w:ind w:left="360"/>
-        <w:shd w:fill="F0F0F0"/>
-      </w:pPr>
-      <w:r>
-        <w:rPr>
-          <w:rFonts w:ascii="Courier New" w:hAnsi="Courier New"/>
-          <w:color w:val="1A1A1A"/>
-          <w:sz w:val="19"/>
-        </w:rPr>
-        <w:t xml:space="preserve">    # … time-step both fields together via Afact \\ [u; v] …</w:t>
+        <w:t xml:space="preserve">    koff = [sum(p.K[i][j] for j in 1:M if j != i) for i in 1:M]</w:t>
+      </w:r>
+    </w:p>
+    <w:p>
+      <w:pPr>
+        <w:ind w:left="360"/>
+        <w:shd w:fill="F0F0F0"/>
+      </w:pPr>
+      <w:r>
+        <w:rPr>
+          <w:rFonts w:ascii="Courier New" w:hAnsi="Courier New"/>
+          <w:color w:val="1A1A1A"/>
+          <w:sz w:val="19"/>
+        </w:rPr>
+        <w:t xml:space="preserve">    # Aᵢᵢ = I + dt(αᵢ·Lap + koffᵢ·I),  Aᵢⱼ = −dt·Kᵢⱼ·I   (i ≠ j)</w:t>
+      </w:r>
+    </w:p>
+    <w:p>
+      <w:pPr>
+        <w:ind w:left="360"/>
+        <w:shd w:fill="F0F0F0"/>
+      </w:pPr>
+      <w:r>
+        <w:rPr>
+          <w:rFonts w:ascii="Courier New" w:hAnsi="Courier New"/>
+          <w:color w:val="1A1A1A"/>
+          <w:sz w:val="19"/>
+        </w:rPr>
+        <w:t xml:space="preserve">    Afact = lu(A)                       # ONE factorisation, reused every step</w:t>
+      </w:r>
+    </w:p>
+    <w:p>
+      <w:pPr>
+        <w:ind w:left="360"/>
+        <w:shd w:fill="F0F0F0"/>
+      </w:pPr>
+      <w:r>
+        <w:rPr>
+          <w:rFonts w:ascii="Courier New" w:hAnsi="Courier New"/>
+          <w:color w:val="1A1A1A"/>
+          <w:sz w:val="19"/>
+        </w:rPr>
+        <w:t xml:space="preserve">    # … time-step all M fields together via Afact \\ [u₁; u₂; …; u_M] …</w:t>
       </w:r>
     </w:p>
     <w:p>
@@ -9164,7 +9519,7 @@
           <w:i w:val="0"/>
           <w:sz w:val="22"/>
         </w:rPr>
-        <w:t>Why this is necessary: if you instead time-step u and v with two separate independent solves, the coupling term κ(u−v) has to be evaluated using the OLD value of the other field, which is only first-order accurate in the coupling and can become unstable for large κ (stiff exchange). Solving both fields at the same implicit time level, in one system, keeps the scheme unconditionally stable no matter how strong the coupling is — exactly the same reason Step 7's implicit heat solver beats forward Euler.</w:t>
+        <w:t>The key idea is `vars::NTuple{M,Symbol}` plus `Ind`: instead of hardcoding fields named `u` and `v` on the struct, each field gets a symbolic name, and Ind's two getindex methods translate between a name-and-grid-point ("where is :w at grid point 7?") and a flat position in the stacked (M·n)-length vector the sparse solve actually works with. `K` generalizes the single exchange rate κ to an M×M matrix: K[i][j] = 0 for every pair means M independent fields solved together purely for convenience, and nonzero entries reproduce (and extend) the two-field exchange behaviour. Note the default for K reads length(vars), not the type parameter M directly — @kwdef default expressions are evaluated in the outer constructor before M is resolved, so only previously-listed field names like vars are in scope yet.</w:t>
       </w:r>
     </w:p>
     <w:p>
@@ -9175,7 +9530,7 @@
           <w:i w:val="0"/>
           <w:sz w:val="22"/>
         </w:rPr>
-        <w:t>Benefit: the block-system technique reuses every piece of linear-algebra machinery already in the package — the same nd_laplacian sparse assembly and the same lu / \\ solve used by PoissonEquation and HeatEquation.solve_implicit — it just gets called on a bigger, block-structured matrix. And because CoupledHeatEquation still subtypes ParabolicProblem, it slots into the exact same solve()/plot() dispatch as every other problem type; nothing else in the package needs to know or care that a solution came from two coupled fields instead of one.</w:t>
+        <w:t>Why coupling at the same implicit time level is necessary: if you instead time-step two fields with separate independent solves, an exchange term like κ(u−v) has to be evaluated using the OLD value of the other field, which is only first-order accurate in the coupling and can become unstable for large κ (stiff exchange). Solving every field at the same implicit time level, in one system, keeps the scheme unconditionally stable no matter how strong the coupling is — exactly the same reason Step 7's implicit heat solver beats forward Euler.</w:t>
       </w:r>
     </w:p>
     <w:p>
@@ -9186,7 +9541,18 @@
           <w:i w:val="0"/>
           <w:sz w:val="22"/>
         </w:rPr>
-        <w:t>Connection to Navier-Stokes: the LidCavityFlow solver from Step 7 already advances two coupled fields, ψ and ω, every time step — but via splitting (an explicit vorticity update, then two separate sparse solves: one lu factorisation for diffusion, another for the streamfunction Poisson equation). That is a perfectly standard and efficient scheme. As an exercise, ask what would change if ψ and ω were instead stacked into one block system like u and v above — you would trade two smaller factorisations for one larger one, gaining the same 'exact at the same time level' coupling this section demonstrates.</w:t>
+        <w:t>Benefit: the block-system technique reuses every piece of linear-algebra machinery already in the package — the same nd_laplacian sparse assembly and the same lu / \\ solve used by PoissonEquation and HeatEquation.solve_implicit — it just gets called on a bigger, block-structured matrix. And because CoupledPDESystem subtypes ParabolicProblem, it slots into the exact same solve()/plot() dispatch as every other problem type. CoupledHeatEquation, the original two-field type, is now a one-line convenience constructor that builds and delegates to a CoupledPDESystem with vars=(:u,:v) — the special case is a literal instance of the general one, rather than a separate implementation that has to be kept in sync by hand.</w:t>
+      </w:r>
+    </w:p>
+    <w:p>
+      <w:r>
+        <w:rPr>
+          <w:rFonts w:ascii="Arial" w:hAnsi="Arial"/>
+          <w:b w:val="0"/>
+          <w:i w:val="0"/>
+          <w:sz w:val="22"/>
+        </w:rPr>
+        <w:t>Connection to Navier-Stokes: the LidCavityFlow solver from Step 7 already advances two coupled fields, ψ and ω, every time step — but via splitting (an explicit vorticity update, then two separate sparse solves: one lu factorisation for diffusion, another for the streamfunction Poisson equation). That is a perfectly standard and efficient scheme, and — unlike CoupledHeatEquation — it stays outside CoupledPDESystem for now: it's 2-D-only and hand-rolled rather than built on nd_laplacian. As an exercise, ask what would change if ψ and ω were instead stacked into one CoupledPDESystem-style block system — you would trade two smaller factorisations for one larger one, gaining the same 'exact at the same time level' coupling this section demonstrates.</w:t>
       </w:r>
     </w:p>
     <w:p>
@@ -9240,7 +9606,61 @@
           <w:color w:val="555555"/>
           <w:sz w:val="18"/>
         </w:rPr>
-        <w:t>Figure. Two coupled heat fields (left) starting from separate Gaussian pulses, pulled toward each other by κ while each also diffuses; the coupling residual |u−v| (right) shrinks toward zero.</w:t>
+        <w:t>Figure. The M = 2 case: two coupled heat fields (left) starting from separate Gaussian pulses, pulled toward each other by κ while each also diffuses; the coupling residual |u−v| (right) shrinks toward zero.</w:t>
+      </w:r>
+    </w:p>
+    <w:p>
+      <w:pPr>
+        <w:jc w:val="center"/>
+      </w:pPr>
+      <w:r>
+        <w:drawing>
+          <wp:inline xmlns:a="http://schemas.openxmlformats.org/drawingml/2006/main" xmlns:pic="http://schemas.openxmlformats.org/drawingml/2006/picture">
+            <wp:extent cx="5943600" cy="2427871"/>
+            <wp:docPr id="10" name="Picture 10"/>
+            <wp:cNvGraphicFramePr>
+              <a:graphicFrameLocks noChangeAspect="1"/>
+            </wp:cNvGraphicFramePr>
+            <a:graphic>
+              <a:graphicData uri="http://schemas.openxmlformats.org/drawingml/2006/picture">
+                <pic:pic>
+                  <pic:nvPicPr>
+                    <pic:cNvPr id="0" name="coupled_system.png"/>
+                    <pic:cNvPicPr/>
+                  </pic:nvPicPr>
+                  <pic:blipFill>
+                    <a:blip r:embed="rId18"/>
+                    <a:stretch>
+                      <a:fillRect/>
+                    </a:stretch>
+                  </pic:blipFill>
+                  <pic:spPr>
+                    <a:xfrm>
+                      <a:off x="0" y="0"/>
+                      <a:ext cx="5943600" cy="2427871"/>
+                    </a:xfrm>
+                    <a:prstGeom prst="rect"/>
+                  </pic:spPr>
+                </pic:pic>
+              </a:graphicData>
+            </a:graphic>
+          </wp:inline>
+        </w:drawing>
+      </w:r>
+    </w:p>
+    <w:p>
+      <w:pPr>
+        <w:jc w:val="center"/>
+      </w:pPr>
+      <w:r>
+        <w:rPr>
+          <w:rFonts w:ascii="Arial" w:hAnsi="Arial"/>
+          <w:b w:val="0"/>
+          <w:i/>
+          <w:color w:val="555555"/>
+          <w:sz w:val="18"/>
+        </w:rPr>
+        <w:t>Figure. CoupledPDESystem with M = 3 named fields in a chain: field 2 exchanges heat with both 1 and 3, but 1 and 3 are not directly coupled (K[1][3] = K[3][1] = 0). The residual panel (right) shows only the two coupled pairs — the same Ind-indexed block system handles any coupling topology, not just all-to-all.</w:t>
       </w:r>
     </w:p>
     <w:p>

</xml_diff>